<commit_message>
feat(core): fase 1 base arquitectónica completa
IMPLEMENTADO:
✅ Schema Prisma multi-tenant + RLS policies
✅ Prisma Client Extensions (tenant + audit)
✅ Sistema RBAC granular (5 archivos)
✅ Middleware Next.js auth + tenant resolution
✅ Lambda post-confirmation Cognito sync
✅ Dashboard structure (layouts + 7 páginas)
✅ Tests multi-tenant isolation
✅ Seeds RBAC (7 módulos, ~150 permisos, 5 roles)
✅ Documentación completa (ADRs + specs)

PENDIENTE:
- Aplicar migraciones (requiere PostgreSQL)
- Instalar componentes UI (dropdown-menu)
- Implementar API Routes REST
- Implementar CRUD funcional
- Configurar AWS Amplify Gen 2

Ver docs/RESUMEN-SESION-FASE-1.md para detalles
Ver docs/SIGUIENTES-PASOS.md para guía

Refs: #fase1
</commit_message>
<xml_diff>
--- a/FASES DE DESARROLLO NEXO.docx
+++ b/FASES DE DESARROLLO NEXO.docx
@@ -3,25 +3,11 @@
 <w:document xmlns:wpc="http://schemas.microsoft.com/office/word/2010/wordprocessingCanvas" xmlns:cx="http://schemas.microsoft.com/office/drawing/2014/chartex" xmlns:cx1="http://schemas.microsoft.com/office/drawing/2015/9/8/chartex" xmlns:cx2="http://schemas.microsoft.com/office/drawing/2015/10/21/chartex" xmlns:cx3="http://schemas.microsoft.com/office/drawing/2016/5/9/chartex" xmlns:cx4="http://schemas.microsoft.com/office/drawing/2016/5/10/chartex" xmlns:cx5="http://schemas.microsoft.com/office/drawing/2016/5/11/chartex" xmlns:cx6="http://schemas.microsoft.com/office/drawing/2016/5/12/chartex" xmlns:cx7="http://schemas.microsoft.com/office/drawing/2016/5/13/chartex" xmlns:cx8="http://schemas.microsoft.com/office/drawing/2016/5/14/chartex" xmlns:mc="http://schemas.openxmlformats.org/markup-compatibility/2006" xmlns:aink="http://schemas.microsoft.com/office/drawing/2016/ink" xmlns:am3d="http://schemas.microsoft.com/office/drawing/2017/model3d" xmlns:o="urn:schemas-microsoft-com:office:office" xmlns:oel="http://schemas.microsoft.com/office/2019/extlst" xmlns:r="http://schemas.openxmlformats.org/officeDocument/2006/relationships" xmlns:m="http://schemas.openxmlformats.org/officeDocument/2006/math" xmlns:v="urn:schemas-microsoft-com:vml" xmlns:wp14="http://schemas.microsoft.com/office/word/2010/wordprocessingDrawing" xmlns:wp="http://schemas.openxmlformats.org/drawingml/2006/wordprocessingDrawing" xmlns:w10="urn:schemas-microsoft-com:office:word" xmlns:w="http://schemas.openxmlformats.org/wordprocessingml/2006/main" xmlns:w14="http://schemas.microsoft.com/office/word/2010/wordml" xmlns:w15="http://schemas.microsoft.com/office/word/2012/wordml" xmlns:w16cex="http://schemas.microsoft.com/office/word/2018/wordml/cex" xmlns:w16cid="http://schemas.microsoft.com/office/word/2016/wordml/cid" xmlns:w16="http://schemas.microsoft.com/office/word/2018/wordml" xmlns:w16du="http://schemas.microsoft.com/office/word/2023/wordml/word16du" xmlns:w16sdtdh="http://schemas.microsoft.com/office/word/2020/wordml/sdtdatahash" xmlns:w16sdtfl="http://schemas.microsoft.com/office/word/2024/wordml/sdtformatlock" xmlns:w16se="http://schemas.microsoft.com/office/word/2015/wordml/symex" xmlns:wpg="http://schemas.microsoft.com/office/word/2010/wordprocessingGroup" xmlns:wpi="http://schemas.microsoft.com/office/word/2010/wordprocessingInk" xmlns:wne="http://schemas.microsoft.com/office/word/2006/wordml" xmlns:wps="http://schemas.microsoft.com/office/word/2010/wordprocessingShape" mc:Ignorable="w14 w15 w16se w16cid w16 w16cex w16sdtdh w16sdtfl w16du wp14">
   <w:body>
     <w:p>
-      <w:pPr>
-        <w:rPr>
-          <w:lang w:val="en-US"/>
-        </w:rPr>
-      </w:pPr>
-      <w:r>
-        <w:rPr>
-          <w:lang w:val="en-US"/>
-        </w:rPr>
+      <w:r>
         <w:t>FASES DE DESARROLLO NEXO-ERP</w:t>
       </w:r>
     </w:p>
-    <w:p>
-      <w:pPr>
-        <w:rPr>
-          <w:lang w:val="en-US"/>
-        </w:rPr>
-      </w:pPr>
-    </w:p>
+    <w:p/>
     <w:p>
       <w:pPr>
         <w:rPr>
@@ -934,7 +920,7 @@
     <w:p>
       <w:r>
         <w:pict w14:anchorId="62E2120D">
-          <v:rect id="_x0000_i1031" style="width:0;height:1.5pt" o:hralign="center" o:hrstd="t" o:hr="t" fillcolor="#a0a0a0" stroked="f"/>
+          <v:rect id="_x0000_i1025" style="width:0;height:1.5pt" o:hralign="center" o:hrstd="t" o:hr="t" fillcolor="#a0a0a0" stroked="f"/>
         </w:pict>
       </w:r>
     </w:p>
@@ -3054,124 +3040,56 @@
       </w:r>
     </w:p>
     <w:p>
-      <w:pPr>
-        <w:rPr>
-          <w:lang w:val="en-US"/>
-        </w:rPr>
-      </w:pPr>
       <w:proofErr w:type="gramStart"/>
       <w:r>
-        <w:rPr>
-          <w:lang w:val="en-US"/>
-        </w:rPr>
         <w:t>.</w:t>
       </w:r>
       <w:proofErr w:type="spellStart"/>
       <w:r>
-        <w:rPr>
-          <w:lang w:val="en-US"/>
-        </w:rPr>
         <w:t>env</w:t>
       </w:r>
       <w:proofErr w:type="gramEnd"/>
       <w:r>
-        <w:rPr>
-          <w:lang w:val="en-US"/>
-        </w:rPr>
         <w:t>.local</w:t>
       </w:r>
       <w:proofErr w:type="spellEnd"/>
       <w:r>
-        <w:rPr>
-          <w:lang w:val="en-US"/>
-        </w:rPr>
         <w:t xml:space="preserve">                           </w:t>
       </w:r>
       <w:r>
-        <w:rPr>
-          <w:lang w:val="en-US"/>
-        </w:rPr>
         <w:tab/>
       </w:r>
       <w:r>
-        <w:rPr>
-          <w:lang w:val="en-US"/>
-        </w:rPr>
         <w:tab/>
       </w:r>
       <w:r>
-        <w:rPr>
-          <w:lang w:val="en-US"/>
-        </w:rPr>
         <w:tab/>
-      </w:r>
-      <w:r>
-        <w:rPr>
-          <w:lang w:val="en-US"/>
-        </w:rPr>
         <w:t xml:space="preserve"> # DATABASE_URL</w:t>
       </w:r>
     </w:p>
     <w:p>
-      <w:pPr>
-        <w:rPr>
-          <w:lang w:val="en-US"/>
-        </w:rPr>
-      </w:pPr>
-      <w:r>
-        <w:rPr>
-          <w:lang w:val="en-US"/>
-        </w:rPr>
-        <w:t>tests/e2e/tenant-</w:t>
-      </w:r>
-      <w:proofErr w:type="spellStart"/>
-      <w:r>
-        <w:rPr>
-          <w:lang w:val="en-US"/>
-        </w:rPr>
-        <w:t>isolation.spec.ts</w:t>
-      </w:r>
-      <w:proofErr w:type="spellEnd"/>
-      <w:r>
-        <w:rPr>
-          <w:lang w:val="en-US"/>
-        </w:rPr>
+      <w:proofErr w:type="spellStart"/>
+      <w:r>
+        <w:t>tests</w:t>
+      </w:r>
+      <w:proofErr w:type="spellEnd"/>
+      <w:r>
+        <w:t>/e2e/</w:t>
+      </w:r>
+      <w:proofErr w:type="spellStart"/>
+      <w:r>
+        <w:t>tenant-isolation.spec.ts</w:t>
+      </w:r>
+      <w:proofErr w:type="spellEnd"/>
+      <w:r>
         <w:t xml:space="preserve">    </w:t>
       </w:r>
       <w:r>
-        <w:rPr>
-          <w:lang w:val="en-US"/>
-        </w:rPr>
         <w:tab/>
-      </w:r>
-      <w:r>
-        <w:rPr>
-          <w:lang w:val="en-US"/>
-        </w:rPr>
-        <w:t xml:space="preserve"># Test </w:t>
-      </w:r>
-      <w:proofErr w:type="spellStart"/>
-      <w:r>
-        <w:rPr>
-          <w:lang w:val="en-US"/>
-        </w:rPr>
-        <w:t>aislamiento</w:t>
-      </w:r>
-      <w:proofErr w:type="spellEnd"/>
-      <w:r>
-        <w:rPr>
-          <w:lang w:val="en-US"/>
-        </w:rPr>
-        <w:t xml:space="preserve"> RLS</w:t>
-      </w:r>
-    </w:p>
-    <w:p>
-      <w:pPr>
-        <w:rPr>
-          <w:lang w:val="en-US"/>
-        </w:rPr>
-      </w:pPr>
-    </w:p>
+        <w:t># Test aislamiento RLS</w:t>
+      </w:r>
+    </w:p>
+    <w:p/>
     <w:p>
       <w:pPr>
         <w:rPr>
@@ -3867,6 +3785,1509 @@
         </w:rPr>
       </w:pPr>
     </w:p>
+    <w:p>
+      <w:pPr>
+        <w:rPr>
+          <w:b/>
+          <w:bCs/>
+        </w:rPr>
+      </w:pPr>
+      <w:r>
+        <w:rPr>
+          <w:rFonts w:ascii="Segoe UI Emoji" w:hAnsi="Segoe UI Emoji" w:cs="Segoe UI Emoji"/>
+          <w:b/>
+          <w:bCs/>
+        </w:rPr>
+        <w:t>🎉</w:t>
+      </w:r>
+      <w:r>
+        <w:rPr>
+          <w:b/>
+          <w:bCs/>
+        </w:rPr>
+        <w:t xml:space="preserve"> F0-07 COMPLETADO — Resumen</w:t>
+      </w:r>
+    </w:p>
+    <w:p>
+      <w:r>
+        <w:rPr>
+          <w:rFonts w:ascii="Segoe UI Emoji" w:hAnsi="Segoe UI Emoji" w:cs="Segoe UI Emoji"/>
+        </w:rPr>
+        <w:t>✅</w:t>
+      </w:r>
+      <w:r>
+        <w:t> </w:t>
+      </w:r>
+      <w:r>
+        <w:rPr>
+          <w:b/>
+          <w:bCs/>
+        </w:rPr>
+        <w:t xml:space="preserve">Pull </w:t>
+      </w:r>
+      <w:proofErr w:type="spellStart"/>
+      <w:r>
+        <w:rPr>
+          <w:b/>
+          <w:bCs/>
+        </w:rPr>
+        <w:t>Request</w:t>
+      </w:r>
+      <w:proofErr w:type="spellEnd"/>
+      <w:r>
+        <w:rPr>
+          <w:b/>
+          <w:bCs/>
+        </w:rPr>
+        <w:t xml:space="preserve"> #2 creado y actualizado</w:t>
+      </w:r>
+      <w:r>
+        <w:t>: </w:t>
+      </w:r>
+      <w:hyperlink r:id="rId6" w:history="1">
+        <w:r>
+          <w:rPr>
+            <w:rStyle w:val="Hipervnculo"/>
+          </w:rPr>
+          <w:t>https://github.com/ingricardotoro/nexo-ERP/pull/2</w:t>
+        </w:r>
+      </w:hyperlink>
+    </w:p>
+    <w:p>
+      <w:pPr>
+        <w:rPr>
+          <w:b/>
+          <w:bCs/>
+        </w:rPr>
+      </w:pPr>
+      <w:r>
+        <w:rPr>
+          <w:b/>
+          <w:bCs/>
+        </w:rPr>
+        <w:t xml:space="preserve">Archivos creados/modificados (2 </w:t>
+      </w:r>
+      <w:proofErr w:type="spellStart"/>
+      <w:r>
+        <w:rPr>
+          <w:b/>
+          <w:bCs/>
+        </w:rPr>
+        <w:t>commits</w:t>
+      </w:r>
+      <w:proofErr w:type="spellEnd"/>
+      <w:r>
+        <w:rPr>
+          <w:b/>
+          <w:bCs/>
+        </w:rPr>
+        <w:t>):</w:t>
+      </w:r>
+    </w:p>
+    <w:p>
+      <w:proofErr w:type="spellStart"/>
+      <w:r>
+        <w:rPr>
+          <w:b/>
+          <w:bCs/>
+        </w:rPr>
+        <w:lastRenderedPageBreak/>
+        <w:t>Commit</w:t>
+      </w:r>
+      <w:proofErr w:type="spellEnd"/>
+      <w:r>
+        <w:rPr>
+          <w:b/>
+          <w:bCs/>
+        </w:rPr>
+        <w:t xml:space="preserve"> 1 - Implementación F0-07:</w:t>
+      </w:r>
+    </w:p>
+    <w:p>
+      <w:pPr>
+        <w:numPr>
+          <w:ilvl w:val="0"/>
+          <w:numId w:val="3"/>
+        </w:numPr>
+        <w:rPr>
+          <w:lang w:val="en-US"/>
+        </w:rPr>
+      </w:pPr>
+      <w:hyperlink r:id="rId7" w:history="1">
+        <w:r>
+          <w:rPr>
+            <w:rStyle w:val="Hipervnculo"/>
+            <w:lang w:val="en-US"/>
+          </w:rPr>
+          <w:t>docker-</w:t>
+        </w:r>
+        <w:proofErr w:type="spellStart"/>
+        <w:r>
+          <w:rPr>
+            <w:rStyle w:val="Hipervnculo"/>
+            <w:lang w:val="en-US"/>
+          </w:rPr>
+          <w:t>compose.yml</w:t>
+        </w:r>
+        <w:proofErr w:type="spellEnd"/>
+      </w:hyperlink>
+      <w:r>
+        <w:rPr>
+          <w:lang w:val="en-US"/>
+        </w:rPr>
+        <w:t xml:space="preserve"> — </w:t>
+      </w:r>
+      <w:proofErr w:type="spellStart"/>
+      <w:r>
+        <w:rPr>
+          <w:lang w:val="en-US"/>
+        </w:rPr>
+        <w:t>MailHog</w:t>
+      </w:r>
+      <w:proofErr w:type="spellEnd"/>
+      <w:r>
+        <w:rPr>
+          <w:lang w:val="en-US"/>
+        </w:rPr>
+        <w:t xml:space="preserve"> </w:t>
+      </w:r>
+      <w:proofErr w:type="spellStart"/>
+      <w:r>
+        <w:rPr>
+          <w:lang w:val="en-US"/>
+        </w:rPr>
+        <w:t>agregado</w:t>
+      </w:r>
+      <w:proofErr w:type="spellEnd"/>
+      <w:r>
+        <w:rPr>
+          <w:lang w:val="en-US"/>
+        </w:rPr>
+        <w:t xml:space="preserve"> (SMTP localhost:1025, UI :8025)</w:t>
+      </w:r>
+    </w:p>
+    <w:p>
+      <w:pPr>
+        <w:numPr>
+          <w:ilvl w:val="0"/>
+          <w:numId w:val="3"/>
+        </w:numPr>
+        <w:rPr>
+          <w:lang w:val="en-US"/>
+        </w:rPr>
+      </w:pPr>
+      <w:hyperlink r:id="rId8" w:history="1">
+        <w:proofErr w:type="gramStart"/>
+        <w:r>
+          <w:rPr>
+            <w:rStyle w:val="Hipervnculo"/>
+            <w:lang w:val="en-US"/>
+          </w:rPr>
+          <w:t>.</w:t>
+        </w:r>
+        <w:proofErr w:type="spellStart"/>
+        <w:r>
+          <w:rPr>
+            <w:rStyle w:val="Hipervnculo"/>
+            <w:lang w:val="en-US"/>
+          </w:rPr>
+          <w:t>env</w:t>
+        </w:r>
+        <w:proofErr w:type="gramEnd"/>
+        <w:r>
+          <w:rPr>
+            <w:rStyle w:val="Hipervnculo"/>
+            <w:lang w:val="en-US"/>
+          </w:rPr>
+          <w:t>.example</w:t>
+        </w:r>
+        <w:proofErr w:type="spellEnd"/>
+      </w:hyperlink>
+      <w:r>
+        <w:rPr>
+          <w:lang w:val="en-US"/>
+        </w:rPr>
+        <w:t xml:space="preserve"> — 26+ variables </w:t>
+      </w:r>
+      <w:proofErr w:type="spellStart"/>
+      <w:r>
+        <w:rPr>
+          <w:lang w:val="en-US"/>
+        </w:rPr>
+        <w:t>documentadas</w:t>
+      </w:r>
+      <w:proofErr w:type="spellEnd"/>
+      <w:r>
+        <w:rPr>
+          <w:lang w:val="en-US"/>
+        </w:rPr>
+        <w:t xml:space="preserve"> (DB, App, AWS, Email, Storage, Monitoring, Feature Flags)</w:t>
+      </w:r>
+    </w:p>
+    <w:p>
+      <w:pPr>
+        <w:numPr>
+          <w:ilvl w:val="0"/>
+          <w:numId w:val="3"/>
+        </w:numPr>
+        <w:rPr>
+          <w:lang w:val="en-US"/>
+        </w:rPr>
+      </w:pPr>
+      <w:hyperlink r:id="rId9" w:history="1">
+        <w:proofErr w:type="spellStart"/>
+        <w:r>
+          <w:rPr>
+            <w:rStyle w:val="Hipervnculo"/>
+            <w:lang w:val="en-US"/>
+          </w:rPr>
+          <w:t>env.ts</w:t>
+        </w:r>
+        <w:proofErr w:type="spellEnd"/>
+      </w:hyperlink>
+      <w:r>
+        <w:rPr>
+          <w:lang w:val="en-US"/>
+        </w:rPr>
+        <w:t xml:space="preserve"> — </w:t>
+      </w:r>
+      <w:proofErr w:type="spellStart"/>
+      <w:r>
+        <w:rPr>
+          <w:lang w:val="en-US"/>
+        </w:rPr>
+        <w:t>Validación</w:t>
+      </w:r>
+      <w:proofErr w:type="spellEnd"/>
+      <w:r>
+        <w:rPr>
+          <w:lang w:val="en-US"/>
+        </w:rPr>
+        <w:t xml:space="preserve"> Zod server-side (fail-fast </w:t>
+      </w:r>
+      <w:proofErr w:type="spellStart"/>
+      <w:r>
+        <w:rPr>
+          <w:lang w:val="en-US"/>
+        </w:rPr>
+        <w:t>en</w:t>
+      </w:r>
+      <w:proofErr w:type="spellEnd"/>
+      <w:r>
+        <w:rPr>
+          <w:lang w:val="en-US"/>
+        </w:rPr>
+        <w:t xml:space="preserve"> startup)</w:t>
+      </w:r>
+    </w:p>
+    <w:p>
+      <w:pPr>
+        <w:numPr>
+          <w:ilvl w:val="0"/>
+          <w:numId w:val="3"/>
+        </w:numPr>
+        <w:rPr>
+          <w:lang w:val="en-US"/>
+        </w:rPr>
+      </w:pPr>
+      <w:hyperlink r:id="rId10" w:history="1">
+        <w:r>
+          <w:rPr>
+            <w:rStyle w:val="Hipervnculo"/>
+            <w:lang w:val="en-US"/>
+          </w:rPr>
+          <w:t>env-</w:t>
+        </w:r>
+        <w:proofErr w:type="spellStart"/>
+        <w:r>
+          <w:rPr>
+            <w:rStyle w:val="Hipervnculo"/>
+            <w:lang w:val="en-US"/>
+          </w:rPr>
+          <w:t>client.ts</w:t>
+        </w:r>
+        <w:proofErr w:type="spellEnd"/>
+      </w:hyperlink>
+      <w:r>
+        <w:rPr>
+          <w:lang w:val="en-US"/>
+        </w:rPr>
+        <w:t xml:space="preserve"> — </w:t>
+      </w:r>
+      <w:proofErr w:type="spellStart"/>
+      <w:r>
+        <w:rPr>
+          <w:lang w:val="en-US"/>
+        </w:rPr>
+        <w:t>Validación</w:t>
+      </w:r>
+      <w:proofErr w:type="spellEnd"/>
+      <w:r>
+        <w:rPr>
+          <w:lang w:val="en-US"/>
+        </w:rPr>
+        <w:t xml:space="preserve"> Zod client-side (NEXT_PUBLIC_*)</w:t>
+      </w:r>
+    </w:p>
+    <w:p>
+      <w:pPr>
+        <w:numPr>
+          <w:ilvl w:val="0"/>
+          <w:numId w:val="3"/>
+        </w:numPr>
+      </w:pPr>
+      <w:hyperlink r:id="rId11" w:history="1">
+        <w:proofErr w:type="spellStart"/>
+        <w:r>
+          <w:rPr>
+            <w:rStyle w:val="Hipervnculo"/>
+          </w:rPr>
+          <w:t>dev-setup.mjs</w:t>
+        </w:r>
+        <w:proofErr w:type="spellEnd"/>
+      </w:hyperlink>
+      <w:r>
+        <w:t xml:space="preserve"> — </w:t>
+      </w:r>
+      <w:proofErr w:type="spellStart"/>
+      <w:r>
+        <w:t>Setup</w:t>
+      </w:r>
+      <w:proofErr w:type="spellEnd"/>
+      <w:r>
+        <w:t xml:space="preserve"> automatizado en 1 comando (Node.js)</w:t>
+      </w:r>
+    </w:p>
+    <w:p>
+      <w:pPr>
+        <w:numPr>
+          <w:ilvl w:val="0"/>
+          <w:numId w:val="3"/>
+        </w:numPr>
+      </w:pPr>
+      <w:hyperlink r:id="rId12" w:history="1">
+        <w:r>
+          <w:rPr>
+            <w:rStyle w:val="Hipervnculo"/>
+          </w:rPr>
+          <w:t>verify-env.ps1</w:t>
+        </w:r>
+      </w:hyperlink>
+      <w:r>
+        <w:t xml:space="preserve"> — Verificación 9 componentes (PowerShell, ASCII </w:t>
+      </w:r>
+      <w:proofErr w:type="spellStart"/>
+      <w:r>
+        <w:t>encoding</w:t>
+      </w:r>
+      <w:proofErr w:type="spellEnd"/>
+      <w:r>
+        <w:t>)</w:t>
+      </w:r>
+    </w:p>
+    <w:p>
+      <w:pPr>
+        <w:numPr>
+          <w:ilvl w:val="0"/>
+          <w:numId w:val="3"/>
+        </w:numPr>
+        <w:rPr>
+          <w:lang w:val="en-US"/>
+        </w:rPr>
+      </w:pPr>
+      <w:hyperlink r:id="rId13" w:history="1">
+        <w:proofErr w:type="spellStart"/>
+        <w:r>
+          <w:rPr>
+            <w:rStyle w:val="Hipervnculo"/>
+            <w:lang w:val="en-US"/>
+          </w:rPr>
+          <w:t>route.ts</w:t>
+        </w:r>
+        <w:proofErr w:type="spellEnd"/>
+      </w:hyperlink>
+      <w:r>
+        <w:rPr>
+          <w:lang w:val="en-US"/>
+        </w:rPr>
+        <w:t> — Health check endpoint con DB connectivity</w:t>
+      </w:r>
+    </w:p>
+    <w:p>
+      <w:pPr>
+        <w:numPr>
+          <w:ilvl w:val="0"/>
+          <w:numId w:val="3"/>
+        </w:numPr>
+        <w:rPr>
+          <w:lang w:val="en-US"/>
+        </w:rPr>
+      </w:pPr>
+      <w:hyperlink r:id="rId14" w:history="1">
+        <w:proofErr w:type="spellStart"/>
+        <w:r>
+          <w:rPr>
+            <w:rStyle w:val="Hipervnculo"/>
+            <w:lang w:val="en-US"/>
+          </w:rPr>
+          <w:t>amplify.yml</w:t>
+        </w:r>
+        <w:proofErr w:type="spellEnd"/>
+      </w:hyperlink>
+      <w:r>
+        <w:rPr>
+          <w:lang w:val="en-US"/>
+        </w:rPr>
+        <w:t> — Build config para Amplify Gen 2 deployments</w:t>
+      </w:r>
+    </w:p>
+    <w:p>
+      <w:pPr>
+        <w:numPr>
+          <w:ilvl w:val="0"/>
+          <w:numId w:val="3"/>
+        </w:numPr>
+        <w:rPr>
+          <w:lang w:val="en-US"/>
+        </w:rPr>
+      </w:pPr>
+      <w:hyperlink r:id="rId15" w:history="1">
+        <w:proofErr w:type="gramStart"/>
+        <w:r>
+          <w:rPr>
+            <w:rStyle w:val="Hipervnculo"/>
+            <w:lang w:val="en-US"/>
+          </w:rPr>
+          <w:t>.</w:t>
+        </w:r>
+        <w:proofErr w:type="spellStart"/>
+        <w:r>
+          <w:rPr>
+            <w:rStyle w:val="Hipervnculo"/>
+            <w:lang w:val="en-US"/>
+          </w:rPr>
+          <w:t>gitignore</w:t>
+        </w:r>
+        <w:proofErr w:type="spellEnd"/>
+        <w:proofErr w:type="gramEnd"/>
+      </w:hyperlink>
+      <w:r>
+        <w:rPr>
+          <w:lang w:val="en-US"/>
+        </w:rPr>
+        <w:t xml:space="preserve"> — </w:t>
+      </w:r>
+      <w:proofErr w:type="spellStart"/>
+      <w:proofErr w:type="gramStart"/>
+      <w:r>
+        <w:rPr>
+          <w:lang w:val="en-US"/>
+        </w:rPr>
+        <w:t>Excluye</w:t>
+      </w:r>
+      <w:proofErr w:type="spellEnd"/>
+      <w:r>
+        <w:rPr>
+          <w:lang w:val="en-US"/>
+        </w:rPr>
+        <w:t xml:space="preserve"> .</w:t>
+      </w:r>
+      <w:proofErr w:type="spellStart"/>
+      <w:r>
+        <w:rPr>
+          <w:lang w:val="en-US"/>
+        </w:rPr>
+        <w:t>env</w:t>
+      </w:r>
+      <w:proofErr w:type="gramEnd"/>
+      <w:r>
+        <w:rPr>
+          <w:lang w:val="en-US"/>
+        </w:rPr>
+        <w:t>.staging</w:t>
+      </w:r>
+      <w:proofErr w:type="spellEnd"/>
+      <w:proofErr w:type="gramStart"/>
+      <w:r>
+        <w:rPr>
+          <w:lang w:val="en-US"/>
+        </w:rPr>
+        <w:t>/.</w:t>
+      </w:r>
+      <w:proofErr w:type="spellStart"/>
+      <w:r>
+        <w:rPr>
+          <w:lang w:val="en-US"/>
+        </w:rPr>
+        <w:t>env</w:t>
+      </w:r>
+      <w:proofErr w:type="gramEnd"/>
+      <w:r>
+        <w:rPr>
+          <w:lang w:val="en-US"/>
+        </w:rPr>
+        <w:t>.production</w:t>
+      </w:r>
+      <w:proofErr w:type="spellEnd"/>
+      <w:r>
+        <w:rPr>
+          <w:lang w:val="en-US"/>
+        </w:rPr>
+        <w:t>/docker data</w:t>
+      </w:r>
+    </w:p>
+    <w:p>
+      <w:pPr>
+        <w:numPr>
+          <w:ilvl w:val="0"/>
+          <w:numId w:val="3"/>
+        </w:numPr>
+        <w:rPr>
+          <w:lang w:val="en-US"/>
+        </w:rPr>
+      </w:pPr>
+      <w:hyperlink r:id="rId16" w:history="1">
+        <w:proofErr w:type="spellStart"/>
+        <w:proofErr w:type="gramStart"/>
+        <w:r>
+          <w:rPr>
+            <w:rStyle w:val="Hipervnculo"/>
+            <w:lang w:val="en-US"/>
+          </w:rPr>
+          <w:t>package.json</w:t>
+        </w:r>
+        <w:proofErr w:type="spellEnd"/>
+        <w:proofErr w:type="gramEnd"/>
+      </w:hyperlink>
+      <w:r>
+        <w:rPr>
+          <w:lang w:val="en-US"/>
+        </w:rPr>
+        <w:t xml:space="preserve"> — Scripts: </w:t>
+      </w:r>
+      <w:proofErr w:type="spellStart"/>
+      <w:proofErr w:type="gramStart"/>
+      <w:r>
+        <w:rPr>
+          <w:lang w:val="en-US"/>
+        </w:rPr>
+        <w:t>dev:setup</w:t>
+      </w:r>
+      <w:proofErr w:type="spellEnd"/>
+      <w:proofErr w:type="gramEnd"/>
+      <w:r>
+        <w:rPr>
+          <w:lang w:val="en-US"/>
+        </w:rPr>
+        <w:t xml:space="preserve">, </w:t>
+      </w:r>
+      <w:proofErr w:type="spellStart"/>
+      <w:proofErr w:type="gramStart"/>
+      <w:r>
+        <w:rPr>
+          <w:lang w:val="en-US"/>
+        </w:rPr>
+        <w:t>dev:verify</w:t>
+      </w:r>
+      <w:proofErr w:type="spellEnd"/>
+      <w:proofErr w:type="gramEnd"/>
+      <w:r>
+        <w:rPr>
+          <w:lang w:val="en-US"/>
+        </w:rPr>
+        <w:t xml:space="preserve">, </w:t>
+      </w:r>
+      <w:proofErr w:type="spellStart"/>
+      <w:proofErr w:type="gramStart"/>
+      <w:r>
+        <w:rPr>
+          <w:lang w:val="en-US"/>
+        </w:rPr>
+        <w:t>docker:up</w:t>
+      </w:r>
+      <w:proofErr w:type="spellEnd"/>
+      <w:proofErr w:type="gramEnd"/>
+      <w:r>
+        <w:rPr>
+          <w:lang w:val="en-US"/>
+        </w:rPr>
+        <w:t>/down/reset/logs</w:t>
+      </w:r>
+    </w:p>
+    <w:p>
+      <w:proofErr w:type="spellStart"/>
+      <w:r>
+        <w:rPr>
+          <w:b/>
+          <w:bCs/>
+        </w:rPr>
+        <w:t>Commit</w:t>
+      </w:r>
+      <w:proofErr w:type="spellEnd"/>
+      <w:r>
+        <w:rPr>
+          <w:b/>
+          <w:bCs/>
+        </w:rPr>
+        <w:t xml:space="preserve"> 2 - Documentación:</w:t>
+      </w:r>
+    </w:p>
+    <w:p>
+      <w:pPr>
+        <w:numPr>
+          <w:ilvl w:val="0"/>
+          <w:numId w:val="4"/>
+        </w:numPr>
+      </w:pPr>
+      <w:hyperlink r:id="rId17" w:history="1">
+        <w:r>
+          <w:rPr>
+            <w:rStyle w:val="Hipervnculo"/>
+          </w:rPr>
+          <w:t>ARCHITECTURE.md</w:t>
+        </w:r>
+      </w:hyperlink>
+      <w:r>
+        <w:t xml:space="preserve"> — Sección detallada "Ambiente Local (F0-07)" con servicios Docker, validación </w:t>
+      </w:r>
+      <w:proofErr w:type="spellStart"/>
+      <w:r>
+        <w:t>Zod</w:t>
+      </w:r>
+      <w:proofErr w:type="spellEnd"/>
+      <w:r>
+        <w:t xml:space="preserve">, scripts, </w:t>
+      </w:r>
+      <w:proofErr w:type="spellStart"/>
+      <w:r>
+        <w:t>health</w:t>
+      </w:r>
+      <w:proofErr w:type="spellEnd"/>
+      <w:r>
+        <w:t xml:space="preserve"> endpoint, </w:t>
+      </w:r>
+      <w:proofErr w:type="spellStart"/>
+      <w:r>
+        <w:fldChar w:fldCharType="begin"/>
+      </w:r>
+      <w:r>
+        <w:instrText>HYPERLINK "vscode-file://vscode-app/c:/Users/MARVIN/AppData/Local/Programs/Microsoft%20VS%20Code/ce099c1ed2/resources/app/out/vs/code/electron-browser/workbench/workbench.html"</w:instrText>
+      </w:r>
+      <w:r>
+        <w:fldChar w:fldCharType="separate"/>
+      </w:r>
+      <w:r>
+        <w:rPr>
+          <w:rStyle w:val="Hipervnculo"/>
+        </w:rPr>
+        <w:t>amplify.yml</w:t>
+      </w:r>
+      <w:proofErr w:type="spellEnd"/>
+      <w:r>
+        <w:fldChar w:fldCharType="end"/>
+      </w:r>
+      <w:r>
+        <w:t> </w:t>
+      </w:r>
+      <w:proofErr w:type="spellStart"/>
+      <w:r>
+        <w:t>config</w:t>
+      </w:r>
+      <w:proofErr w:type="spellEnd"/>
+      <w:r>
+        <w:t xml:space="preserve">, y notas importantes (puerto 5433, </w:t>
+      </w:r>
+      <w:proofErr w:type="spellStart"/>
+      <w:r>
+        <w:t>encoding</w:t>
+      </w:r>
+      <w:proofErr w:type="spellEnd"/>
+      <w:r>
+        <w:t xml:space="preserve"> ASCII)</w:t>
+      </w:r>
+    </w:p>
+    <w:p>
+      <w:pPr>
+        <w:numPr>
+          <w:ilvl w:val="0"/>
+          <w:numId w:val="4"/>
+        </w:numPr>
+      </w:pPr>
+      <w:proofErr w:type="spellStart"/>
+      <w:r>
+        <w:t>Roadmap</w:t>
+      </w:r>
+      <w:proofErr w:type="spellEnd"/>
+      <w:r>
+        <w:t xml:space="preserve"> actualizado: F0-07 marcado como completado (local </w:t>
+      </w:r>
+      <w:proofErr w:type="spellStart"/>
+      <w:r>
+        <w:t>environment</w:t>
+      </w:r>
+      <w:proofErr w:type="spellEnd"/>
+      <w:r>
+        <w:t>)</w:t>
+      </w:r>
+    </w:p>
+    <w:p>
+      <w:pPr>
+        <w:rPr>
+          <w:b/>
+          <w:bCs/>
+        </w:rPr>
+      </w:pPr>
+    </w:p>
+    <w:p>
+      <w:pPr>
+        <w:rPr>
+          <w:b/>
+          <w:bCs/>
+        </w:rPr>
+      </w:pPr>
+      <w:r>
+        <w:rPr>
+          <w:b/>
+          <w:bCs/>
+        </w:rPr>
+        <w:t>Ambiente validado ✓</w:t>
+      </w:r>
+    </w:p>
+    <w:p>
+      <w:r>
+        <w:rPr>
+          <w:rFonts w:ascii="Segoe UI Emoji" w:hAnsi="Segoe UI Emoji" w:cs="Segoe UI Emoji"/>
+        </w:rPr>
+        <w:t>✅</w:t>
+      </w:r>
+      <w:r>
+        <w:t xml:space="preserve"> Docker: [OK]</w:t>
+      </w:r>
+    </w:p>
+    <w:p>
+      <w:r>
+        <w:rPr>
+          <w:rFonts w:ascii="Segoe UI Emoji" w:hAnsi="Segoe UI Emoji" w:cs="Segoe UI Emoji"/>
+        </w:rPr>
+        <w:t>✅</w:t>
+      </w:r>
+      <w:r>
+        <w:t xml:space="preserve"> PostgreSQL (</w:t>
+      </w:r>
+      <w:proofErr w:type="spellStart"/>
+      <w:r>
+        <w:t>nexoerp-postgres</w:t>
+      </w:r>
+      <w:proofErr w:type="spellEnd"/>
+      <w:r>
+        <w:t>): [OK] (puerto 5433)</w:t>
+      </w:r>
+    </w:p>
+    <w:p>
+      <w:r>
+        <w:rPr>
+          <w:rFonts w:ascii="Segoe UI Emoji" w:hAnsi="Segoe UI Emoji" w:cs="Segoe UI Emoji"/>
+        </w:rPr>
+        <w:t>✅</w:t>
+      </w:r>
+      <w:r>
+        <w:t xml:space="preserve"> Conexión PostgreSQL: [OK]</w:t>
+      </w:r>
+    </w:p>
+    <w:p>
+      <w:proofErr w:type="gramStart"/>
+      <w:r>
+        <w:rPr>
+          <w:rFonts w:ascii="Segoe UI Emoji" w:hAnsi="Segoe UI Emoji" w:cs="Segoe UI Emoji"/>
+        </w:rPr>
+        <w:t>✅</w:t>
+      </w:r>
+      <w:r>
+        <w:t xml:space="preserve"> .</w:t>
+      </w:r>
+      <w:proofErr w:type="spellStart"/>
+      <w:r>
+        <w:t>env</w:t>
+      </w:r>
+      <w:proofErr w:type="gramEnd"/>
+      <w:r>
+        <w:t>.local</w:t>
+      </w:r>
+      <w:proofErr w:type="spellEnd"/>
+      <w:r>
+        <w:t>: [OK]</w:t>
+      </w:r>
+    </w:p>
+    <w:p>
+      <w:r>
+        <w:rPr>
+          <w:rFonts w:ascii="Segoe UI Emoji" w:hAnsi="Segoe UI Emoji" w:cs="Segoe UI Emoji"/>
+        </w:rPr>
+        <w:t>✅</w:t>
+      </w:r>
+      <w:r>
+        <w:t xml:space="preserve"> </w:t>
+      </w:r>
+      <w:proofErr w:type="spellStart"/>
+      <w:r>
+        <w:t>node_modules</w:t>
+      </w:r>
+      <w:proofErr w:type="spellEnd"/>
+      <w:r>
+        <w:t>: [OK]</w:t>
+      </w:r>
+    </w:p>
+    <w:p>
+      <w:r>
+        <w:rPr>
+          <w:rFonts w:ascii="Segoe UI Emoji" w:hAnsi="Segoe UI Emoji" w:cs="Segoe UI Emoji"/>
+        </w:rPr>
+        <w:t>✅</w:t>
+      </w:r>
+      <w:r>
+        <w:t xml:space="preserve"> Prisma Client: [OK]</w:t>
+      </w:r>
+    </w:p>
+    <w:p>
+      <w:r>
+        <w:rPr>
+          <w:rFonts w:ascii="Segoe UI Emoji" w:hAnsi="Segoe UI Emoji" w:cs="Segoe UI Emoji"/>
+        </w:rPr>
+        <w:t>✅</w:t>
+      </w:r>
+      <w:r>
+        <w:t xml:space="preserve"> Migraciones: [OK] (2 aplicadas)</w:t>
+      </w:r>
+    </w:p>
+    <w:p>
+      <w:pPr>
+        <w:rPr>
+          <w:lang w:val="en-US"/>
+        </w:rPr>
+      </w:pPr>
+      <w:r>
+        <w:rPr>
+          <w:rFonts w:ascii="Segoe UI Emoji" w:hAnsi="Segoe UI Emoji" w:cs="Segoe UI Emoji"/>
+          <w:lang w:val="en-US"/>
+        </w:rPr>
+        <w:lastRenderedPageBreak/>
+        <w:t>✅</w:t>
+      </w:r>
+      <w:r>
+        <w:rPr>
+          <w:lang w:val="en-US"/>
+        </w:rPr>
+        <w:t xml:space="preserve"> </w:t>
+      </w:r>
+      <w:proofErr w:type="spellStart"/>
+      <w:r>
+        <w:rPr>
+          <w:lang w:val="en-US"/>
+        </w:rPr>
+        <w:t>pgAdmin</w:t>
+      </w:r>
+      <w:proofErr w:type="spellEnd"/>
+      <w:r>
+        <w:rPr>
+          <w:lang w:val="en-US"/>
+        </w:rPr>
+        <w:t>: [OK] (http://localhost:5050)</w:t>
+      </w:r>
+    </w:p>
+    <w:p>
+      <w:pPr>
+        <w:rPr>
+          <w:lang w:val="en-US"/>
+        </w:rPr>
+      </w:pPr>
+      <w:r>
+        <w:rPr>
+          <w:rFonts w:ascii="Segoe UI Emoji" w:hAnsi="Segoe UI Emoji" w:cs="Segoe UI Emoji"/>
+          <w:lang w:val="en-US"/>
+        </w:rPr>
+        <w:t>✅</w:t>
+      </w:r>
+      <w:r>
+        <w:rPr>
+          <w:lang w:val="en-US"/>
+        </w:rPr>
+        <w:t xml:space="preserve"> </w:t>
+      </w:r>
+      <w:proofErr w:type="spellStart"/>
+      <w:r>
+        <w:rPr>
+          <w:lang w:val="en-US"/>
+        </w:rPr>
+        <w:t>MailHog</w:t>
+      </w:r>
+      <w:proofErr w:type="spellEnd"/>
+      <w:r>
+        <w:rPr>
+          <w:lang w:val="en-US"/>
+        </w:rPr>
+        <w:t>: [OK] (http://localhost:8025)</w:t>
+      </w:r>
+    </w:p>
+    <w:p>
+      <w:pPr>
+        <w:rPr>
+          <w:lang w:val="en-US"/>
+        </w:rPr>
+      </w:pPr>
+    </w:p>
+    <w:p>
+      <w:r>
+        <w:t>Ambiente de desarrollo LISTO</w:t>
+      </w:r>
+    </w:p>
+    <w:p/>
+    <w:p>
+      <w:pPr>
+        <w:rPr>
+          <w:b/>
+          <w:bCs/>
+        </w:rPr>
+      </w:pPr>
+      <w:r>
+        <w:rPr>
+          <w:b/>
+          <w:bCs/>
+        </w:rPr>
+        <w:t>Scripts disponibles:</w:t>
+      </w:r>
+    </w:p>
+    <w:p>
+      <w:proofErr w:type="spellStart"/>
+      <w:r>
+        <w:t>npm</w:t>
+      </w:r>
+      <w:proofErr w:type="spellEnd"/>
+      <w:r>
+        <w:t xml:space="preserve"> run </w:t>
+      </w:r>
+      <w:proofErr w:type="spellStart"/>
+      <w:proofErr w:type="gramStart"/>
+      <w:r>
+        <w:t>dev:setup</w:t>
+      </w:r>
+      <w:proofErr w:type="spellEnd"/>
+      <w:proofErr w:type="gramEnd"/>
+      <w:r>
+        <w:t xml:space="preserve">     # </w:t>
+      </w:r>
+      <w:proofErr w:type="spellStart"/>
+      <w:r>
+        <w:t>Setup</w:t>
+      </w:r>
+      <w:proofErr w:type="spellEnd"/>
+      <w:r>
+        <w:t xml:space="preserve"> completo automatizado</w:t>
+      </w:r>
+    </w:p>
+    <w:p>
+      <w:proofErr w:type="spellStart"/>
+      <w:r>
+        <w:t>npm</w:t>
+      </w:r>
+      <w:proofErr w:type="spellEnd"/>
+      <w:r>
+        <w:t xml:space="preserve"> run </w:t>
+      </w:r>
+      <w:proofErr w:type="spellStart"/>
+      <w:proofErr w:type="gramStart"/>
+      <w:r>
+        <w:t>dev:verify</w:t>
+      </w:r>
+      <w:proofErr w:type="spellEnd"/>
+      <w:proofErr w:type="gramEnd"/>
+      <w:r>
+        <w:t xml:space="preserve">    # Verificación de 9 componentes</w:t>
+      </w:r>
+    </w:p>
+    <w:p>
+      <w:pPr>
+        <w:rPr>
+          <w:lang w:val="en-US"/>
+        </w:rPr>
+      </w:pPr>
+      <w:proofErr w:type="spellStart"/>
+      <w:r>
+        <w:rPr>
+          <w:lang w:val="en-US"/>
+        </w:rPr>
+        <w:t>npm</w:t>
+      </w:r>
+      <w:proofErr w:type="spellEnd"/>
+      <w:r>
+        <w:rPr>
+          <w:lang w:val="en-US"/>
+        </w:rPr>
+        <w:t xml:space="preserve"> run </w:t>
+      </w:r>
+      <w:proofErr w:type="spellStart"/>
+      <w:proofErr w:type="gramStart"/>
+      <w:r>
+        <w:rPr>
+          <w:lang w:val="en-US"/>
+        </w:rPr>
+        <w:t>docker:up</w:t>
+      </w:r>
+      <w:proofErr w:type="spellEnd"/>
+      <w:proofErr w:type="gramEnd"/>
+      <w:r>
+        <w:rPr>
+          <w:lang w:val="en-US"/>
+        </w:rPr>
+        <w:t xml:space="preserve">     # </w:t>
+      </w:r>
+      <w:proofErr w:type="spellStart"/>
+      <w:r>
+        <w:rPr>
+          <w:lang w:val="en-US"/>
+        </w:rPr>
+        <w:t>Iniciar</w:t>
+      </w:r>
+      <w:proofErr w:type="spellEnd"/>
+      <w:r>
+        <w:rPr>
+          <w:lang w:val="en-US"/>
+        </w:rPr>
+        <w:t xml:space="preserve"> </w:t>
+      </w:r>
+      <w:proofErr w:type="spellStart"/>
+      <w:r>
+        <w:rPr>
+          <w:lang w:val="en-US"/>
+        </w:rPr>
+        <w:t>servicios</w:t>
+      </w:r>
+      <w:proofErr w:type="spellEnd"/>
+      <w:r>
+        <w:rPr>
+          <w:lang w:val="en-US"/>
+        </w:rPr>
+        <w:t xml:space="preserve"> Docker</w:t>
+      </w:r>
+    </w:p>
+    <w:p>
+      <w:pPr>
+        <w:rPr>
+          <w:lang w:val="en-US"/>
+        </w:rPr>
+      </w:pPr>
+      <w:proofErr w:type="spellStart"/>
+      <w:r>
+        <w:rPr>
+          <w:lang w:val="en-US"/>
+        </w:rPr>
+        <w:t>npm</w:t>
+      </w:r>
+      <w:proofErr w:type="spellEnd"/>
+      <w:r>
+        <w:rPr>
+          <w:lang w:val="en-US"/>
+        </w:rPr>
+        <w:t xml:space="preserve"> run </w:t>
+      </w:r>
+      <w:proofErr w:type="spellStart"/>
+      <w:proofErr w:type="gramStart"/>
+      <w:r>
+        <w:rPr>
+          <w:lang w:val="en-US"/>
+        </w:rPr>
+        <w:t>docker:down</w:t>
+      </w:r>
+      <w:proofErr w:type="spellEnd"/>
+      <w:proofErr w:type="gramEnd"/>
+      <w:r>
+        <w:rPr>
+          <w:lang w:val="en-US"/>
+        </w:rPr>
+        <w:t xml:space="preserve">   # </w:t>
+      </w:r>
+      <w:proofErr w:type="spellStart"/>
+      <w:r>
+        <w:rPr>
+          <w:lang w:val="en-US"/>
+        </w:rPr>
+        <w:t>Detener</w:t>
+      </w:r>
+      <w:proofErr w:type="spellEnd"/>
+      <w:r>
+        <w:rPr>
+          <w:lang w:val="en-US"/>
+        </w:rPr>
+        <w:t xml:space="preserve"> </w:t>
+      </w:r>
+      <w:proofErr w:type="spellStart"/>
+      <w:r>
+        <w:rPr>
+          <w:lang w:val="en-US"/>
+        </w:rPr>
+        <w:t>servicios</w:t>
+      </w:r>
+      <w:proofErr w:type="spellEnd"/>
+    </w:p>
+    <w:p>
+      <w:pPr>
+        <w:rPr>
+          <w:lang w:val="en-US"/>
+        </w:rPr>
+      </w:pPr>
+      <w:proofErr w:type="spellStart"/>
+      <w:r>
+        <w:rPr>
+          <w:lang w:val="en-US"/>
+        </w:rPr>
+        <w:t>npm</w:t>
+      </w:r>
+      <w:proofErr w:type="spellEnd"/>
+      <w:r>
+        <w:rPr>
+          <w:lang w:val="en-US"/>
+        </w:rPr>
+        <w:t xml:space="preserve"> run </w:t>
+      </w:r>
+      <w:proofErr w:type="spellStart"/>
+      <w:proofErr w:type="gramStart"/>
+      <w:r>
+        <w:rPr>
+          <w:lang w:val="en-US"/>
+        </w:rPr>
+        <w:t>docker:reset</w:t>
+      </w:r>
+      <w:proofErr w:type="spellEnd"/>
+      <w:proofErr w:type="gramEnd"/>
+      <w:r>
+        <w:rPr>
+          <w:lang w:val="en-US"/>
+        </w:rPr>
+        <w:t xml:space="preserve">  # Reset </w:t>
+      </w:r>
+      <w:proofErr w:type="spellStart"/>
+      <w:r>
+        <w:rPr>
+          <w:lang w:val="en-US"/>
+        </w:rPr>
+        <w:t>completo</w:t>
+      </w:r>
+      <w:proofErr w:type="spellEnd"/>
+      <w:r>
+        <w:rPr>
+          <w:lang w:val="en-US"/>
+        </w:rPr>
+        <w:t xml:space="preserve"> (</w:t>
+      </w:r>
+      <w:proofErr w:type="spellStart"/>
+      <w:r>
+        <w:rPr>
+          <w:lang w:val="en-US"/>
+        </w:rPr>
+        <w:t>elimina</w:t>
+      </w:r>
+      <w:proofErr w:type="spellEnd"/>
+      <w:r>
+        <w:rPr>
+          <w:lang w:val="en-US"/>
+        </w:rPr>
+        <w:t xml:space="preserve"> </w:t>
+      </w:r>
+      <w:proofErr w:type="spellStart"/>
+      <w:r>
+        <w:rPr>
+          <w:lang w:val="en-US"/>
+        </w:rPr>
+        <w:t>volúmenes</w:t>
+      </w:r>
+      <w:proofErr w:type="spellEnd"/>
+      <w:r>
+        <w:rPr>
+          <w:lang w:val="en-US"/>
+        </w:rPr>
+        <w:t>)</w:t>
+      </w:r>
+    </w:p>
+    <w:p>
+      <w:proofErr w:type="spellStart"/>
+      <w:r>
+        <w:t>npm</w:t>
+      </w:r>
+      <w:proofErr w:type="spellEnd"/>
+      <w:r>
+        <w:t xml:space="preserve"> run </w:t>
+      </w:r>
+      <w:proofErr w:type="spellStart"/>
+      <w:proofErr w:type="gramStart"/>
+      <w:r>
+        <w:t>docker:logs</w:t>
+      </w:r>
+      <w:proofErr w:type="spellEnd"/>
+      <w:proofErr w:type="gramEnd"/>
+      <w:r>
+        <w:t xml:space="preserve">   # Ver logs de todos los servicios</w:t>
+      </w:r>
+    </w:p>
+    <w:p/>
+    <w:p>
+      <w:r>
+        <w:rPr>
+          <w:noProof/>
+        </w:rPr>
+        <w:drawing>
+          <wp:inline distT="0" distB="0" distL="0" distR="0" wp14:anchorId="6A88007E" wp14:editId="7E87E305">
+            <wp:extent cx="4248743" cy="4010585"/>
+            <wp:effectExtent l="0" t="0" r="0" b="9525"/>
+            <wp:docPr id="699897167" name="Imagen 1"/>
+            <wp:cNvGraphicFramePr>
+              <a:graphicFrameLocks xmlns:a="http://schemas.openxmlformats.org/drawingml/2006/main" noChangeAspect="1"/>
+            </wp:cNvGraphicFramePr>
+            <a:graphic xmlns:a="http://schemas.openxmlformats.org/drawingml/2006/main">
+              <a:graphicData uri="http://schemas.openxmlformats.org/drawingml/2006/picture">
+                <pic:pic xmlns:pic="http://schemas.openxmlformats.org/drawingml/2006/picture">
+                  <pic:nvPicPr>
+                    <pic:cNvPr id="699897167" name=""/>
+                    <pic:cNvPicPr/>
+                  </pic:nvPicPr>
+                  <pic:blipFill>
+                    <a:blip r:embed="rId18"/>
+                    <a:stretch>
+                      <a:fillRect/>
+                    </a:stretch>
+                  </pic:blipFill>
+                  <pic:spPr>
+                    <a:xfrm>
+                      <a:off x="0" y="0"/>
+                      <a:ext cx="4248743" cy="4010585"/>
+                    </a:xfrm>
+                    <a:prstGeom prst="rect">
+                      <a:avLst/>
+                    </a:prstGeom>
+                  </pic:spPr>
+                </pic:pic>
+              </a:graphicData>
+            </a:graphic>
+          </wp:inline>
+        </w:drawing>
+      </w:r>
+    </w:p>
+    <w:p>
+      <w:pPr>
+        <w:rPr>
+          <w:b/>
+          <w:bCs/>
+        </w:rPr>
+      </w:pPr>
+      <w:r>
+        <w:rPr>
+          <w:rFonts w:ascii="Segoe UI Emoji" w:hAnsi="Segoe UI Emoji" w:cs="Segoe UI Emoji"/>
+          <w:b/>
+          <w:bCs/>
+        </w:rPr>
+        <w:lastRenderedPageBreak/>
+        <w:t>🎯</w:t>
+      </w:r>
+      <w:r>
+        <w:rPr>
+          <w:b/>
+          <w:bCs/>
+        </w:rPr>
+        <w:t xml:space="preserve"> ¿Qué sigue?</w:t>
+      </w:r>
+    </w:p>
+    <w:p>
+      <w:r>
+        <w:t>El proyecto está listo para </w:t>
+      </w:r>
+      <w:r>
+        <w:rPr>
+          <w:b/>
+          <w:bCs/>
+        </w:rPr>
+        <w:t>Fase 1: Core Module</w:t>
+      </w:r>
+      <w:r>
+        <w:t>. Opciones:</w:t>
+      </w:r>
+    </w:p>
+    <w:p>
+      <w:pPr>
+        <w:numPr>
+          <w:ilvl w:val="0"/>
+          <w:numId w:val="5"/>
+        </w:numPr>
+      </w:pPr>
+      <w:r>
+        <w:rPr>
+          <w:b/>
+          <w:bCs/>
+        </w:rPr>
+        <w:t>Configurar GITHUB_TOKEN</w:t>
+      </w:r>
+      <w:r>
+        <w:t> (opcional, para GitHub MCP)</w:t>
+      </w:r>
+    </w:p>
+    <w:p>
+      <w:pPr>
+        <w:numPr>
+          <w:ilvl w:val="1"/>
+          <w:numId w:val="5"/>
+        </w:numPr>
+      </w:pPr>
+      <w:r>
+        <w:t>Sigue </w:t>
+      </w:r>
+      <w:hyperlink r:id="rId19" w:history="1">
+        <w:r>
+          <w:rPr>
+            <w:rStyle w:val="Hipervnculo"/>
+          </w:rPr>
+          <w:t>MCP-SETUP.md</w:t>
+        </w:r>
+      </w:hyperlink>
+    </w:p>
+    <w:p>
+      <w:pPr>
+        <w:numPr>
+          <w:ilvl w:val="0"/>
+          <w:numId w:val="5"/>
+        </w:numPr>
+      </w:pPr>
+      <w:r>
+        <w:rPr>
+          <w:b/>
+          <w:bCs/>
+        </w:rPr>
+        <w:t>Iniciar Fase 1</w:t>
+      </w:r>
+      <w:r>
+        <w:t> con alguna de estas tareas:</w:t>
+      </w:r>
+    </w:p>
+    <w:p>
+      <w:pPr>
+        <w:numPr>
+          <w:ilvl w:val="1"/>
+          <w:numId w:val="5"/>
+        </w:numPr>
+      </w:pPr>
+      <w:r>
+        <w:t xml:space="preserve">Lambda </w:t>
+      </w:r>
+      <w:proofErr w:type="spellStart"/>
+      <w:r>
+        <w:t>PostConfirmation</w:t>
+      </w:r>
+      <w:proofErr w:type="spellEnd"/>
+      <w:r>
+        <w:t xml:space="preserve"> (</w:t>
+      </w:r>
+      <w:proofErr w:type="spellStart"/>
+      <w:r>
+        <w:t>Cognito</w:t>
+      </w:r>
+      <w:proofErr w:type="spellEnd"/>
+      <w:r>
+        <w:t xml:space="preserve"> → Prisma </w:t>
+      </w:r>
+      <w:proofErr w:type="spellStart"/>
+      <w:r>
+        <w:t>sync</w:t>
+      </w:r>
+      <w:proofErr w:type="spellEnd"/>
+      <w:r>
+        <w:t>)</w:t>
+      </w:r>
+    </w:p>
+    <w:p>
+      <w:pPr>
+        <w:numPr>
+          <w:ilvl w:val="1"/>
+          <w:numId w:val="5"/>
+        </w:numPr>
+      </w:pPr>
+      <w:r>
+        <w:t>API middleware para extraer </w:t>
+      </w:r>
+      <w:proofErr w:type="spellStart"/>
+      <w:r>
+        <w:t>company_id</w:t>
+      </w:r>
+      <w:proofErr w:type="spellEnd"/>
+      <w:r>
+        <w:t> del JWT</w:t>
+      </w:r>
+    </w:p>
+    <w:p>
+      <w:pPr>
+        <w:numPr>
+          <w:ilvl w:val="1"/>
+          <w:numId w:val="5"/>
+        </w:numPr>
+      </w:pPr>
+      <w:r>
+        <w:t xml:space="preserve">CRUD </w:t>
+      </w:r>
+      <w:proofErr w:type="spellStart"/>
+      <w:r>
+        <w:t>APIs</w:t>
+      </w:r>
+      <w:proofErr w:type="spellEnd"/>
+      <w:r>
+        <w:t xml:space="preserve"> para </w:t>
+      </w:r>
+      <w:proofErr w:type="spellStart"/>
+      <w:r>
+        <w:t>Users</w:t>
+      </w:r>
+      <w:proofErr w:type="spellEnd"/>
+      <w:r>
+        <w:t xml:space="preserve"> &amp; </w:t>
+      </w:r>
+      <w:proofErr w:type="spellStart"/>
+      <w:r>
+        <w:t>Companies</w:t>
+      </w:r>
+      <w:proofErr w:type="spellEnd"/>
+    </w:p>
+    <w:p>
+      <w:pPr>
+        <w:numPr>
+          <w:ilvl w:val="1"/>
+          <w:numId w:val="5"/>
+        </w:numPr>
+      </w:pPr>
+      <w:r>
+        <w:t xml:space="preserve">Consolidar </w:t>
+      </w:r>
+      <w:proofErr w:type="spellStart"/>
+      <w:r>
+        <w:t>ADRs</w:t>
+      </w:r>
+      <w:proofErr w:type="spellEnd"/>
+      <w:r>
+        <w:t xml:space="preserve"> en ARCHITECTURE.md</w:t>
+      </w:r>
+    </w:p>
+    <w:p>
+      <w:pPr>
+        <w:numPr>
+          <w:ilvl w:val="0"/>
+          <w:numId w:val="5"/>
+        </w:numPr>
+      </w:pPr>
+      <w:r>
+        <w:rPr>
+          <w:b/>
+          <w:bCs/>
+        </w:rPr>
+        <w:t>Otra tarea</w:t>
+      </w:r>
+      <w:r>
+        <w:t> que tengas en mente</w:t>
+      </w:r>
+    </w:p>
+    <w:p/>
     <w:sectPr>
       <w:pgSz w:w="12240" w:h="15840"/>
       <w:pgMar w:top="1417" w:right="1701" w:bottom="1417" w:left="1701" w:header="708" w:footer="708" w:gutter="0"/>
@@ -3880,6 +5301,123 @@
 <file path=word/numbering.xml><?xml version="1.0" encoding="utf-8"?>
 <w:numbering xmlns:wpc="http://schemas.microsoft.com/office/word/2010/wordprocessingCanvas" xmlns:cx="http://schemas.microsoft.com/office/drawing/2014/chartex" xmlns:cx1="http://schemas.microsoft.com/office/drawing/2015/9/8/chartex" xmlns:cx2="http://schemas.microsoft.com/office/drawing/2015/10/21/chartex" xmlns:cx3="http://schemas.microsoft.com/office/drawing/2016/5/9/chartex" xmlns:cx4="http://schemas.microsoft.com/office/drawing/2016/5/10/chartex" xmlns:cx5="http://schemas.microsoft.com/office/drawing/2016/5/11/chartex" xmlns:cx6="http://schemas.microsoft.com/office/drawing/2016/5/12/chartex" xmlns:cx7="http://schemas.microsoft.com/office/drawing/2016/5/13/chartex" xmlns:cx8="http://schemas.microsoft.com/office/drawing/2016/5/14/chartex" xmlns:mc="http://schemas.openxmlformats.org/markup-compatibility/2006" xmlns:aink="http://schemas.microsoft.com/office/drawing/2016/ink" xmlns:am3d="http://schemas.microsoft.com/office/drawing/2017/model3d" xmlns:o="urn:schemas-microsoft-com:office:office" xmlns:oel="http://schemas.microsoft.com/office/2019/extlst" xmlns:r="http://schemas.openxmlformats.org/officeDocument/2006/relationships" xmlns:m="http://schemas.openxmlformats.org/officeDocument/2006/math" xmlns:v="urn:schemas-microsoft-com:vml" xmlns:wp14="http://schemas.microsoft.com/office/word/2010/wordprocessingDrawing" xmlns:wp="http://schemas.openxmlformats.org/drawingml/2006/wordprocessingDrawing" xmlns:w10="urn:schemas-microsoft-com:office:word" xmlns:w="http://schemas.openxmlformats.org/wordprocessingml/2006/main" xmlns:w14="http://schemas.microsoft.com/office/word/2010/wordml" xmlns:w15="http://schemas.microsoft.com/office/word/2012/wordml" xmlns:w16cex="http://schemas.microsoft.com/office/word/2018/wordml/cex" xmlns:w16cid="http://schemas.microsoft.com/office/word/2016/wordml/cid" xmlns:w16="http://schemas.microsoft.com/office/word/2018/wordml" xmlns:w16du="http://schemas.microsoft.com/office/word/2023/wordml/word16du" xmlns:w16sdtdh="http://schemas.microsoft.com/office/word/2020/wordml/sdtdatahash" xmlns:w16sdtfl="http://schemas.microsoft.com/office/word/2024/wordml/sdtformatlock" xmlns:w16se="http://schemas.microsoft.com/office/word/2015/wordml/symex" xmlns:wpg="http://schemas.microsoft.com/office/word/2010/wordprocessingGroup" xmlns:wpi="http://schemas.microsoft.com/office/word/2010/wordprocessingInk" xmlns:wne="http://schemas.microsoft.com/office/word/2006/wordml" xmlns:wps="http://schemas.microsoft.com/office/word/2010/wordprocessingShape" mc:Ignorable="w14 w15 w16se w16cid w16 w16cex w16sdtdh w16sdtfl w16du wp14">
   <w:abstractNum w:abstractNumId="0" w15:restartNumberingAfterBreak="0">
+    <w:nsid w:val="1366673E"/>
+    <w:multiLevelType w:val="multilevel"/>
+    <w:tmpl w:val="27823254"/>
+    <w:lvl w:ilvl="0">
+      <w:start w:val="1"/>
+      <w:numFmt w:val="decimal"/>
+      <w:lvlText w:val="%1."/>
+      <w:lvlJc w:val="left"/>
+      <w:pPr>
+        <w:tabs>
+          <w:tab w:val="num" w:pos="720"/>
+        </w:tabs>
+        <w:ind w:left="720" w:hanging="360"/>
+      </w:pPr>
+    </w:lvl>
+    <w:lvl w:ilvl="1">
+      <w:start w:val="1"/>
+      <w:numFmt w:val="bullet"/>
+      <w:lvlText w:val="o"/>
+      <w:lvlJc w:val="left"/>
+      <w:pPr>
+        <w:tabs>
+          <w:tab w:val="num" w:pos="1440"/>
+        </w:tabs>
+        <w:ind w:left="1440" w:hanging="360"/>
+      </w:pPr>
+      <w:rPr>
+        <w:rFonts w:ascii="Courier New" w:hAnsi="Courier New" w:hint="default"/>
+        <w:sz w:val="20"/>
+      </w:rPr>
+    </w:lvl>
+    <w:lvl w:ilvl="2" w:tentative="1">
+      <w:start w:val="1"/>
+      <w:numFmt w:val="decimal"/>
+      <w:lvlText w:val="%3."/>
+      <w:lvlJc w:val="left"/>
+      <w:pPr>
+        <w:tabs>
+          <w:tab w:val="num" w:pos="2160"/>
+        </w:tabs>
+        <w:ind w:left="2160" w:hanging="360"/>
+      </w:pPr>
+    </w:lvl>
+    <w:lvl w:ilvl="3" w:tentative="1">
+      <w:start w:val="1"/>
+      <w:numFmt w:val="decimal"/>
+      <w:lvlText w:val="%4."/>
+      <w:lvlJc w:val="left"/>
+      <w:pPr>
+        <w:tabs>
+          <w:tab w:val="num" w:pos="2880"/>
+        </w:tabs>
+        <w:ind w:left="2880" w:hanging="360"/>
+      </w:pPr>
+    </w:lvl>
+    <w:lvl w:ilvl="4" w:tentative="1">
+      <w:start w:val="1"/>
+      <w:numFmt w:val="decimal"/>
+      <w:lvlText w:val="%5."/>
+      <w:lvlJc w:val="left"/>
+      <w:pPr>
+        <w:tabs>
+          <w:tab w:val="num" w:pos="3600"/>
+        </w:tabs>
+        <w:ind w:left="3600" w:hanging="360"/>
+      </w:pPr>
+    </w:lvl>
+    <w:lvl w:ilvl="5" w:tentative="1">
+      <w:start w:val="1"/>
+      <w:numFmt w:val="decimal"/>
+      <w:lvlText w:val="%6."/>
+      <w:lvlJc w:val="left"/>
+      <w:pPr>
+        <w:tabs>
+          <w:tab w:val="num" w:pos="4320"/>
+        </w:tabs>
+        <w:ind w:left="4320" w:hanging="360"/>
+      </w:pPr>
+    </w:lvl>
+    <w:lvl w:ilvl="6" w:tentative="1">
+      <w:start w:val="1"/>
+      <w:numFmt w:val="decimal"/>
+      <w:lvlText w:val="%7."/>
+      <w:lvlJc w:val="left"/>
+      <w:pPr>
+        <w:tabs>
+          <w:tab w:val="num" w:pos="5040"/>
+        </w:tabs>
+        <w:ind w:left="5040" w:hanging="360"/>
+      </w:pPr>
+    </w:lvl>
+    <w:lvl w:ilvl="7" w:tentative="1">
+      <w:start w:val="1"/>
+      <w:numFmt w:val="decimal"/>
+      <w:lvlText w:val="%8."/>
+      <w:lvlJc w:val="left"/>
+      <w:pPr>
+        <w:tabs>
+          <w:tab w:val="num" w:pos="5760"/>
+        </w:tabs>
+        <w:ind w:left="5760" w:hanging="360"/>
+      </w:pPr>
+    </w:lvl>
+    <w:lvl w:ilvl="8" w:tentative="1">
+      <w:start w:val="1"/>
+      <w:numFmt w:val="decimal"/>
+      <w:lvlText w:val="%9."/>
+      <w:lvlJc w:val="left"/>
+      <w:pPr>
+        <w:tabs>
+          <w:tab w:val="num" w:pos="6480"/>
+        </w:tabs>
+        <w:ind w:left="6480" w:hanging="360"/>
+      </w:pPr>
+    </w:lvl>
+  </w:abstractNum>
+  <w:abstractNum w:abstractNumId="1" w15:restartNumberingAfterBreak="0">
     <w:nsid w:val="18872159"/>
     <w:multiLevelType w:val="multilevel"/>
     <w:tmpl w:val="21DA04DE"/>
@@ -3992,7 +5530,7 @@
       </w:pPr>
     </w:lvl>
   </w:abstractNum>
-  <w:abstractNum w:abstractNumId="1" w15:restartNumberingAfterBreak="0">
+  <w:abstractNum w:abstractNumId="2" w15:restartNumberingAfterBreak="0">
     <w:nsid w:val="3D9F31E0"/>
     <w:multiLevelType w:val="multilevel"/>
     <w:tmpl w:val="4088EC92"/>
@@ -4105,11 +5643,318 @@
       </w:pPr>
     </w:lvl>
   </w:abstractNum>
+  <w:abstractNum w:abstractNumId="3" w15:restartNumberingAfterBreak="0">
+    <w:nsid w:val="46143C00"/>
+    <w:multiLevelType w:val="multilevel"/>
+    <w:tmpl w:val="05608E72"/>
+    <w:lvl w:ilvl="0">
+      <w:start w:val="1"/>
+      <w:numFmt w:val="bullet"/>
+      <w:lvlText w:val=""/>
+      <w:lvlJc w:val="left"/>
+      <w:pPr>
+        <w:tabs>
+          <w:tab w:val="num" w:pos="720"/>
+        </w:tabs>
+        <w:ind w:left="720" w:hanging="360"/>
+      </w:pPr>
+      <w:rPr>
+        <w:rFonts w:ascii="Symbol" w:hAnsi="Symbol" w:hint="default"/>
+        <w:sz w:val="20"/>
+      </w:rPr>
+    </w:lvl>
+    <w:lvl w:ilvl="1" w:tentative="1">
+      <w:start w:val="1"/>
+      <w:numFmt w:val="bullet"/>
+      <w:lvlText w:val="o"/>
+      <w:lvlJc w:val="left"/>
+      <w:pPr>
+        <w:tabs>
+          <w:tab w:val="num" w:pos="1440"/>
+        </w:tabs>
+        <w:ind w:left="1440" w:hanging="360"/>
+      </w:pPr>
+      <w:rPr>
+        <w:rFonts w:ascii="Courier New" w:hAnsi="Courier New" w:hint="default"/>
+        <w:sz w:val="20"/>
+      </w:rPr>
+    </w:lvl>
+    <w:lvl w:ilvl="2" w:tentative="1">
+      <w:start w:val="1"/>
+      <w:numFmt w:val="bullet"/>
+      <w:lvlText w:val=""/>
+      <w:lvlJc w:val="left"/>
+      <w:pPr>
+        <w:tabs>
+          <w:tab w:val="num" w:pos="2160"/>
+        </w:tabs>
+        <w:ind w:left="2160" w:hanging="360"/>
+      </w:pPr>
+      <w:rPr>
+        <w:rFonts w:ascii="Wingdings" w:hAnsi="Wingdings" w:hint="default"/>
+        <w:sz w:val="20"/>
+      </w:rPr>
+    </w:lvl>
+    <w:lvl w:ilvl="3" w:tentative="1">
+      <w:start w:val="1"/>
+      <w:numFmt w:val="bullet"/>
+      <w:lvlText w:val=""/>
+      <w:lvlJc w:val="left"/>
+      <w:pPr>
+        <w:tabs>
+          <w:tab w:val="num" w:pos="2880"/>
+        </w:tabs>
+        <w:ind w:left="2880" w:hanging="360"/>
+      </w:pPr>
+      <w:rPr>
+        <w:rFonts w:ascii="Wingdings" w:hAnsi="Wingdings" w:hint="default"/>
+        <w:sz w:val="20"/>
+      </w:rPr>
+    </w:lvl>
+    <w:lvl w:ilvl="4" w:tentative="1">
+      <w:start w:val="1"/>
+      <w:numFmt w:val="bullet"/>
+      <w:lvlText w:val=""/>
+      <w:lvlJc w:val="left"/>
+      <w:pPr>
+        <w:tabs>
+          <w:tab w:val="num" w:pos="3600"/>
+        </w:tabs>
+        <w:ind w:left="3600" w:hanging="360"/>
+      </w:pPr>
+      <w:rPr>
+        <w:rFonts w:ascii="Wingdings" w:hAnsi="Wingdings" w:hint="default"/>
+        <w:sz w:val="20"/>
+      </w:rPr>
+    </w:lvl>
+    <w:lvl w:ilvl="5" w:tentative="1">
+      <w:start w:val="1"/>
+      <w:numFmt w:val="bullet"/>
+      <w:lvlText w:val=""/>
+      <w:lvlJc w:val="left"/>
+      <w:pPr>
+        <w:tabs>
+          <w:tab w:val="num" w:pos="4320"/>
+        </w:tabs>
+        <w:ind w:left="4320" w:hanging="360"/>
+      </w:pPr>
+      <w:rPr>
+        <w:rFonts w:ascii="Wingdings" w:hAnsi="Wingdings" w:hint="default"/>
+        <w:sz w:val="20"/>
+      </w:rPr>
+    </w:lvl>
+    <w:lvl w:ilvl="6" w:tentative="1">
+      <w:start w:val="1"/>
+      <w:numFmt w:val="bullet"/>
+      <w:lvlText w:val=""/>
+      <w:lvlJc w:val="left"/>
+      <w:pPr>
+        <w:tabs>
+          <w:tab w:val="num" w:pos="5040"/>
+        </w:tabs>
+        <w:ind w:left="5040" w:hanging="360"/>
+      </w:pPr>
+      <w:rPr>
+        <w:rFonts w:ascii="Wingdings" w:hAnsi="Wingdings" w:hint="default"/>
+        <w:sz w:val="20"/>
+      </w:rPr>
+    </w:lvl>
+    <w:lvl w:ilvl="7" w:tentative="1">
+      <w:start w:val="1"/>
+      <w:numFmt w:val="bullet"/>
+      <w:lvlText w:val=""/>
+      <w:lvlJc w:val="left"/>
+      <w:pPr>
+        <w:tabs>
+          <w:tab w:val="num" w:pos="5760"/>
+        </w:tabs>
+        <w:ind w:left="5760" w:hanging="360"/>
+      </w:pPr>
+      <w:rPr>
+        <w:rFonts w:ascii="Wingdings" w:hAnsi="Wingdings" w:hint="default"/>
+        <w:sz w:val="20"/>
+      </w:rPr>
+    </w:lvl>
+    <w:lvl w:ilvl="8" w:tentative="1">
+      <w:start w:val="1"/>
+      <w:numFmt w:val="bullet"/>
+      <w:lvlText w:val=""/>
+      <w:lvlJc w:val="left"/>
+      <w:pPr>
+        <w:tabs>
+          <w:tab w:val="num" w:pos="6480"/>
+        </w:tabs>
+        <w:ind w:left="6480" w:hanging="360"/>
+      </w:pPr>
+      <w:rPr>
+        <w:rFonts w:ascii="Wingdings" w:hAnsi="Wingdings" w:hint="default"/>
+        <w:sz w:val="20"/>
+      </w:rPr>
+    </w:lvl>
+  </w:abstractNum>
+  <w:abstractNum w:abstractNumId="4" w15:restartNumberingAfterBreak="0">
+    <w:nsid w:val="4A9D2586"/>
+    <w:multiLevelType w:val="multilevel"/>
+    <w:tmpl w:val="72C4246C"/>
+    <w:lvl w:ilvl="0">
+      <w:start w:val="1"/>
+      <w:numFmt w:val="bullet"/>
+      <w:lvlText w:val=""/>
+      <w:lvlJc w:val="left"/>
+      <w:pPr>
+        <w:tabs>
+          <w:tab w:val="num" w:pos="720"/>
+        </w:tabs>
+        <w:ind w:left="720" w:hanging="360"/>
+      </w:pPr>
+      <w:rPr>
+        <w:rFonts w:ascii="Symbol" w:hAnsi="Symbol" w:hint="default"/>
+        <w:sz w:val="20"/>
+      </w:rPr>
+    </w:lvl>
+    <w:lvl w:ilvl="1" w:tentative="1">
+      <w:start w:val="1"/>
+      <w:numFmt w:val="bullet"/>
+      <w:lvlText w:val="o"/>
+      <w:lvlJc w:val="left"/>
+      <w:pPr>
+        <w:tabs>
+          <w:tab w:val="num" w:pos="1440"/>
+        </w:tabs>
+        <w:ind w:left="1440" w:hanging="360"/>
+      </w:pPr>
+      <w:rPr>
+        <w:rFonts w:ascii="Courier New" w:hAnsi="Courier New" w:hint="default"/>
+        <w:sz w:val="20"/>
+      </w:rPr>
+    </w:lvl>
+    <w:lvl w:ilvl="2" w:tentative="1">
+      <w:start w:val="1"/>
+      <w:numFmt w:val="bullet"/>
+      <w:lvlText w:val=""/>
+      <w:lvlJc w:val="left"/>
+      <w:pPr>
+        <w:tabs>
+          <w:tab w:val="num" w:pos="2160"/>
+        </w:tabs>
+        <w:ind w:left="2160" w:hanging="360"/>
+      </w:pPr>
+      <w:rPr>
+        <w:rFonts w:ascii="Wingdings" w:hAnsi="Wingdings" w:hint="default"/>
+        <w:sz w:val="20"/>
+      </w:rPr>
+    </w:lvl>
+    <w:lvl w:ilvl="3" w:tentative="1">
+      <w:start w:val="1"/>
+      <w:numFmt w:val="bullet"/>
+      <w:lvlText w:val=""/>
+      <w:lvlJc w:val="left"/>
+      <w:pPr>
+        <w:tabs>
+          <w:tab w:val="num" w:pos="2880"/>
+        </w:tabs>
+        <w:ind w:left="2880" w:hanging="360"/>
+      </w:pPr>
+      <w:rPr>
+        <w:rFonts w:ascii="Wingdings" w:hAnsi="Wingdings" w:hint="default"/>
+        <w:sz w:val="20"/>
+      </w:rPr>
+    </w:lvl>
+    <w:lvl w:ilvl="4" w:tentative="1">
+      <w:start w:val="1"/>
+      <w:numFmt w:val="bullet"/>
+      <w:lvlText w:val=""/>
+      <w:lvlJc w:val="left"/>
+      <w:pPr>
+        <w:tabs>
+          <w:tab w:val="num" w:pos="3600"/>
+        </w:tabs>
+        <w:ind w:left="3600" w:hanging="360"/>
+      </w:pPr>
+      <w:rPr>
+        <w:rFonts w:ascii="Wingdings" w:hAnsi="Wingdings" w:hint="default"/>
+        <w:sz w:val="20"/>
+      </w:rPr>
+    </w:lvl>
+    <w:lvl w:ilvl="5" w:tentative="1">
+      <w:start w:val="1"/>
+      <w:numFmt w:val="bullet"/>
+      <w:lvlText w:val=""/>
+      <w:lvlJc w:val="left"/>
+      <w:pPr>
+        <w:tabs>
+          <w:tab w:val="num" w:pos="4320"/>
+        </w:tabs>
+        <w:ind w:left="4320" w:hanging="360"/>
+      </w:pPr>
+      <w:rPr>
+        <w:rFonts w:ascii="Wingdings" w:hAnsi="Wingdings" w:hint="default"/>
+        <w:sz w:val="20"/>
+      </w:rPr>
+    </w:lvl>
+    <w:lvl w:ilvl="6" w:tentative="1">
+      <w:start w:val="1"/>
+      <w:numFmt w:val="bullet"/>
+      <w:lvlText w:val=""/>
+      <w:lvlJc w:val="left"/>
+      <w:pPr>
+        <w:tabs>
+          <w:tab w:val="num" w:pos="5040"/>
+        </w:tabs>
+        <w:ind w:left="5040" w:hanging="360"/>
+      </w:pPr>
+      <w:rPr>
+        <w:rFonts w:ascii="Wingdings" w:hAnsi="Wingdings" w:hint="default"/>
+        <w:sz w:val="20"/>
+      </w:rPr>
+    </w:lvl>
+    <w:lvl w:ilvl="7" w:tentative="1">
+      <w:start w:val="1"/>
+      <w:numFmt w:val="bullet"/>
+      <w:lvlText w:val=""/>
+      <w:lvlJc w:val="left"/>
+      <w:pPr>
+        <w:tabs>
+          <w:tab w:val="num" w:pos="5760"/>
+        </w:tabs>
+        <w:ind w:left="5760" w:hanging="360"/>
+      </w:pPr>
+      <w:rPr>
+        <w:rFonts w:ascii="Wingdings" w:hAnsi="Wingdings" w:hint="default"/>
+        <w:sz w:val="20"/>
+      </w:rPr>
+    </w:lvl>
+    <w:lvl w:ilvl="8" w:tentative="1">
+      <w:start w:val="1"/>
+      <w:numFmt w:val="bullet"/>
+      <w:lvlText w:val=""/>
+      <w:lvlJc w:val="left"/>
+      <w:pPr>
+        <w:tabs>
+          <w:tab w:val="num" w:pos="6480"/>
+        </w:tabs>
+        <w:ind w:left="6480" w:hanging="360"/>
+      </w:pPr>
+      <w:rPr>
+        <w:rFonts w:ascii="Wingdings" w:hAnsi="Wingdings" w:hint="default"/>
+        <w:sz w:val="20"/>
+      </w:rPr>
+    </w:lvl>
+  </w:abstractNum>
   <w:num w:numId="1" w16cid:durableId="349915752">
-    <w:abstractNumId w:val="0"/>
+    <w:abstractNumId w:val="1"/>
   </w:num>
   <w:num w:numId="2" w16cid:durableId="552040752">
-    <w:abstractNumId w:val="1"/>
+    <w:abstractNumId w:val="2"/>
+  </w:num>
+  <w:num w:numId="3" w16cid:durableId="227307605">
+    <w:abstractNumId w:val="3"/>
+  </w:num>
+  <w:num w:numId="4" w16cid:durableId="1112020264">
+    <w:abstractNumId w:val="4"/>
+  </w:num>
+  <w:num w:numId="5" w16cid:durableId="571740311">
+    <w:abstractNumId w:val="0"/>
   </w:num>
 </w:numbering>
 </file>

</xml_diff>

<commit_message>
docs(core): check list actualizado y cierre fase 1.5
</commit_message>
<xml_diff>
--- a/FASES DE DESARROLLO NEXO.docx
+++ b/FASES DE DESARROLLO NEXO.docx
@@ -4595,45 +4595,78 @@
       </w:r>
     </w:p>
     <w:p>
+      <w:pPr>
+        <w:rPr>
+          <w:lang w:val="en-US"/>
+        </w:rPr>
+      </w:pPr>
       <w:proofErr w:type="gramStart"/>
       <w:r>
         <w:rPr>
           <w:rFonts w:ascii="Segoe UI Emoji" w:hAnsi="Segoe UI Emoji" w:cs="Segoe UI Emoji"/>
+          <w:lang w:val="en-US"/>
         </w:rPr>
         <w:t>✅</w:t>
       </w:r>
       <w:r>
+        <w:rPr>
+          <w:lang w:val="en-US"/>
+        </w:rPr>
         <w:t xml:space="preserve"> .</w:t>
       </w:r>
       <w:proofErr w:type="spellStart"/>
       <w:r>
+        <w:rPr>
+          <w:lang w:val="en-US"/>
+        </w:rPr>
         <w:t>env</w:t>
       </w:r>
       <w:proofErr w:type="gramEnd"/>
       <w:r>
+        <w:rPr>
+          <w:lang w:val="en-US"/>
+        </w:rPr>
         <w:t>.local</w:t>
       </w:r>
       <w:proofErr w:type="spellEnd"/>
       <w:r>
+        <w:rPr>
+          <w:lang w:val="en-US"/>
+        </w:rPr>
         <w:t>: [OK]</w:t>
       </w:r>
     </w:p>
     <w:p>
+      <w:pPr>
+        <w:rPr>
+          <w:lang w:val="en-US"/>
+        </w:rPr>
+      </w:pPr>
       <w:r>
         <w:rPr>
           <w:rFonts w:ascii="Segoe UI Emoji" w:hAnsi="Segoe UI Emoji" w:cs="Segoe UI Emoji"/>
+          <w:lang w:val="en-US"/>
         </w:rPr>
         <w:t>✅</w:t>
       </w:r>
       <w:r>
+        <w:rPr>
+          <w:lang w:val="en-US"/>
+        </w:rPr>
         <w:t xml:space="preserve"> </w:t>
       </w:r>
       <w:proofErr w:type="spellStart"/>
       <w:r>
+        <w:rPr>
+          <w:lang w:val="en-US"/>
+        </w:rPr>
         <w:t>node_modules</w:t>
       </w:r>
       <w:proofErr w:type="spellEnd"/>
       <w:r>
+        <w:rPr>
+          <w:lang w:val="en-US"/>
+        </w:rPr>
         <w:t>: [OK]</w:t>
       </w:r>
     </w:p>
@@ -5288,6 +5321,1472 @@
       </w:r>
     </w:p>
     <w:p/>
+    <w:p>
+      <w:pPr>
+        <w:pStyle w:val="Ttulo2"/>
+      </w:pPr>
+      <w:r>
+        <w:t>Solicitar Apoyo de Agentes</w:t>
+      </w:r>
+    </w:p>
+    <w:p/>
+    <w:p>
+      <w:r>
+        <w:t># Para configurar AWS</w:t>
+      </w:r>
+    </w:p>
+    <w:p>
+      <w:r>
+        <w:t xml:space="preserve">@devops-nexoERP Necesito configurar AWS </w:t>
+      </w:r>
+      <w:proofErr w:type="spellStart"/>
+      <w:r>
+        <w:t>Amplify</w:t>
+      </w:r>
+      <w:proofErr w:type="spellEnd"/>
+      <w:r>
+        <w:t xml:space="preserve"> Gen 2 con </w:t>
+      </w:r>
+      <w:proofErr w:type="spellStart"/>
+      <w:r>
+        <w:t>Cognito</w:t>
+      </w:r>
+      <w:proofErr w:type="spellEnd"/>
+      <w:r>
+        <w:t>, S3, y RDS</w:t>
+      </w:r>
+    </w:p>
+    <w:p/>
+    <w:p>
+      <w:r>
+        <w:t># Para implementar pantallas</w:t>
+      </w:r>
+    </w:p>
+    <w:p>
+      <w:r>
+        <w:t xml:space="preserve">@uxui-designer-nexoERP Necesito implementar CRUD de usuarios con </w:t>
+      </w:r>
+      <w:proofErr w:type="spellStart"/>
+      <w:r>
+        <w:t>TanStack</w:t>
+      </w:r>
+      <w:proofErr w:type="spellEnd"/>
+      <w:r>
+        <w:t xml:space="preserve"> Table</w:t>
+      </w:r>
+    </w:p>
+    <w:p/>
+    <w:p>
+      <w:r>
+        <w:t># Para auditoría de seguridad</w:t>
+      </w:r>
+    </w:p>
+    <w:p>
+      <w:r>
+        <w:t xml:space="preserve">@security-auditor-nexoERP Necesito auditoría completa antes de </w:t>
+      </w:r>
+      <w:proofErr w:type="spellStart"/>
+      <w:r>
+        <w:t>merge</w:t>
+      </w:r>
+      <w:proofErr w:type="spellEnd"/>
+      <w:r>
+        <w:t xml:space="preserve"> a </w:t>
+      </w:r>
+      <w:proofErr w:type="spellStart"/>
+      <w:r>
+        <w:t>staging</w:t>
+      </w:r>
+      <w:proofErr w:type="spellEnd"/>
+    </w:p>
+    <w:p/>
+    <w:p>
+      <w:r>
+        <w:t xml:space="preserve"># Para validación de </w:t>
+      </w:r>
+      <w:proofErr w:type="spellStart"/>
+      <w:r>
+        <w:t>tests</w:t>
+      </w:r>
+      <w:proofErr w:type="spellEnd"/>
+    </w:p>
+    <w:p>
+      <w:r>
+        <w:t xml:space="preserve">@qa-nexoERP Necesito revisión de cobertura de </w:t>
+      </w:r>
+      <w:proofErr w:type="spellStart"/>
+      <w:r>
+        <w:t>tests</w:t>
+      </w:r>
+      <w:proofErr w:type="spellEnd"/>
+    </w:p>
+    <w:p/>
+    <w:p>
+      <w:pPr>
+        <w:rPr>
+          <w:b/>
+          <w:bCs/>
+        </w:rPr>
+      </w:pPr>
+      <w:r>
+        <w:rPr>
+          <w:b/>
+          <w:bCs/>
+        </w:rPr>
+        <w:lastRenderedPageBreak/>
+        <w:t>Resumen de Validación Completa</w:t>
+      </w:r>
+      <w:r>
+        <w:rPr>
+          <w:b/>
+          <w:bCs/>
+        </w:rPr>
+        <w:t xml:space="preserve"> Fase 1</w:t>
+      </w:r>
+    </w:p>
+    <w:tbl>
+      <w:tblPr>
+        <w:tblW w:w="0" w:type="auto"/>
+        <w:tblCellSpacing w:w="15" w:type="dxa"/>
+        <w:tblBorders>
+          <w:top w:val="single" w:sz="6" w:space="0" w:color="auto"/>
+          <w:left w:val="single" w:sz="6" w:space="0" w:color="auto"/>
+          <w:bottom w:val="single" w:sz="6" w:space="0" w:color="auto"/>
+          <w:right w:val="single" w:sz="6" w:space="0" w:color="auto"/>
+        </w:tblBorders>
+        <w:tblCellMar>
+          <w:top w:w="15" w:type="dxa"/>
+          <w:left w:w="15" w:type="dxa"/>
+          <w:bottom w:w="15" w:type="dxa"/>
+          <w:right w:w="15" w:type="dxa"/>
+        </w:tblCellMar>
+        <w:tblLook w:val="04A0" w:firstRow="1" w:lastRow="0" w:firstColumn="1" w:lastColumn="0" w:noHBand="0" w:noVBand="1"/>
+      </w:tblPr>
+      <w:tblGrid>
+        <w:gridCol w:w="2839"/>
+        <w:gridCol w:w="5440"/>
+      </w:tblGrid>
+      <w:tr>
+        <w:trPr>
+          <w:tblHeader/>
+          <w:tblCellSpacing w:w="15" w:type="dxa"/>
+        </w:trPr>
+        <w:tc>
+          <w:tcPr>
+            <w:tcW w:w="0" w:type="auto"/>
+            <w:tcBorders>
+              <w:top w:val="nil"/>
+              <w:left w:val="nil"/>
+            </w:tcBorders>
+            <w:tcMar>
+              <w:top w:w="60" w:type="dxa"/>
+              <w:left w:w="90" w:type="dxa"/>
+              <w:bottom w:w="60" w:type="dxa"/>
+              <w:right w:w="90" w:type="dxa"/>
+            </w:tcMar>
+            <w:vAlign w:val="center"/>
+            <w:hideMark/>
+          </w:tcPr>
+          <w:p>
+            <w:pPr>
+              <w:rPr>
+                <w:b/>
+                <w:bCs/>
+              </w:rPr>
+            </w:pPr>
+            <w:r>
+              <w:rPr>
+                <w:b/>
+                <w:bCs/>
+              </w:rPr>
+              <w:t>Verificación</w:t>
+            </w:r>
+          </w:p>
+        </w:tc>
+        <w:tc>
+          <w:tcPr>
+            <w:tcW w:w="0" w:type="auto"/>
+            <w:tcBorders>
+              <w:top w:val="nil"/>
+              <w:left w:val="nil"/>
+              <w:right w:val="nil"/>
+            </w:tcBorders>
+            <w:tcMar>
+              <w:top w:w="60" w:type="dxa"/>
+              <w:left w:w="90" w:type="dxa"/>
+              <w:bottom w:w="60" w:type="dxa"/>
+              <w:right w:w="90" w:type="dxa"/>
+            </w:tcMar>
+            <w:vAlign w:val="center"/>
+            <w:hideMark/>
+          </w:tcPr>
+          <w:p>
+            <w:pPr>
+              <w:rPr>
+                <w:b/>
+                <w:bCs/>
+              </w:rPr>
+            </w:pPr>
+            <w:r>
+              <w:rPr>
+                <w:b/>
+                <w:bCs/>
+              </w:rPr>
+              <w:t>Resultado</w:t>
+            </w:r>
+          </w:p>
+        </w:tc>
+      </w:tr>
+      <w:tr>
+        <w:trPr>
+          <w:tblCellSpacing w:w="15" w:type="dxa"/>
+        </w:trPr>
+        <w:tc>
+          <w:tcPr>
+            <w:tcW w:w="0" w:type="auto"/>
+            <w:tcBorders>
+              <w:top w:val="nil"/>
+              <w:left w:val="nil"/>
+            </w:tcBorders>
+            <w:tcMar>
+              <w:top w:w="60" w:type="dxa"/>
+              <w:left w:w="90" w:type="dxa"/>
+              <w:bottom w:w="60" w:type="dxa"/>
+              <w:right w:w="90" w:type="dxa"/>
+            </w:tcMar>
+            <w:vAlign w:val="center"/>
+            <w:hideMark/>
+          </w:tcPr>
+          <w:p>
+            <w:r>
+              <w:t>Infraestructura AWS</w:t>
+            </w:r>
+          </w:p>
+        </w:tc>
+        <w:tc>
+          <w:tcPr>
+            <w:tcW w:w="0" w:type="auto"/>
+            <w:tcBorders>
+              <w:top w:val="nil"/>
+              <w:left w:val="nil"/>
+              <w:right w:val="nil"/>
+            </w:tcBorders>
+            <w:tcMar>
+              <w:top w:w="60" w:type="dxa"/>
+              <w:left w:w="90" w:type="dxa"/>
+              <w:bottom w:w="60" w:type="dxa"/>
+              <w:right w:w="90" w:type="dxa"/>
+            </w:tcMar>
+            <w:vAlign w:val="center"/>
+            <w:hideMark/>
+          </w:tcPr>
+          <w:p>
+            <w:pPr>
+              <w:rPr>
+                <w:lang w:val="en-US"/>
+              </w:rPr>
+            </w:pPr>
+            <w:r>
+              <w:rPr>
+                <w:b/>
+                <w:bCs/>
+                <w:lang w:val="en-US"/>
+              </w:rPr>
+              <w:t>27/29 PASS</w:t>
+            </w:r>
+            <w:r>
+              <w:rPr>
+                <w:lang w:val="en-US"/>
+              </w:rPr>
+              <w:t> (RDS, RDS Proxy, Cognito, S3, Amplify)</w:t>
+            </w:r>
+          </w:p>
+        </w:tc>
+      </w:tr>
+      <w:tr>
+        <w:trPr>
+          <w:tblCellSpacing w:w="15" w:type="dxa"/>
+        </w:trPr>
+        <w:tc>
+          <w:tcPr>
+            <w:tcW w:w="0" w:type="auto"/>
+            <w:tcBorders>
+              <w:top w:val="nil"/>
+              <w:left w:val="nil"/>
+            </w:tcBorders>
+            <w:tcMar>
+              <w:top w:w="60" w:type="dxa"/>
+              <w:left w:w="90" w:type="dxa"/>
+              <w:bottom w:w="60" w:type="dxa"/>
+              <w:right w:w="90" w:type="dxa"/>
+            </w:tcMar>
+            <w:vAlign w:val="center"/>
+            <w:hideMark/>
+          </w:tcPr>
+          <w:p>
+            <w:proofErr w:type="spellStart"/>
+            <w:r>
+              <w:t>Staging</w:t>
+            </w:r>
+            <w:proofErr w:type="spellEnd"/>
+            <w:r>
+              <w:t xml:space="preserve"> URL (/)</w:t>
+            </w:r>
+          </w:p>
+        </w:tc>
+        <w:tc>
+          <w:tcPr>
+            <w:tcW w:w="0" w:type="auto"/>
+            <w:tcBorders>
+              <w:top w:val="nil"/>
+              <w:left w:val="nil"/>
+              <w:right w:val="nil"/>
+            </w:tcBorders>
+            <w:tcMar>
+              <w:top w:w="60" w:type="dxa"/>
+              <w:left w:w="90" w:type="dxa"/>
+              <w:bottom w:w="60" w:type="dxa"/>
+              <w:right w:w="90" w:type="dxa"/>
+            </w:tcMar>
+            <w:vAlign w:val="center"/>
+            <w:hideMark/>
+          </w:tcPr>
+          <w:p>
+            <w:r>
+              <w:rPr>
+                <w:b/>
+                <w:bCs/>
+              </w:rPr>
+              <w:t>200 OK</w:t>
+            </w:r>
+            <w:r>
+              <w:t> - "</w:t>
+            </w:r>
+            <w:proofErr w:type="spellStart"/>
+            <w:r>
+              <w:t>NexoERP</w:t>
+            </w:r>
+            <w:proofErr w:type="spellEnd"/>
+            <w:r>
+              <w:t>"</w:t>
+            </w:r>
+          </w:p>
+        </w:tc>
+      </w:tr>
+      <w:tr>
+        <w:trPr>
+          <w:tblCellSpacing w:w="15" w:type="dxa"/>
+        </w:trPr>
+        <w:tc>
+          <w:tcPr>
+            <w:tcW w:w="0" w:type="auto"/>
+            <w:tcBorders>
+              <w:top w:val="nil"/>
+              <w:left w:val="nil"/>
+            </w:tcBorders>
+            <w:tcMar>
+              <w:top w:w="60" w:type="dxa"/>
+              <w:left w:w="90" w:type="dxa"/>
+              <w:bottom w:w="60" w:type="dxa"/>
+              <w:right w:w="90" w:type="dxa"/>
+            </w:tcMar>
+            <w:vAlign w:val="center"/>
+            <w:hideMark/>
+          </w:tcPr>
+          <w:p>
+            <w:r>
+              <w:t>Dashboard (/</w:t>
+            </w:r>
+            <w:proofErr w:type="spellStart"/>
+            <w:r>
+              <w:t>dashboard</w:t>
+            </w:r>
+            <w:proofErr w:type="spellEnd"/>
+            <w:r>
+              <w:t>)</w:t>
+            </w:r>
+          </w:p>
+        </w:tc>
+        <w:tc>
+          <w:tcPr>
+            <w:tcW w:w="0" w:type="auto"/>
+            <w:tcBorders>
+              <w:top w:val="nil"/>
+              <w:left w:val="nil"/>
+              <w:right w:val="nil"/>
+            </w:tcBorders>
+            <w:tcMar>
+              <w:top w:w="60" w:type="dxa"/>
+              <w:left w:w="90" w:type="dxa"/>
+              <w:bottom w:w="60" w:type="dxa"/>
+              <w:right w:w="90" w:type="dxa"/>
+            </w:tcMar>
+            <w:vAlign w:val="center"/>
+            <w:hideMark/>
+          </w:tcPr>
+          <w:p>
+            <w:r>
+              <w:rPr>
+                <w:b/>
+                <w:bCs/>
+              </w:rPr>
+              <w:t>200 OK</w:t>
+            </w:r>
+            <w:r>
+              <w:t> - 36KB</w:t>
+            </w:r>
+          </w:p>
+        </w:tc>
+      </w:tr>
+      <w:tr>
+        <w:trPr>
+          <w:tblCellSpacing w:w="15" w:type="dxa"/>
+        </w:trPr>
+        <w:tc>
+          <w:tcPr>
+            <w:tcW w:w="0" w:type="auto"/>
+            <w:tcBorders>
+              <w:top w:val="nil"/>
+              <w:left w:val="nil"/>
+            </w:tcBorders>
+            <w:tcMar>
+              <w:top w:w="60" w:type="dxa"/>
+              <w:left w:w="90" w:type="dxa"/>
+              <w:bottom w:w="60" w:type="dxa"/>
+              <w:right w:w="90" w:type="dxa"/>
+            </w:tcMar>
+            <w:vAlign w:val="center"/>
+            <w:hideMark/>
+          </w:tcPr>
+          <w:p>
+            <w:proofErr w:type="spellStart"/>
+            <w:r>
+              <w:t>Users</w:t>
+            </w:r>
+            <w:proofErr w:type="spellEnd"/>
+            <w:r>
+              <w:t xml:space="preserve"> (/</w:t>
+            </w:r>
+            <w:proofErr w:type="spellStart"/>
+            <w:r>
+              <w:t>dashboard</w:t>
+            </w:r>
+            <w:proofErr w:type="spellEnd"/>
+            <w:r>
+              <w:t>/</w:t>
+            </w:r>
+            <w:proofErr w:type="spellStart"/>
+            <w:r>
+              <w:t>users</w:t>
+            </w:r>
+            <w:proofErr w:type="spellEnd"/>
+            <w:r>
+              <w:t>)</w:t>
+            </w:r>
+          </w:p>
+        </w:tc>
+        <w:tc>
+          <w:tcPr>
+            <w:tcW w:w="0" w:type="auto"/>
+            <w:tcBorders>
+              <w:top w:val="nil"/>
+              <w:left w:val="nil"/>
+              <w:right w:val="nil"/>
+            </w:tcBorders>
+            <w:tcMar>
+              <w:top w:w="60" w:type="dxa"/>
+              <w:left w:w="90" w:type="dxa"/>
+              <w:bottom w:w="60" w:type="dxa"/>
+              <w:right w:w="90" w:type="dxa"/>
+            </w:tcMar>
+            <w:vAlign w:val="center"/>
+            <w:hideMark/>
+          </w:tcPr>
+          <w:p>
+            <w:r>
+              <w:rPr>
+                <w:b/>
+                <w:bCs/>
+              </w:rPr>
+              <w:t>200 OK</w:t>
+            </w:r>
+            <w:r>
+              <w:t> - 37KB</w:t>
+            </w:r>
+          </w:p>
+        </w:tc>
+      </w:tr>
+      <w:tr>
+        <w:trPr>
+          <w:tblCellSpacing w:w="15" w:type="dxa"/>
+        </w:trPr>
+        <w:tc>
+          <w:tcPr>
+            <w:tcW w:w="0" w:type="auto"/>
+            <w:tcBorders>
+              <w:top w:val="nil"/>
+              <w:left w:val="nil"/>
+            </w:tcBorders>
+            <w:tcMar>
+              <w:top w:w="60" w:type="dxa"/>
+              <w:left w:w="90" w:type="dxa"/>
+              <w:bottom w:w="60" w:type="dxa"/>
+              <w:right w:w="90" w:type="dxa"/>
+            </w:tcMar>
+            <w:vAlign w:val="center"/>
+            <w:hideMark/>
+          </w:tcPr>
+          <w:p>
+            <w:pPr>
+              <w:rPr>
+                <w:lang w:val="en-US"/>
+              </w:rPr>
+            </w:pPr>
+            <w:r>
+              <w:rPr>
+                <w:lang w:val="en-US"/>
+              </w:rPr>
+              <w:t>API (/</w:t>
+            </w:r>
+            <w:proofErr w:type="spellStart"/>
+            <w:r>
+              <w:rPr>
+                <w:lang w:val="en-US"/>
+              </w:rPr>
+              <w:t>api</w:t>
+            </w:r>
+            <w:proofErr w:type="spellEnd"/>
+            <w:r>
+              <w:rPr>
+                <w:lang w:val="en-US"/>
+              </w:rPr>
+              <w:t>/v1/core/users)</w:t>
+            </w:r>
+          </w:p>
+        </w:tc>
+        <w:tc>
+          <w:tcPr>
+            <w:tcW w:w="0" w:type="auto"/>
+            <w:tcBorders>
+              <w:top w:val="nil"/>
+              <w:left w:val="nil"/>
+              <w:right w:val="nil"/>
+            </w:tcBorders>
+            <w:tcMar>
+              <w:top w:w="60" w:type="dxa"/>
+              <w:left w:w="90" w:type="dxa"/>
+              <w:bottom w:w="60" w:type="dxa"/>
+              <w:right w:w="90" w:type="dxa"/>
+            </w:tcMar>
+            <w:vAlign w:val="center"/>
+            <w:hideMark/>
+          </w:tcPr>
+          <w:p>
+            <w:r>
+              <w:rPr>
+                <w:b/>
+                <w:bCs/>
+              </w:rPr>
+              <w:t>400</w:t>
+            </w:r>
+            <w:r>
+              <w:t xml:space="preserve"> - Correcto (requiere </w:t>
+            </w:r>
+            <w:proofErr w:type="spellStart"/>
+            <w:r>
+              <w:t>auth</w:t>
+            </w:r>
+            <w:proofErr w:type="spellEnd"/>
+            <w:r>
+              <w:t>)</w:t>
+            </w:r>
+          </w:p>
+        </w:tc>
+      </w:tr>
+      <w:tr>
+        <w:trPr>
+          <w:tblCellSpacing w:w="15" w:type="dxa"/>
+        </w:trPr>
+        <w:tc>
+          <w:tcPr>
+            <w:tcW w:w="0" w:type="auto"/>
+            <w:tcBorders>
+              <w:top w:val="nil"/>
+              <w:left w:val="nil"/>
+            </w:tcBorders>
+            <w:tcMar>
+              <w:top w:w="60" w:type="dxa"/>
+              <w:left w:w="90" w:type="dxa"/>
+              <w:bottom w:w="60" w:type="dxa"/>
+              <w:right w:w="90" w:type="dxa"/>
+            </w:tcMar>
+            <w:vAlign w:val="center"/>
+            <w:hideMark/>
+          </w:tcPr>
+          <w:p>
+            <w:proofErr w:type="spellStart"/>
+            <w:r>
+              <w:t>Headers</w:t>
+            </w:r>
+            <w:proofErr w:type="spellEnd"/>
+            <w:r>
+              <w:t xml:space="preserve"> de seguridad</w:t>
+            </w:r>
+          </w:p>
+        </w:tc>
+        <w:tc>
+          <w:tcPr>
+            <w:tcW w:w="0" w:type="auto"/>
+            <w:tcBorders>
+              <w:top w:val="nil"/>
+              <w:left w:val="nil"/>
+              <w:right w:val="nil"/>
+            </w:tcBorders>
+            <w:tcMar>
+              <w:top w:w="60" w:type="dxa"/>
+              <w:left w:w="90" w:type="dxa"/>
+              <w:bottom w:w="60" w:type="dxa"/>
+              <w:right w:w="90" w:type="dxa"/>
+            </w:tcMar>
+            <w:vAlign w:val="center"/>
+            <w:hideMark/>
+          </w:tcPr>
+          <w:p>
+            <w:r>
+              <w:rPr>
+                <w:b/>
+                <w:bCs/>
+              </w:rPr>
+              <w:t>6/6</w:t>
+            </w:r>
+            <w:r>
+              <w:t> presentes</w:t>
+            </w:r>
+          </w:p>
+        </w:tc>
+      </w:tr>
+      <w:tr>
+        <w:trPr>
+          <w:tblCellSpacing w:w="15" w:type="dxa"/>
+        </w:trPr>
+        <w:tc>
+          <w:tcPr>
+            <w:tcW w:w="0" w:type="auto"/>
+            <w:tcBorders>
+              <w:top w:val="nil"/>
+              <w:left w:val="nil"/>
+            </w:tcBorders>
+            <w:tcMar>
+              <w:top w:w="60" w:type="dxa"/>
+              <w:left w:w="90" w:type="dxa"/>
+              <w:bottom w:w="60" w:type="dxa"/>
+              <w:right w:w="90" w:type="dxa"/>
+            </w:tcMar>
+            <w:vAlign w:val="center"/>
+            <w:hideMark/>
+          </w:tcPr>
+          <w:p>
+            <w:proofErr w:type="spellStart"/>
+            <w:r>
+              <w:t>Tests</w:t>
+            </w:r>
+            <w:proofErr w:type="spellEnd"/>
+            <w:r>
+              <w:t xml:space="preserve"> locales (</w:t>
+            </w:r>
+            <w:proofErr w:type="spellStart"/>
+            <w:r>
+              <w:t>Vitest</w:t>
+            </w:r>
+            <w:proofErr w:type="spellEnd"/>
+            <w:r>
+              <w:t>)</w:t>
+            </w:r>
+          </w:p>
+        </w:tc>
+        <w:tc>
+          <w:tcPr>
+            <w:tcW w:w="0" w:type="auto"/>
+            <w:tcBorders>
+              <w:top w:val="nil"/>
+              <w:left w:val="nil"/>
+              <w:right w:val="nil"/>
+            </w:tcBorders>
+            <w:tcMar>
+              <w:top w:w="60" w:type="dxa"/>
+              <w:left w:w="90" w:type="dxa"/>
+              <w:bottom w:w="60" w:type="dxa"/>
+              <w:right w:w="90" w:type="dxa"/>
+            </w:tcMar>
+            <w:vAlign w:val="center"/>
+            <w:hideMark/>
+          </w:tcPr>
+          <w:p>
+            <w:r>
+              <w:rPr>
+                <w:b/>
+                <w:bCs/>
+              </w:rPr>
+              <w:t>47/47 PASS</w:t>
+            </w:r>
+            <w:r>
+              <w:t> en 4.48s</w:t>
+            </w:r>
+          </w:p>
+        </w:tc>
+      </w:tr>
+      <w:tr>
+        <w:trPr>
+          <w:tblCellSpacing w:w="15" w:type="dxa"/>
+        </w:trPr>
+        <w:tc>
+          <w:tcPr>
+            <w:tcW w:w="0" w:type="auto"/>
+            <w:tcBorders>
+              <w:top w:val="nil"/>
+              <w:left w:val="nil"/>
+              <w:bottom w:val="nil"/>
+            </w:tcBorders>
+            <w:tcMar>
+              <w:top w:w="60" w:type="dxa"/>
+              <w:left w:w="90" w:type="dxa"/>
+              <w:bottom w:w="60" w:type="dxa"/>
+              <w:right w:w="90" w:type="dxa"/>
+            </w:tcMar>
+            <w:vAlign w:val="center"/>
+            <w:hideMark/>
+          </w:tcPr>
+          <w:p>
+            <w:proofErr w:type="spellStart"/>
+            <w:r>
+              <w:t>CloudFront</w:t>
+            </w:r>
+            <w:proofErr w:type="spellEnd"/>
+          </w:p>
+        </w:tc>
+        <w:tc>
+          <w:tcPr>
+            <w:tcW w:w="0" w:type="auto"/>
+            <w:tcBorders>
+              <w:top w:val="nil"/>
+              <w:left w:val="nil"/>
+              <w:bottom w:val="nil"/>
+              <w:right w:val="nil"/>
+            </w:tcBorders>
+            <w:tcMar>
+              <w:top w:w="60" w:type="dxa"/>
+              <w:left w:w="90" w:type="dxa"/>
+              <w:bottom w:w="60" w:type="dxa"/>
+              <w:right w:w="90" w:type="dxa"/>
+            </w:tcMar>
+            <w:vAlign w:val="center"/>
+            <w:hideMark/>
+          </w:tcPr>
+          <w:p>
+            <w:r>
+              <w:t>CDN activo (MIA3-P5)</w:t>
+            </w:r>
+          </w:p>
+        </w:tc>
+      </w:tr>
+    </w:tbl>
+    <w:p>
+      <w:r>
+        <w:rPr>
+          <w:b/>
+          <w:bCs/>
+        </w:rPr>
+        <w:t xml:space="preserve">Fase 1 </w:t>
+      </w:r>
+      <w:proofErr w:type="spellStart"/>
+      <w:r>
+        <w:rPr>
+          <w:b/>
+          <w:bCs/>
+        </w:rPr>
+        <w:t>deployada</w:t>
+      </w:r>
+      <w:proofErr w:type="spellEnd"/>
+      <w:r>
+        <w:rPr>
+          <w:b/>
+          <w:bCs/>
+        </w:rPr>
+        <w:t xml:space="preserve"> y validada en </w:t>
+      </w:r>
+      <w:proofErr w:type="spellStart"/>
+      <w:r>
+        <w:rPr>
+          <w:b/>
+          <w:bCs/>
+        </w:rPr>
+        <w:t>staging</w:t>
+      </w:r>
+      <w:proofErr w:type="spellEnd"/>
+      <w:r>
+        <w:rPr>
+          <w:b/>
+          <w:bCs/>
+        </w:rPr>
+        <w:t>.</w:t>
+      </w:r>
+    </w:p>
+    <w:p>
+      <w:r>
+        <w:t>Ahora que todo está confirmado, el siguiente paso según el documento es </w:t>
+      </w:r>
+      <w:r>
+        <w:rPr>
+          <w:b/>
+          <w:bCs/>
+        </w:rPr>
+        <w:t>Fase 1.5: Completar el módulo Core</w:t>
+      </w:r>
+      <w:r>
+        <w:t xml:space="preserve">. Los </w:t>
+      </w:r>
+      <w:proofErr w:type="spellStart"/>
+      <w:r>
+        <w:t>items</w:t>
+      </w:r>
+      <w:proofErr w:type="spellEnd"/>
+      <w:r>
+        <w:t xml:space="preserve"> pendientes son:</w:t>
+      </w:r>
+    </w:p>
+    <w:p>
+      <w:pPr>
+        <w:numPr>
+          <w:ilvl w:val="0"/>
+          <w:numId w:val="6"/>
+        </w:numPr>
+        <w:rPr>
+          <w:lang w:val="en-US"/>
+        </w:rPr>
+      </w:pPr>
+      <w:r>
+        <w:rPr>
+          <w:b/>
+          <w:bCs/>
+          <w:lang w:val="en-US"/>
+        </w:rPr>
+        <w:t xml:space="preserve">API Middleware </w:t>
+      </w:r>
+      <w:proofErr w:type="gramStart"/>
+      <w:r>
+        <w:rPr>
+          <w:b/>
+          <w:bCs/>
+          <w:lang w:val="en-US"/>
+        </w:rPr>
+        <w:t>auth</w:t>
+      </w:r>
+      <w:proofErr w:type="gramEnd"/>
+      <w:r>
+        <w:rPr>
+          <w:lang w:val="en-US"/>
+        </w:rPr>
+        <w:t xml:space="preserve"> - </w:t>
+      </w:r>
+      <w:proofErr w:type="spellStart"/>
+      <w:r>
+        <w:rPr>
+          <w:lang w:val="en-US"/>
+        </w:rPr>
+        <w:t>Extraer</w:t>
+      </w:r>
+      <w:proofErr w:type="spellEnd"/>
+      <w:r>
+        <w:rPr>
+          <w:lang w:val="en-US"/>
+        </w:rPr>
+        <w:t> </w:t>
+      </w:r>
+      <w:proofErr w:type="spellStart"/>
+      <w:proofErr w:type="gramStart"/>
+      <w:r>
+        <w:rPr>
+          <w:lang w:val="en-US"/>
+        </w:rPr>
+        <w:t>company</w:t>
+      </w:r>
+      <w:proofErr w:type="gramEnd"/>
+      <w:r>
+        <w:rPr>
+          <w:lang w:val="en-US"/>
+        </w:rPr>
+        <w:t>_id</w:t>
+      </w:r>
+      <w:proofErr w:type="spellEnd"/>
+      <w:r>
+        <w:rPr>
+          <w:lang w:val="en-US"/>
+        </w:rPr>
+        <w:t> del JWT Cognito</w:t>
+      </w:r>
+    </w:p>
+    <w:p>
+      <w:pPr>
+        <w:numPr>
+          <w:ilvl w:val="0"/>
+          <w:numId w:val="6"/>
+        </w:numPr>
+      </w:pPr>
+      <w:r>
+        <w:rPr>
+          <w:b/>
+          <w:bCs/>
+        </w:rPr>
+        <w:t xml:space="preserve">Conectar </w:t>
+      </w:r>
+      <w:proofErr w:type="spellStart"/>
+      <w:r>
+        <w:rPr>
+          <w:b/>
+          <w:bCs/>
+        </w:rPr>
+        <w:t>frontend</w:t>
+      </w:r>
+      <w:proofErr w:type="spellEnd"/>
+      <w:r>
+        <w:rPr>
+          <w:b/>
+          <w:bCs/>
+        </w:rPr>
+        <w:t xml:space="preserve"> a API real</w:t>
+      </w:r>
+      <w:r>
+        <w:t xml:space="preserve"> - Reemplazar datos </w:t>
+      </w:r>
+      <w:proofErr w:type="spellStart"/>
+      <w:r>
+        <w:t>mock</w:t>
+      </w:r>
+      <w:proofErr w:type="spellEnd"/>
+    </w:p>
+    <w:p>
+      <w:pPr>
+        <w:numPr>
+          <w:ilvl w:val="0"/>
+          <w:numId w:val="6"/>
+        </w:numPr>
+        <w:rPr>
+          <w:lang w:val="en-US"/>
+        </w:rPr>
+      </w:pPr>
+      <w:r>
+        <w:rPr>
+          <w:b/>
+          <w:bCs/>
+          <w:lang w:val="en-US"/>
+        </w:rPr>
+        <w:t>CRUD de Companies</w:t>
+      </w:r>
+      <w:r>
+        <w:rPr>
+          <w:lang w:val="en-US"/>
+        </w:rPr>
+        <w:t> - Company settings page</w:t>
+      </w:r>
+    </w:p>
+    <w:p>
+      <w:pPr>
+        <w:numPr>
+          <w:ilvl w:val="0"/>
+          <w:numId w:val="6"/>
+        </w:numPr>
+      </w:pPr>
+      <w:proofErr w:type="spellStart"/>
+      <w:r>
+        <w:rPr>
+          <w:b/>
+          <w:bCs/>
+        </w:rPr>
+        <w:t>Tests</w:t>
+      </w:r>
+      <w:proofErr w:type="spellEnd"/>
+      <w:r>
+        <w:rPr>
+          <w:b/>
+          <w:bCs/>
+        </w:rPr>
+        <w:t xml:space="preserve"> E2E de API </w:t>
+      </w:r>
+      <w:proofErr w:type="spellStart"/>
+      <w:r>
+        <w:rPr>
+          <w:b/>
+          <w:bCs/>
+        </w:rPr>
+        <w:t>Routes</w:t>
+      </w:r>
+      <w:proofErr w:type="spellEnd"/>
+    </w:p>
+    <w:p>
+      <w:pPr>
+        <w:numPr>
+          <w:ilvl w:val="0"/>
+          <w:numId w:val="6"/>
+        </w:numPr>
+      </w:pPr>
+      <w:r>
+        <w:rPr>
+          <w:b/>
+          <w:bCs/>
+        </w:rPr>
+        <w:t>Página /</w:t>
+      </w:r>
+      <w:proofErr w:type="spellStart"/>
+      <w:r>
+        <w:rPr>
+          <w:b/>
+          <w:bCs/>
+        </w:rPr>
+        <w:t>login</w:t>
+      </w:r>
+      <w:proofErr w:type="spellEnd"/>
+      <w:r>
+        <w:t xml:space="preserve"> - Flujo de autenticación con </w:t>
+      </w:r>
+      <w:proofErr w:type="spellStart"/>
+      <w:r>
+        <w:t>Cognito</w:t>
+      </w:r>
+      <w:proofErr w:type="spellEnd"/>
+    </w:p>
+    <w:p/>
+    <w:p/>
+    <w:p/>
+    <w:p/>
+    <w:p/>
+    <w:p>
+      <w:r>
+        <w:lastRenderedPageBreak/>
+        <w:t xml:space="preserve">El API Middleware de </w:t>
+      </w:r>
+      <w:r>
+        <w:rPr>
+          <w:b/>
+          <w:bCs/>
+        </w:rPr>
+        <w:t>autenticación</w:t>
+      </w:r>
+      <w:r>
+        <w:t xml:space="preserve"> quedó implementado y conectado al módulo de usuarios.</w:t>
+      </w:r>
+    </w:p>
+    <w:p>
+      <w:r>
+        <w:rPr>
+          <w:b/>
+          <w:bCs/>
+        </w:rPr>
+        <w:t>Qué implementé</w:t>
+      </w:r>
+    </w:p>
+    <w:p>
+      <w:pPr>
+        <w:numPr>
+          <w:ilvl w:val="0"/>
+          <w:numId w:val="7"/>
+        </w:numPr>
+        <w:rPr>
+          <w:lang w:val="en-US"/>
+        </w:rPr>
+      </w:pPr>
+      <w:r>
+        <w:rPr>
+          <w:lang w:val="en-US"/>
+        </w:rPr>
+        <w:t>Verificación JWT Cognito (firma + issuer + audience + claims custom):</w:t>
+      </w:r>
+      <w:r>
+        <w:rPr>
+          <w:lang w:val="en-US"/>
+        </w:rPr>
+        <w:br/>
+      </w:r>
+      <w:hyperlink r:id="rId20" w:history="1">
+        <w:r>
+          <w:rPr>
+            <w:rStyle w:val="Hipervnculo"/>
+            <w:lang w:val="en-US"/>
+          </w:rPr>
+          <w:t>cognito-jwt.ts</w:t>
+        </w:r>
+      </w:hyperlink>
+    </w:p>
+    <w:p>
+      <w:pPr>
+        <w:numPr>
+          <w:ilvl w:val="0"/>
+          <w:numId w:val="7"/>
+        </w:numPr>
+      </w:pPr>
+      <w:r>
+        <w:t xml:space="preserve">Contexto de </w:t>
+      </w:r>
+      <w:proofErr w:type="spellStart"/>
+      <w:r>
+        <w:t>auth</w:t>
+      </w:r>
+      <w:proofErr w:type="spellEnd"/>
+      <w:r>
+        <w:t xml:space="preserve"> tipado y errores de autenticación:</w:t>
+      </w:r>
+      <w:r>
+        <w:br/>
+      </w:r>
+      <w:hyperlink r:id="rId21" w:history="1">
+        <w:proofErr w:type="spellStart"/>
+        <w:r>
+          <w:rPr>
+            <w:rStyle w:val="Hipervnculo"/>
+          </w:rPr>
+          <w:t>auth.ts</w:t>
+        </w:r>
+        <w:proofErr w:type="spellEnd"/>
+      </w:hyperlink>
+    </w:p>
+    <w:p>
+      <w:pPr>
+        <w:numPr>
+          <w:ilvl w:val="0"/>
+          <w:numId w:val="7"/>
+        </w:numPr>
+      </w:pPr>
+      <w:r>
+        <w:t>Helper para leer contexto inyectado por middleware en rutas API:</w:t>
+      </w:r>
+      <w:r>
+        <w:br/>
+      </w:r>
+      <w:hyperlink r:id="rId22" w:history="1">
+        <w:proofErr w:type="spellStart"/>
+        <w:r>
+          <w:rPr>
+            <w:rStyle w:val="Hipervnculo"/>
+          </w:rPr>
+          <w:t>request-auth.ts</w:t>
+        </w:r>
+        <w:proofErr w:type="spellEnd"/>
+      </w:hyperlink>
+    </w:p>
+    <w:p>
+      <w:pPr>
+        <w:numPr>
+          <w:ilvl w:val="0"/>
+          <w:numId w:val="7"/>
+        </w:numPr>
+      </w:pPr>
+      <w:r>
+        <w:t>Middleware global de Next.js para /api/*:</w:t>
+      </w:r>
+    </w:p>
+    <w:p>
+      <w:pPr>
+        <w:numPr>
+          <w:ilvl w:val="0"/>
+          <w:numId w:val="8"/>
+        </w:numPr>
+        <w:rPr>
+          <w:lang w:val="en-US"/>
+        </w:rPr>
+      </w:pPr>
+      <w:r>
+        <w:rPr>
+          <w:lang w:val="en-US"/>
+        </w:rPr>
+        <w:t>Extrae token desde Authorization: Bearer ... o cookies</w:t>
+      </w:r>
+    </w:p>
+    <w:p>
+      <w:pPr>
+        <w:numPr>
+          <w:ilvl w:val="0"/>
+          <w:numId w:val="8"/>
+        </w:numPr>
+      </w:pPr>
+      <w:r>
+        <w:t xml:space="preserve">Verifica JWT contra JWKS de </w:t>
+      </w:r>
+      <w:proofErr w:type="spellStart"/>
+      <w:r>
+        <w:t>Cognito</w:t>
+      </w:r>
+      <w:proofErr w:type="spellEnd"/>
+    </w:p>
+    <w:p>
+      <w:pPr>
+        <w:numPr>
+          <w:ilvl w:val="0"/>
+          <w:numId w:val="8"/>
+        </w:numPr>
+        <w:rPr>
+          <w:lang w:val="en-US"/>
+        </w:rPr>
+      </w:pPr>
+      <w:r>
+        <w:rPr>
+          <w:lang w:val="en-US"/>
+        </w:rPr>
+        <w:t>Inyecta headers internos </w:t>
+      </w:r>
+      <w:hyperlink r:id="rId23" w:history="1">
+        <w:r>
+          <w:rPr>
+            <w:rStyle w:val="Hipervnculo"/>
+            <w:lang w:val="en-US"/>
+          </w:rPr>
+          <w:t>x-company-id</w:t>
+        </w:r>
+      </w:hyperlink>
+      <w:r>
+        <w:rPr>
+          <w:lang w:val="en-US"/>
+        </w:rPr>
+        <w:t>, </w:t>
+      </w:r>
+      <w:hyperlink r:id="rId24" w:history="1">
+        <w:r>
+          <w:rPr>
+            <w:rStyle w:val="Hipervnculo"/>
+            <w:lang w:val="en-US"/>
+          </w:rPr>
+          <w:t>x-user-id</w:t>
+        </w:r>
+      </w:hyperlink>
+      <w:r>
+        <w:rPr>
+          <w:lang w:val="en-US"/>
+        </w:rPr>
+        <w:t>, </w:t>
+      </w:r>
+      <w:hyperlink r:id="rId25" w:history="1">
+        <w:r>
+          <w:rPr>
+            <w:rStyle w:val="Hipervnculo"/>
+            <w:lang w:val="en-US"/>
+          </w:rPr>
+          <w:t>x-user-role</w:t>
+        </w:r>
+      </w:hyperlink>
+      <w:r>
+        <w:rPr>
+          <w:lang w:val="en-US"/>
+        </w:rPr>
+        <w:t>, etc.</w:t>
+      </w:r>
+      <w:r>
+        <w:rPr>
+          <w:lang w:val="en-US"/>
+        </w:rPr>
+        <w:br/>
+      </w:r>
+      <w:hyperlink r:id="rId26" w:history="1">
+        <w:r>
+          <w:rPr>
+            <w:rStyle w:val="Hipervnculo"/>
+            <w:lang w:val="en-US"/>
+          </w:rPr>
+          <w:t>middleware.ts</w:t>
+        </w:r>
+      </w:hyperlink>
+    </w:p>
+    <w:p>
+      <w:pPr>
+        <w:numPr>
+          <w:ilvl w:val="0"/>
+          <w:numId w:val="9"/>
+        </w:numPr>
+        <w:rPr>
+          <w:lang w:val="en-US"/>
+        </w:rPr>
+      </w:pPr>
+      <w:r>
+        <w:rPr>
+          <w:lang w:val="en-US"/>
+        </w:rPr>
+        <w:t>Integración en endpoints Core Users (elimina </w:t>
+      </w:r>
+      <w:hyperlink r:id="rId27" w:history="1">
+        <w:r>
+          <w:rPr>
+            <w:rStyle w:val="Hipervnculo"/>
+            <w:lang w:val="en-US"/>
+          </w:rPr>
+          <w:t>mock-company-id</w:t>
+        </w:r>
+      </w:hyperlink>
+      <w:r>
+        <w:rPr>
+          <w:lang w:val="en-US"/>
+        </w:rPr>
+        <w:t>):</w:t>
+      </w:r>
+      <w:r>
+        <w:rPr>
+          <w:lang w:val="en-US"/>
+        </w:rPr>
+        <w:br/>
+      </w:r>
+      <w:hyperlink r:id="rId28" w:history="1">
+        <w:proofErr w:type="spellStart"/>
+        <w:r>
+          <w:rPr>
+            <w:rStyle w:val="Hipervnculo"/>
+            <w:lang w:val="en-US"/>
+          </w:rPr>
+          <w:t>route.ts</w:t>
+        </w:r>
+        <w:proofErr w:type="spellEnd"/>
+      </w:hyperlink>
+      <w:r>
+        <w:rPr>
+          <w:lang w:val="en-US"/>
+        </w:rPr>
+        <w:br/>
+      </w:r>
+      <w:hyperlink r:id="rId29" w:history="1">
+        <w:r>
+          <w:rPr>
+            <w:rStyle w:val="Hipervnculo"/>
+            <w:lang w:val="en-US"/>
+          </w:rPr>
+          <w:t>src/app/api/v1/core/users/[id]/</w:t>
+        </w:r>
+        <w:proofErr w:type="spellStart"/>
+        <w:r>
+          <w:rPr>
+            <w:rStyle w:val="Hipervnculo"/>
+            <w:lang w:val="en-US"/>
+          </w:rPr>
+          <w:t>route.ts</w:t>
+        </w:r>
+        <w:proofErr w:type="spellEnd"/>
+      </w:hyperlink>
+    </w:p>
+    <w:p>
+      <w:pPr>
+        <w:numPr>
+          <w:ilvl w:val="0"/>
+          <w:numId w:val="9"/>
+        </w:numPr>
+      </w:pPr>
+      <w:r>
+        <w:t xml:space="preserve">Variables de entorno </w:t>
+      </w:r>
+      <w:proofErr w:type="spellStart"/>
+      <w:r>
+        <w:t>Cognito</w:t>
+      </w:r>
+      <w:proofErr w:type="spellEnd"/>
+      <w:r>
+        <w:t xml:space="preserve"> agregadas al validador server:</w:t>
+      </w:r>
+      <w:r>
+        <w:br/>
+      </w:r>
+      <w:hyperlink r:id="rId30" w:history="1">
+        <w:proofErr w:type="spellStart"/>
+        <w:r>
+          <w:rPr>
+            <w:rStyle w:val="Hipervnculo"/>
+          </w:rPr>
+          <w:t>env.ts</w:t>
+        </w:r>
+        <w:proofErr w:type="spellEnd"/>
+      </w:hyperlink>
+    </w:p>
+    <w:p>
+      <w:pPr>
+        <w:numPr>
+          <w:ilvl w:val="0"/>
+          <w:numId w:val="9"/>
+        </w:numPr>
+      </w:pPr>
+      <w:r>
+        <w:t>Dependencia para JWT:</w:t>
+      </w:r>
+      <w:r>
+        <w:br/>
+      </w:r>
+      <w:hyperlink r:id="rId31" w:history="1">
+        <w:proofErr w:type="spellStart"/>
+        <w:r>
+          <w:rPr>
+            <w:rStyle w:val="Hipervnculo"/>
+          </w:rPr>
+          <w:t>package.json</w:t>
+        </w:r>
+        <w:proofErr w:type="spellEnd"/>
+      </w:hyperlink>
+      <w:r>
+        <w:br/>
+      </w:r>
+      <w:hyperlink r:id="rId32" w:history="1">
+        <w:proofErr w:type="spellStart"/>
+        <w:r>
+          <w:rPr>
+            <w:rStyle w:val="Hipervnculo"/>
+          </w:rPr>
+          <w:t>package-lock.json</w:t>
+        </w:r>
+        <w:proofErr w:type="spellEnd"/>
+      </w:hyperlink>
+    </w:p>
+    <w:p>
+      <w:pPr>
+        <w:numPr>
+          <w:ilvl w:val="0"/>
+          <w:numId w:val="9"/>
+        </w:numPr>
+      </w:pPr>
+      <w:proofErr w:type="spellStart"/>
+      <w:r>
+        <w:t>Tests</w:t>
+      </w:r>
+      <w:proofErr w:type="spellEnd"/>
+      <w:r>
+        <w:t xml:space="preserve"> nuevos de </w:t>
+      </w:r>
+      <w:proofErr w:type="spellStart"/>
+      <w:r>
+        <w:t>auth</w:t>
+      </w:r>
+      <w:proofErr w:type="spellEnd"/>
+      <w:r>
+        <w:t>:</w:t>
+      </w:r>
+      <w:r>
+        <w:br/>
+      </w:r>
+      <w:hyperlink r:id="rId33" w:history="1">
+        <w:proofErr w:type="spellStart"/>
+        <w:r>
+          <w:rPr>
+            <w:rStyle w:val="Hipervnculo"/>
+          </w:rPr>
+          <w:t>cognito-jwt.test.ts</w:t>
+        </w:r>
+        <w:proofErr w:type="spellEnd"/>
+      </w:hyperlink>
+      <w:r>
+        <w:br/>
+      </w:r>
+      <w:hyperlink r:id="rId34" w:history="1">
+        <w:proofErr w:type="spellStart"/>
+        <w:r>
+          <w:rPr>
+            <w:rStyle w:val="Hipervnculo"/>
+          </w:rPr>
+          <w:t>request-auth.test.ts</w:t>
+        </w:r>
+        <w:proofErr w:type="spellEnd"/>
+      </w:hyperlink>
+    </w:p>
+    <w:p/>
+    <w:p/>
     <w:sectPr>
       <w:pgSz w:w="12240" w:h="15840"/>
       <w:pgMar w:top="1417" w:right="1701" w:bottom="1417" w:left="1701" w:header="708" w:footer="708" w:gutter="0"/>
@@ -5301,6 +6800,119 @@
 <file path=word/numbering.xml><?xml version="1.0" encoding="utf-8"?>
 <w:numbering xmlns:wpc="http://schemas.microsoft.com/office/word/2010/wordprocessingCanvas" xmlns:cx="http://schemas.microsoft.com/office/drawing/2014/chartex" xmlns:cx1="http://schemas.microsoft.com/office/drawing/2015/9/8/chartex" xmlns:cx2="http://schemas.microsoft.com/office/drawing/2015/10/21/chartex" xmlns:cx3="http://schemas.microsoft.com/office/drawing/2016/5/9/chartex" xmlns:cx4="http://schemas.microsoft.com/office/drawing/2016/5/10/chartex" xmlns:cx5="http://schemas.microsoft.com/office/drawing/2016/5/11/chartex" xmlns:cx6="http://schemas.microsoft.com/office/drawing/2016/5/12/chartex" xmlns:cx7="http://schemas.microsoft.com/office/drawing/2016/5/13/chartex" xmlns:cx8="http://schemas.microsoft.com/office/drawing/2016/5/14/chartex" xmlns:mc="http://schemas.openxmlformats.org/markup-compatibility/2006" xmlns:aink="http://schemas.microsoft.com/office/drawing/2016/ink" xmlns:am3d="http://schemas.microsoft.com/office/drawing/2017/model3d" xmlns:o="urn:schemas-microsoft-com:office:office" xmlns:oel="http://schemas.microsoft.com/office/2019/extlst" xmlns:r="http://schemas.openxmlformats.org/officeDocument/2006/relationships" xmlns:m="http://schemas.openxmlformats.org/officeDocument/2006/math" xmlns:v="urn:schemas-microsoft-com:vml" xmlns:wp14="http://schemas.microsoft.com/office/word/2010/wordprocessingDrawing" xmlns:wp="http://schemas.openxmlformats.org/drawingml/2006/wordprocessingDrawing" xmlns:w10="urn:schemas-microsoft-com:office:word" xmlns:w="http://schemas.openxmlformats.org/wordprocessingml/2006/main" xmlns:w14="http://schemas.microsoft.com/office/word/2010/wordml" xmlns:w15="http://schemas.microsoft.com/office/word/2012/wordml" xmlns:w16cex="http://schemas.microsoft.com/office/word/2018/wordml/cex" xmlns:w16cid="http://schemas.microsoft.com/office/word/2016/wordml/cid" xmlns:w16="http://schemas.microsoft.com/office/word/2018/wordml" xmlns:w16du="http://schemas.microsoft.com/office/word/2023/wordml/word16du" xmlns:w16sdtdh="http://schemas.microsoft.com/office/word/2020/wordml/sdtdatahash" xmlns:w16sdtfl="http://schemas.microsoft.com/office/word/2024/wordml/sdtformatlock" xmlns:w16se="http://schemas.microsoft.com/office/word/2015/wordml/symex" xmlns:wpg="http://schemas.microsoft.com/office/word/2010/wordprocessingGroup" xmlns:wpi="http://schemas.microsoft.com/office/word/2010/wordprocessingInk" xmlns:wne="http://schemas.microsoft.com/office/word/2006/wordml" xmlns:wps="http://schemas.microsoft.com/office/word/2010/wordprocessingShape" mc:Ignorable="w14 w15 w16se w16cid w16 w16cex w16sdtdh w16sdtfl w16du wp14">
   <w:abstractNum w:abstractNumId="0" w15:restartNumberingAfterBreak="0">
+    <w:nsid w:val="02B464AA"/>
+    <w:multiLevelType w:val="multilevel"/>
+    <w:tmpl w:val="5246B976"/>
+    <w:lvl w:ilvl="0">
+      <w:start w:val="1"/>
+      <w:numFmt w:val="decimal"/>
+      <w:lvlText w:val="%1."/>
+      <w:lvlJc w:val="left"/>
+      <w:pPr>
+        <w:tabs>
+          <w:tab w:val="num" w:pos="720"/>
+        </w:tabs>
+        <w:ind w:left="720" w:hanging="360"/>
+      </w:pPr>
+    </w:lvl>
+    <w:lvl w:ilvl="1" w:tentative="1">
+      <w:start w:val="1"/>
+      <w:numFmt w:val="decimal"/>
+      <w:lvlText w:val="%2."/>
+      <w:lvlJc w:val="left"/>
+      <w:pPr>
+        <w:tabs>
+          <w:tab w:val="num" w:pos="1440"/>
+        </w:tabs>
+        <w:ind w:left="1440" w:hanging="360"/>
+      </w:pPr>
+    </w:lvl>
+    <w:lvl w:ilvl="2" w:tentative="1">
+      <w:start w:val="1"/>
+      <w:numFmt w:val="decimal"/>
+      <w:lvlText w:val="%3."/>
+      <w:lvlJc w:val="left"/>
+      <w:pPr>
+        <w:tabs>
+          <w:tab w:val="num" w:pos="2160"/>
+        </w:tabs>
+        <w:ind w:left="2160" w:hanging="360"/>
+      </w:pPr>
+    </w:lvl>
+    <w:lvl w:ilvl="3" w:tentative="1">
+      <w:start w:val="1"/>
+      <w:numFmt w:val="decimal"/>
+      <w:lvlText w:val="%4."/>
+      <w:lvlJc w:val="left"/>
+      <w:pPr>
+        <w:tabs>
+          <w:tab w:val="num" w:pos="2880"/>
+        </w:tabs>
+        <w:ind w:left="2880" w:hanging="360"/>
+      </w:pPr>
+    </w:lvl>
+    <w:lvl w:ilvl="4" w:tentative="1">
+      <w:start w:val="1"/>
+      <w:numFmt w:val="decimal"/>
+      <w:lvlText w:val="%5."/>
+      <w:lvlJc w:val="left"/>
+      <w:pPr>
+        <w:tabs>
+          <w:tab w:val="num" w:pos="3600"/>
+        </w:tabs>
+        <w:ind w:left="3600" w:hanging="360"/>
+      </w:pPr>
+    </w:lvl>
+    <w:lvl w:ilvl="5" w:tentative="1">
+      <w:start w:val="1"/>
+      <w:numFmt w:val="decimal"/>
+      <w:lvlText w:val="%6."/>
+      <w:lvlJc w:val="left"/>
+      <w:pPr>
+        <w:tabs>
+          <w:tab w:val="num" w:pos="4320"/>
+        </w:tabs>
+        <w:ind w:left="4320" w:hanging="360"/>
+      </w:pPr>
+    </w:lvl>
+    <w:lvl w:ilvl="6" w:tentative="1">
+      <w:start w:val="1"/>
+      <w:numFmt w:val="decimal"/>
+      <w:lvlText w:val="%7."/>
+      <w:lvlJc w:val="left"/>
+      <w:pPr>
+        <w:tabs>
+          <w:tab w:val="num" w:pos="5040"/>
+        </w:tabs>
+        <w:ind w:left="5040" w:hanging="360"/>
+      </w:pPr>
+    </w:lvl>
+    <w:lvl w:ilvl="7" w:tentative="1">
+      <w:start w:val="1"/>
+      <w:numFmt w:val="decimal"/>
+      <w:lvlText w:val="%8."/>
+      <w:lvlJc w:val="left"/>
+      <w:pPr>
+        <w:tabs>
+          <w:tab w:val="num" w:pos="5760"/>
+        </w:tabs>
+        <w:ind w:left="5760" w:hanging="360"/>
+      </w:pPr>
+    </w:lvl>
+    <w:lvl w:ilvl="8" w:tentative="1">
+      <w:start w:val="1"/>
+      <w:numFmt w:val="decimal"/>
+      <w:lvlText w:val="%9."/>
+      <w:lvlJc w:val="left"/>
+      <w:pPr>
+        <w:tabs>
+          <w:tab w:val="num" w:pos="6480"/>
+        </w:tabs>
+        <w:ind w:left="6480" w:hanging="360"/>
+      </w:pPr>
+    </w:lvl>
+  </w:abstractNum>
+  <w:abstractNum w:abstractNumId="1" w15:restartNumberingAfterBreak="0">
     <w:nsid w:val="1366673E"/>
     <w:multiLevelType w:val="multilevel"/>
     <w:tmpl w:val="27823254"/>
@@ -5417,7 +7029,120 @@
       </w:pPr>
     </w:lvl>
   </w:abstractNum>
-  <w:abstractNum w:abstractNumId="1" w15:restartNumberingAfterBreak="0">
+  <w:abstractNum w:abstractNumId="2" w15:restartNumberingAfterBreak="0">
+    <w:nsid w:val="17CF1DFD"/>
+    <w:multiLevelType w:val="multilevel"/>
+    <w:tmpl w:val="49FE08C2"/>
+    <w:lvl w:ilvl="0">
+      <w:start w:val="1"/>
+      <w:numFmt w:val="decimal"/>
+      <w:lvlText w:val="%1."/>
+      <w:lvlJc w:val="left"/>
+      <w:pPr>
+        <w:tabs>
+          <w:tab w:val="num" w:pos="720"/>
+        </w:tabs>
+        <w:ind w:left="720" w:hanging="360"/>
+      </w:pPr>
+    </w:lvl>
+    <w:lvl w:ilvl="1" w:tentative="1">
+      <w:start w:val="1"/>
+      <w:numFmt w:val="decimal"/>
+      <w:lvlText w:val="%2."/>
+      <w:lvlJc w:val="left"/>
+      <w:pPr>
+        <w:tabs>
+          <w:tab w:val="num" w:pos="1440"/>
+        </w:tabs>
+        <w:ind w:left="1440" w:hanging="360"/>
+      </w:pPr>
+    </w:lvl>
+    <w:lvl w:ilvl="2" w:tentative="1">
+      <w:start w:val="1"/>
+      <w:numFmt w:val="decimal"/>
+      <w:lvlText w:val="%3."/>
+      <w:lvlJc w:val="left"/>
+      <w:pPr>
+        <w:tabs>
+          <w:tab w:val="num" w:pos="2160"/>
+        </w:tabs>
+        <w:ind w:left="2160" w:hanging="360"/>
+      </w:pPr>
+    </w:lvl>
+    <w:lvl w:ilvl="3" w:tentative="1">
+      <w:start w:val="1"/>
+      <w:numFmt w:val="decimal"/>
+      <w:lvlText w:val="%4."/>
+      <w:lvlJc w:val="left"/>
+      <w:pPr>
+        <w:tabs>
+          <w:tab w:val="num" w:pos="2880"/>
+        </w:tabs>
+        <w:ind w:left="2880" w:hanging="360"/>
+      </w:pPr>
+    </w:lvl>
+    <w:lvl w:ilvl="4" w:tentative="1">
+      <w:start w:val="1"/>
+      <w:numFmt w:val="decimal"/>
+      <w:lvlText w:val="%5."/>
+      <w:lvlJc w:val="left"/>
+      <w:pPr>
+        <w:tabs>
+          <w:tab w:val="num" w:pos="3600"/>
+        </w:tabs>
+        <w:ind w:left="3600" w:hanging="360"/>
+      </w:pPr>
+    </w:lvl>
+    <w:lvl w:ilvl="5" w:tentative="1">
+      <w:start w:val="1"/>
+      <w:numFmt w:val="decimal"/>
+      <w:lvlText w:val="%6."/>
+      <w:lvlJc w:val="left"/>
+      <w:pPr>
+        <w:tabs>
+          <w:tab w:val="num" w:pos="4320"/>
+        </w:tabs>
+        <w:ind w:left="4320" w:hanging="360"/>
+      </w:pPr>
+    </w:lvl>
+    <w:lvl w:ilvl="6" w:tentative="1">
+      <w:start w:val="1"/>
+      <w:numFmt w:val="decimal"/>
+      <w:lvlText w:val="%7."/>
+      <w:lvlJc w:val="left"/>
+      <w:pPr>
+        <w:tabs>
+          <w:tab w:val="num" w:pos="5040"/>
+        </w:tabs>
+        <w:ind w:left="5040" w:hanging="360"/>
+      </w:pPr>
+    </w:lvl>
+    <w:lvl w:ilvl="7" w:tentative="1">
+      <w:start w:val="1"/>
+      <w:numFmt w:val="decimal"/>
+      <w:lvlText w:val="%8."/>
+      <w:lvlJc w:val="left"/>
+      <w:pPr>
+        <w:tabs>
+          <w:tab w:val="num" w:pos="5760"/>
+        </w:tabs>
+        <w:ind w:left="5760" w:hanging="360"/>
+      </w:pPr>
+    </w:lvl>
+    <w:lvl w:ilvl="8" w:tentative="1">
+      <w:start w:val="1"/>
+      <w:numFmt w:val="decimal"/>
+      <w:lvlText w:val="%9."/>
+      <w:lvlJc w:val="left"/>
+      <w:pPr>
+        <w:tabs>
+          <w:tab w:val="num" w:pos="6480"/>
+        </w:tabs>
+        <w:ind w:left="6480" w:hanging="360"/>
+      </w:pPr>
+    </w:lvl>
+  </w:abstractNum>
+  <w:abstractNum w:abstractNumId="3" w15:restartNumberingAfterBreak="0">
     <w:nsid w:val="18872159"/>
     <w:multiLevelType w:val="multilevel"/>
     <w:tmpl w:val="21DA04DE"/>
@@ -5530,7 +7255,7 @@
       </w:pPr>
     </w:lvl>
   </w:abstractNum>
-  <w:abstractNum w:abstractNumId="2" w15:restartNumberingAfterBreak="0">
+  <w:abstractNum w:abstractNumId="4" w15:restartNumberingAfterBreak="0">
     <w:nsid w:val="3D9F31E0"/>
     <w:multiLevelType w:val="multilevel"/>
     <w:tmpl w:val="4088EC92"/>
@@ -5643,7 +7368,7 @@
       </w:pPr>
     </w:lvl>
   </w:abstractNum>
-  <w:abstractNum w:abstractNumId="3" w15:restartNumberingAfterBreak="0">
+  <w:abstractNum w:abstractNumId="5" w15:restartNumberingAfterBreak="0">
     <w:nsid w:val="46143C00"/>
     <w:multiLevelType w:val="multilevel"/>
     <w:tmpl w:val="05608E72"/>
@@ -5792,7 +7517,7 @@
       </w:rPr>
     </w:lvl>
   </w:abstractNum>
-  <w:abstractNum w:abstractNumId="4" w15:restartNumberingAfterBreak="0">
+  <w:abstractNum w:abstractNumId="6" w15:restartNumberingAfterBreak="0">
     <w:nsid w:val="4A9D2586"/>
     <w:multiLevelType w:val="multilevel"/>
     <w:tmpl w:val="72C4246C"/>
@@ -5941,20 +7666,294 @@
       </w:rPr>
     </w:lvl>
   </w:abstractNum>
+  <w:abstractNum w:abstractNumId="7" w15:restartNumberingAfterBreak="0">
+    <w:nsid w:val="64654211"/>
+    <w:multiLevelType w:val="multilevel"/>
+    <w:tmpl w:val="823818C0"/>
+    <w:lvl w:ilvl="0">
+      <w:start w:val="1"/>
+      <w:numFmt w:val="bullet"/>
+      <w:lvlText w:val=""/>
+      <w:lvlJc w:val="left"/>
+      <w:pPr>
+        <w:tabs>
+          <w:tab w:val="num" w:pos="720"/>
+        </w:tabs>
+        <w:ind w:left="720" w:hanging="360"/>
+      </w:pPr>
+      <w:rPr>
+        <w:rFonts w:ascii="Symbol" w:hAnsi="Symbol" w:hint="default"/>
+        <w:sz w:val="20"/>
+      </w:rPr>
+    </w:lvl>
+    <w:lvl w:ilvl="1" w:tentative="1">
+      <w:start w:val="1"/>
+      <w:numFmt w:val="bullet"/>
+      <w:lvlText w:val="o"/>
+      <w:lvlJc w:val="left"/>
+      <w:pPr>
+        <w:tabs>
+          <w:tab w:val="num" w:pos="1440"/>
+        </w:tabs>
+        <w:ind w:left="1440" w:hanging="360"/>
+      </w:pPr>
+      <w:rPr>
+        <w:rFonts w:ascii="Courier New" w:hAnsi="Courier New" w:hint="default"/>
+        <w:sz w:val="20"/>
+      </w:rPr>
+    </w:lvl>
+    <w:lvl w:ilvl="2" w:tentative="1">
+      <w:start w:val="1"/>
+      <w:numFmt w:val="bullet"/>
+      <w:lvlText w:val=""/>
+      <w:lvlJc w:val="left"/>
+      <w:pPr>
+        <w:tabs>
+          <w:tab w:val="num" w:pos="2160"/>
+        </w:tabs>
+        <w:ind w:left="2160" w:hanging="360"/>
+      </w:pPr>
+      <w:rPr>
+        <w:rFonts w:ascii="Wingdings" w:hAnsi="Wingdings" w:hint="default"/>
+        <w:sz w:val="20"/>
+      </w:rPr>
+    </w:lvl>
+    <w:lvl w:ilvl="3" w:tentative="1">
+      <w:start w:val="1"/>
+      <w:numFmt w:val="bullet"/>
+      <w:lvlText w:val=""/>
+      <w:lvlJc w:val="left"/>
+      <w:pPr>
+        <w:tabs>
+          <w:tab w:val="num" w:pos="2880"/>
+        </w:tabs>
+        <w:ind w:left="2880" w:hanging="360"/>
+      </w:pPr>
+      <w:rPr>
+        <w:rFonts w:ascii="Wingdings" w:hAnsi="Wingdings" w:hint="default"/>
+        <w:sz w:val="20"/>
+      </w:rPr>
+    </w:lvl>
+    <w:lvl w:ilvl="4" w:tentative="1">
+      <w:start w:val="1"/>
+      <w:numFmt w:val="bullet"/>
+      <w:lvlText w:val=""/>
+      <w:lvlJc w:val="left"/>
+      <w:pPr>
+        <w:tabs>
+          <w:tab w:val="num" w:pos="3600"/>
+        </w:tabs>
+        <w:ind w:left="3600" w:hanging="360"/>
+      </w:pPr>
+      <w:rPr>
+        <w:rFonts w:ascii="Wingdings" w:hAnsi="Wingdings" w:hint="default"/>
+        <w:sz w:val="20"/>
+      </w:rPr>
+    </w:lvl>
+    <w:lvl w:ilvl="5" w:tentative="1">
+      <w:start w:val="1"/>
+      <w:numFmt w:val="bullet"/>
+      <w:lvlText w:val=""/>
+      <w:lvlJc w:val="left"/>
+      <w:pPr>
+        <w:tabs>
+          <w:tab w:val="num" w:pos="4320"/>
+        </w:tabs>
+        <w:ind w:left="4320" w:hanging="360"/>
+      </w:pPr>
+      <w:rPr>
+        <w:rFonts w:ascii="Wingdings" w:hAnsi="Wingdings" w:hint="default"/>
+        <w:sz w:val="20"/>
+      </w:rPr>
+    </w:lvl>
+    <w:lvl w:ilvl="6" w:tentative="1">
+      <w:start w:val="1"/>
+      <w:numFmt w:val="bullet"/>
+      <w:lvlText w:val=""/>
+      <w:lvlJc w:val="left"/>
+      <w:pPr>
+        <w:tabs>
+          <w:tab w:val="num" w:pos="5040"/>
+        </w:tabs>
+        <w:ind w:left="5040" w:hanging="360"/>
+      </w:pPr>
+      <w:rPr>
+        <w:rFonts w:ascii="Wingdings" w:hAnsi="Wingdings" w:hint="default"/>
+        <w:sz w:val="20"/>
+      </w:rPr>
+    </w:lvl>
+    <w:lvl w:ilvl="7" w:tentative="1">
+      <w:start w:val="1"/>
+      <w:numFmt w:val="bullet"/>
+      <w:lvlText w:val=""/>
+      <w:lvlJc w:val="left"/>
+      <w:pPr>
+        <w:tabs>
+          <w:tab w:val="num" w:pos="5760"/>
+        </w:tabs>
+        <w:ind w:left="5760" w:hanging="360"/>
+      </w:pPr>
+      <w:rPr>
+        <w:rFonts w:ascii="Wingdings" w:hAnsi="Wingdings" w:hint="default"/>
+        <w:sz w:val="20"/>
+      </w:rPr>
+    </w:lvl>
+    <w:lvl w:ilvl="8" w:tentative="1">
+      <w:start w:val="1"/>
+      <w:numFmt w:val="bullet"/>
+      <w:lvlText w:val=""/>
+      <w:lvlJc w:val="left"/>
+      <w:pPr>
+        <w:tabs>
+          <w:tab w:val="num" w:pos="6480"/>
+        </w:tabs>
+        <w:ind w:left="6480" w:hanging="360"/>
+      </w:pPr>
+      <w:rPr>
+        <w:rFonts w:ascii="Wingdings" w:hAnsi="Wingdings" w:hint="default"/>
+        <w:sz w:val="20"/>
+      </w:rPr>
+    </w:lvl>
+  </w:abstractNum>
+  <w:abstractNum w:abstractNumId="8" w15:restartNumberingAfterBreak="0">
+    <w:nsid w:val="7D027B65"/>
+    <w:multiLevelType w:val="multilevel"/>
+    <w:tmpl w:val="52D053EE"/>
+    <w:lvl w:ilvl="0">
+      <w:start w:val="5"/>
+      <w:numFmt w:val="decimal"/>
+      <w:lvlText w:val="%1."/>
+      <w:lvlJc w:val="left"/>
+      <w:pPr>
+        <w:tabs>
+          <w:tab w:val="num" w:pos="720"/>
+        </w:tabs>
+        <w:ind w:left="720" w:hanging="360"/>
+      </w:pPr>
+    </w:lvl>
+    <w:lvl w:ilvl="1" w:tentative="1">
+      <w:start w:val="1"/>
+      <w:numFmt w:val="decimal"/>
+      <w:lvlText w:val="%2."/>
+      <w:lvlJc w:val="left"/>
+      <w:pPr>
+        <w:tabs>
+          <w:tab w:val="num" w:pos="1440"/>
+        </w:tabs>
+        <w:ind w:left="1440" w:hanging="360"/>
+      </w:pPr>
+    </w:lvl>
+    <w:lvl w:ilvl="2" w:tentative="1">
+      <w:start w:val="1"/>
+      <w:numFmt w:val="decimal"/>
+      <w:lvlText w:val="%3."/>
+      <w:lvlJc w:val="left"/>
+      <w:pPr>
+        <w:tabs>
+          <w:tab w:val="num" w:pos="2160"/>
+        </w:tabs>
+        <w:ind w:left="2160" w:hanging="360"/>
+      </w:pPr>
+    </w:lvl>
+    <w:lvl w:ilvl="3" w:tentative="1">
+      <w:start w:val="1"/>
+      <w:numFmt w:val="decimal"/>
+      <w:lvlText w:val="%4."/>
+      <w:lvlJc w:val="left"/>
+      <w:pPr>
+        <w:tabs>
+          <w:tab w:val="num" w:pos="2880"/>
+        </w:tabs>
+        <w:ind w:left="2880" w:hanging="360"/>
+      </w:pPr>
+    </w:lvl>
+    <w:lvl w:ilvl="4" w:tentative="1">
+      <w:start w:val="1"/>
+      <w:numFmt w:val="decimal"/>
+      <w:lvlText w:val="%5."/>
+      <w:lvlJc w:val="left"/>
+      <w:pPr>
+        <w:tabs>
+          <w:tab w:val="num" w:pos="3600"/>
+        </w:tabs>
+        <w:ind w:left="3600" w:hanging="360"/>
+      </w:pPr>
+    </w:lvl>
+    <w:lvl w:ilvl="5" w:tentative="1">
+      <w:start w:val="1"/>
+      <w:numFmt w:val="decimal"/>
+      <w:lvlText w:val="%6."/>
+      <w:lvlJc w:val="left"/>
+      <w:pPr>
+        <w:tabs>
+          <w:tab w:val="num" w:pos="4320"/>
+        </w:tabs>
+        <w:ind w:left="4320" w:hanging="360"/>
+      </w:pPr>
+    </w:lvl>
+    <w:lvl w:ilvl="6" w:tentative="1">
+      <w:start w:val="1"/>
+      <w:numFmt w:val="decimal"/>
+      <w:lvlText w:val="%7."/>
+      <w:lvlJc w:val="left"/>
+      <w:pPr>
+        <w:tabs>
+          <w:tab w:val="num" w:pos="5040"/>
+        </w:tabs>
+        <w:ind w:left="5040" w:hanging="360"/>
+      </w:pPr>
+    </w:lvl>
+    <w:lvl w:ilvl="7" w:tentative="1">
+      <w:start w:val="1"/>
+      <w:numFmt w:val="decimal"/>
+      <w:lvlText w:val="%8."/>
+      <w:lvlJc w:val="left"/>
+      <w:pPr>
+        <w:tabs>
+          <w:tab w:val="num" w:pos="5760"/>
+        </w:tabs>
+        <w:ind w:left="5760" w:hanging="360"/>
+      </w:pPr>
+    </w:lvl>
+    <w:lvl w:ilvl="8" w:tentative="1">
+      <w:start w:val="1"/>
+      <w:numFmt w:val="decimal"/>
+      <w:lvlText w:val="%9."/>
+      <w:lvlJc w:val="left"/>
+      <w:pPr>
+        <w:tabs>
+          <w:tab w:val="num" w:pos="6480"/>
+        </w:tabs>
+        <w:ind w:left="6480" w:hanging="360"/>
+      </w:pPr>
+    </w:lvl>
+  </w:abstractNum>
   <w:num w:numId="1" w16cid:durableId="349915752">
+    <w:abstractNumId w:val="3"/>
+  </w:num>
+  <w:num w:numId="2" w16cid:durableId="552040752">
+    <w:abstractNumId w:val="4"/>
+  </w:num>
+  <w:num w:numId="3" w16cid:durableId="227307605">
+    <w:abstractNumId w:val="5"/>
+  </w:num>
+  <w:num w:numId="4" w16cid:durableId="1112020264">
+    <w:abstractNumId w:val="6"/>
+  </w:num>
+  <w:num w:numId="5" w16cid:durableId="571740311">
     <w:abstractNumId w:val="1"/>
   </w:num>
-  <w:num w:numId="2" w16cid:durableId="552040752">
+  <w:num w:numId="6" w16cid:durableId="512183514">
     <w:abstractNumId w:val="2"/>
   </w:num>
-  <w:num w:numId="3" w16cid:durableId="227307605">
-    <w:abstractNumId w:val="3"/>
+  <w:num w:numId="7" w16cid:durableId="1207991176">
+    <w:abstractNumId w:val="0"/>
   </w:num>
-  <w:num w:numId="4" w16cid:durableId="1112020264">
-    <w:abstractNumId w:val="4"/>
+  <w:num w:numId="8" w16cid:durableId="1590767705">
+    <w:abstractNumId w:val="7"/>
   </w:num>
-  <w:num w:numId="5" w16cid:durableId="571740311">
-    <w:abstractNumId w:val="0"/>
+  <w:num w:numId="9" w16cid:durableId="546142853">
+    <w:abstractNumId w:val="8"/>
   </w:num>
 </w:numbering>
 </file>
@@ -6387,7 +8386,6 @@
     <w:next w:val="Normal"/>
     <w:link w:val="Ttulo2Car"/>
     <w:uiPriority w:val="9"/>
-    <w:semiHidden/>
     <w:unhideWhenUsed/>
     <w:qFormat/>
     <w:rsid w:val="00767B71"/>
@@ -6602,7 +8600,6 @@
     <w:basedOn w:val="Fuentedeprrafopredeter"/>
     <w:link w:val="Ttulo2"/>
     <w:uiPriority w:val="9"/>
-    <w:semiHidden/>
     <w:rsid w:val="00767B71"/>
     <w:rPr>
       <w:rFonts w:asciiTheme="majorHAnsi" w:eastAsiaTheme="majorEastAsia" w:hAnsiTheme="majorHAnsi" w:cstheme="majorBidi"/>

</xml_diff>

<commit_message>
chore: guardar cambios actuales del proyecto
</commit_message>
<xml_diff>
--- a/FASES DE DESARROLLO NEXO.docx
+++ b/FASES DE DESARROLLO NEXO.docx
@@ -5,6 +5,18 @@
     <w:p>
       <w:r>
         <w:t>FASES DE DESARROLLO NEXO-ERP</w:t>
+      </w:r>
+      <w:r>
+        <w:t xml:space="preserve"> </w:t>
+      </w:r>
+      <w:r>
+        <w:t xml:space="preserve">  MCP, SKILL, AGENTES</w:t>
+      </w:r>
+      <w:r>
+        <w:t>, SCRUM</w:t>
+      </w:r>
+      <w:r>
+        <w:t xml:space="preserve">, ciclo </w:t>
       </w:r>
     </w:p>
     <w:p/>
@@ -157,23 +169,7 @@
         <w:t>Prisma 6 Multi-File Schema</w:t>
       </w:r>
       <w:r>
-        <w:t> con </w:t>
-      </w:r>
-      <w:proofErr w:type="spellStart"/>
-      <w:r>
-        <w:t>previewFeatures</w:t>
-      </w:r>
-      <w:proofErr w:type="spellEnd"/>
-      <w:r>
-        <w:t>: ["</w:t>
-      </w:r>
-      <w:proofErr w:type="spellStart"/>
-      <w:r>
-        <w:t>prismaSchemaFolder</w:t>
-      </w:r>
-      <w:proofErr w:type="spellEnd"/>
-      <w:r>
-        <w:t>"]</w:t>
+        <w:t> con previewFeatures: ["prismaSchemaFolder"]</w:t>
       </w:r>
     </w:p>
     <w:p>
@@ -197,35 +193,10 @@
           <w:b/>
           <w:bCs/>
         </w:rPr>
-        <w:t xml:space="preserve">Prisma Client </w:t>
-      </w:r>
-      <w:proofErr w:type="spellStart"/>
-      <w:r>
-        <w:rPr>
-          <w:b/>
-          <w:bCs/>
-        </w:rPr>
-        <w:t>Extension</w:t>
-      </w:r>
-      <w:proofErr w:type="spellEnd"/>
-      <w:r>
-        <w:t xml:space="preserve"> para </w:t>
-      </w:r>
-      <w:proofErr w:type="spellStart"/>
-      <w:r>
-        <w:t>auto-inject</w:t>
-      </w:r>
-      <w:proofErr w:type="spellEnd"/>
-      <w:r>
-        <w:t> </w:t>
-      </w:r>
-      <w:proofErr w:type="spellStart"/>
-      <w:r>
-        <w:t>company_id</w:t>
-      </w:r>
-      <w:proofErr w:type="spellEnd"/>
-      <w:r>
-        <w:t> (Capa 2 de aislamiento)</w:t>
+        <w:t>Prisma Client Extension</w:t>
+      </w:r>
+      <w:r>
+        <w:t> para auto-inject company_id (Capa 2 de aislamiento)</w:t>
       </w:r>
     </w:p>
     <w:p>
@@ -244,37 +215,12 @@
       <w:r>
         <w:t> </w:t>
       </w:r>
-      <w:proofErr w:type="spellStart"/>
       <w:r>
         <w:rPr>
           <w:b/>
           <w:bCs/>
         </w:rPr>
-        <w:t>User.id</w:t>
-      </w:r>
-      <w:proofErr w:type="spellEnd"/>
-      <w:r>
-        <w:rPr>
-          <w:b/>
-          <w:bCs/>
-        </w:rPr>
-        <w:t xml:space="preserve"> = </w:t>
-      </w:r>
-      <w:proofErr w:type="spellStart"/>
-      <w:r>
-        <w:rPr>
-          <w:b/>
-          <w:bCs/>
-        </w:rPr>
-        <w:t>Cognito</w:t>
-      </w:r>
-      <w:proofErr w:type="spellEnd"/>
-      <w:r>
-        <w:rPr>
-          <w:b/>
-          <w:bCs/>
-        </w:rPr>
-        <w:t xml:space="preserve"> sub</w:t>
+        <w:t>User.id = Cognito sub</w:t>
       </w:r>
       <w:r>
         <w:t> (sin UUID auto, sincronización directa)</w:t>
@@ -296,41 +242,15 @@
       <w:r>
         <w:t> </w:t>
       </w:r>
-      <w:proofErr w:type="spellStart"/>
       <w:r>
         <w:rPr>
           <w:b/>
           <w:bCs/>
         </w:rPr>
-        <w:t>Soft</w:t>
-      </w:r>
-      <w:proofErr w:type="spellEnd"/>
-      <w:r>
-        <w:rPr>
-          <w:b/>
-          <w:bCs/>
-        </w:rPr>
-        <w:t xml:space="preserve"> </w:t>
-      </w:r>
-      <w:proofErr w:type="spellStart"/>
-      <w:r>
-        <w:rPr>
-          <w:b/>
-          <w:bCs/>
-        </w:rPr>
-        <w:t>delete</w:t>
-      </w:r>
-      <w:proofErr w:type="spellEnd"/>
-      <w:r>
-        <w:t> en todos los modelos (</w:t>
-      </w:r>
-      <w:proofErr w:type="spellStart"/>
-      <w:r>
-        <w:t>is_active</w:t>
-      </w:r>
-      <w:proofErr w:type="spellEnd"/>
-      <w:r>
-        <w:t>: false) para auditoría</w:t>
+        <w:t>Soft delete</w:t>
+      </w:r>
+      <w:r>
+        <w:t> en todos los modelos (is_active: false) para auditoría</w:t>
       </w:r>
     </w:p>
     <w:p>
@@ -357,15 +277,7 @@
         <w:t>Índices compuestos</w:t>
       </w:r>
       <w:r>
-        <w:t> con </w:t>
-      </w:r>
-      <w:proofErr w:type="spellStart"/>
-      <w:r>
-        <w:t>company_id</w:t>
-      </w:r>
-      <w:proofErr w:type="spellEnd"/>
-      <w:r>
-        <w:t> SIEMPRE primero</w:t>
+        <w:t> con company_id SIEMPRE primero</w:t>
       </w:r>
     </w:p>
     <w:p>
@@ -391,81 +303,19 @@
         </w:rPr>
         <w:t> </w:t>
       </w:r>
-      <w:proofErr w:type="spellStart"/>
       <w:r>
         <w:rPr>
           <w:b/>
           <w:bCs/>
           <w:lang w:val="en-US"/>
         </w:rPr>
-        <w:t>Validación</w:t>
-      </w:r>
-      <w:proofErr w:type="spellEnd"/>
-      <w:r>
-        <w:rPr>
-          <w:b/>
-          <w:bCs/>
-          <w:lang w:val="en-US"/>
-        </w:rPr>
-        <w:t> </w:t>
-      </w:r>
-      <w:proofErr w:type="spellStart"/>
-      <w:r>
-        <w:rPr>
-          <w:b/>
-          <w:bCs/>
-          <w:lang w:val="en-US"/>
-        </w:rPr>
-        <w:t>max_users</w:t>
-      </w:r>
-      <w:proofErr w:type="spellEnd"/>
-      <w:r>
-        <w:rPr>
-          <w:lang w:val="en-US"/>
-        </w:rPr>
-        <w:t> </w:t>
-      </w:r>
-      <w:proofErr w:type="spellStart"/>
-      <w:r>
-        <w:rPr>
-          <w:lang w:val="en-US"/>
-        </w:rPr>
-        <w:t>en</w:t>
-      </w:r>
-      <w:proofErr w:type="spellEnd"/>
-      <w:r>
-        <w:rPr>
-          <w:lang w:val="en-US"/>
-        </w:rPr>
-        <w:t xml:space="preserve"> 3 </w:t>
-      </w:r>
-      <w:proofErr w:type="spellStart"/>
-      <w:r>
-        <w:rPr>
-          <w:lang w:val="en-US"/>
-        </w:rPr>
-        <w:t>capas</w:t>
-      </w:r>
-      <w:proofErr w:type="spellEnd"/>
-      <w:r>
-        <w:rPr>
-          <w:lang w:val="en-US"/>
-        </w:rPr>
-        <w:t xml:space="preserve"> (frontend warning + API check + DB trigger </w:t>
-      </w:r>
-      <w:proofErr w:type="spellStart"/>
-      <w:r>
-        <w:rPr>
-          <w:lang w:val="en-US"/>
-        </w:rPr>
-        <w:t>opcional</w:t>
-      </w:r>
-      <w:proofErr w:type="spellEnd"/>
-      <w:r>
-        <w:rPr>
-          <w:lang w:val="en-US"/>
-        </w:rPr>
-        <w:t>)</w:t>
+        <w:t>Validación max_users</w:t>
+      </w:r>
+      <w:r>
+        <w:rPr>
+          <w:lang w:val="en-US"/>
+        </w:rPr>
+        <w:t> en 3 capas (frontend warning + API check + DB trigger opcional)</w:t>
       </w:r>
     </w:p>
     <w:p>
@@ -489,35 +339,10 @@
           <w:b/>
           <w:bCs/>
         </w:rPr>
-        <w:t xml:space="preserve">Sincronización </w:t>
-      </w:r>
-      <w:proofErr w:type="spellStart"/>
-      <w:r>
-        <w:rPr>
-          <w:b/>
-          <w:bCs/>
-        </w:rPr>
-        <w:t>Cognito→Prisma</w:t>
-      </w:r>
-      <w:proofErr w:type="spellEnd"/>
-      <w:r>
-        <w:t> </w:t>
-      </w:r>
-      <w:proofErr w:type="spellStart"/>
-      <w:r>
-        <w:t>via</w:t>
-      </w:r>
-      <w:proofErr w:type="spellEnd"/>
-      <w:r>
-        <w:t xml:space="preserve"> Lambda </w:t>
-      </w:r>
-      <w:proofErr w:type="spellStart"/>
-      <w:r>
-        <w:t>PostConfirmation</w:t>
-      </w:r>
-      <w:proofErr w:type="spellEnd"/>
-      <w:r>
-        <w:t xml:space="preserve"> (Fase 1)</w:t>
+        <w:t>Sincronización Cognito→Prisma</w:t>
+      </w:r>
+      <w:r>
+        <w:t> via Lambda PostConfirmation (Fase 1)</w:t>
       </w:r>
     </w:p>
     <w:p>
@@ -594,17 +419,8 @@
           <w:b/>
           <w:bCs/>
         </w:rPr>
-        <w:t xml:space="preserve">RLS </w:t>
-      </w:r>
-      <w:proofErr w:type="spellStart"/>
-      <w:r>
-        <w:rPr>
-          <w:b/>
-          <w:bCs/>
-        </w:rPr>
-        <w:t>Policies</w:t>
-      </w:r>
-      <w:proofErr w:type="spellEnd"/>
+        <w:t>RLS Policies</w:t>
+      </w:r>
       <w:r>
         <w:t> en 4 tipos (SELECT, INSERT, UPDATE, DELETE) para TODAS las tablas de negocio</w:t>
       </w:r>
@@ -630,27 +446,10 @@
           <w:b/>
           <w:bCs/>
         </w:rPr>
-        <w:t xml:space="preserve">Índices </w:t>
-      </w:r>
-      <w:proofErr w:type="spellStart"/>
-      <w:r>
-        <w:rPr>
-          <w:b/>
-          <w:bCs/>
-        </w:rPr>
-        <w:t>multi-tenant</w:t>
-      </w:r>
-      <w:proofErr w:type="spellEnd"/>
-      <w:r>
-        <w:t> con regla de oro: </w:t>
-      </w:r>
-      <w:proofErr w:type="spellStart"/>
-      <w:r>
-        <w:t>company_id</w:t>
-      </w:r>
-      <w:proofErr w:type="spellEnd"/>
-      <w:r>
-        <w:t> primer campo</w:t>
+        <w:t>Índices multi-tenant</w:t>
+      </w:r>
+      <w:r>
+        <w:t> con regla de oro: company_id primer campo</w:t>
       </w:r>
     </w:p>
     <w:p>
@@ -688,35 +487,7 @@
         <w:rPr>
           <w:lang w:val="en-US"/>
         </w:rPr>
-        <w:t xml:space="preserve"> para queries </w:t>
-      </w:r>
-      <w:proofErr w:type="spellStart"/>
-      <w:r>
-        <w:rPr>
-          <w:lang w:val="en-US"/>
-        </w:rPr>
-        <w:t>comunes</w:t>
-      </w:r>
-      <w:proofErr w:type="spellEnd"/>
-      <w:r>
-        <w:rPr>
-          <w:lang w:val="en-US"/>
-        </w:rPr>
-        <w:t xml:space="preserve">: WHERE </w:t>
-      </w:r>
-      <w:proofErr w:type="spellStart"/>
-      <w:r>
-        <w:rPr>
-          <w:lang w:val="en-US"/>
-        </w:rPr>
-        <w:t>is_active</w:t>
-      </w:r>
-      <w:proofErr w:type="spellEnd"/>
-      <w:r>
-        <w:rPr>
-          <w:lang w:val="en-US"/>
-        </w:rPr>
-        <w:t xml:space="preserve"> = true</w:t>
+        <w:t> para queries comunes: WHERE is_active = true</w:t>
       </w:r>
     </w:p>
     <w:p>
@@ -754,63 +525,7 @@
         <w:rPr>
           <w:lang w:val="en-US"/>
         </w:rPr>
-        <w:t> </w:t>
-      </w:r>
-      <w:proofErr w:type="spellStart"/>
-      <w:r>
-        <w:rPr>
-          <w:lang w:val="en-US"/>
-        </w:rPr>
-        <w:t>en</w:t>
-      </w:r>
-      <w:proofErr w:type="spellEnd"/>
-      <w:r>
-        <w:rPr>
-          <w:lang w:val="en-US"/>
-        </w:rPr>
-        <w:t> </w:t>
-      </w:r>
-      <w:proofErr w:type="spellStart"/>
-      <w:r>
-        <w:rPr>
-          <w:lang w:val="en-US"/>
-        </w:rPr>
-        <w:t>audit_</w:t>
-      </w:r>
-      <w:proofErr w:type="gramStart"/>
-      <w:r>
-        <w:rPr>
-          <w:lang w:val="en-US"/>
-        </w:rPr>
-        <w:t>logs.created</w:t>
-      </w:r>
-      <w:proofErr w:type="gramEnd"/>
-      <w:r>
-        <w:rPr>
-          <w:lang w:val="en-US"/>
-        </w:rPr>
-        <w:t>_at</w:t>
-      </w:r>
-      <w:proofErr w:type="spellEnd"/>
-      <w:r>
-        <w:rPr>
-          <w:lang w:val="en-US"/>
-        </w:rPr>
-        <w:t xml:space="preserve"> (append-only, alto </w:t>
-      </w:r>
-      <w:proofErr w:type="spellStart"/>
-      <w:r>
-        <w:rPr>
-          <w:lang w:val="en-US"/>
-        </w:rPr>
-        <w:t>volumen</w:t>
-      </w:r>
-      <w:proofErr w:type="spellEnd"/>
-      <w:r>
-        <w:rPr>
-          <w:lang w:val="en-US"/>
-        </w:rPr>
-        <w:t>)</w:t>
+        <w:t> en audit_logs.created_at (append-only, alto volumen)</w:t>
       </w:r>
     </w:p>
     <w:p>
@@ -838,31 +553,7 @@
         <w:t>RDS Proxy obligatorio</w:t>
       </w:r>
       <w:r>
-        <w:t> para Lambda/</w:t>
-      </w:r>
-      <w:proofErr w:type="spellStart"/>
-      <w:r>
-        <w:t>Amplify</w:t>
-      </w:r>
-      <w:proofErr w:type="spellEnd"/>
-      <w:r>
-        <w:t xml:space="preserve"> (</w:t>
-      </w:r>
-      <w:proofErr w:type="spellStart"/>
-      <w:r>
-        <w:t>connection</w:t>
-      </w:r>
-      <w:proofErr w:type="spellEnd"/>
-      <w:r>
-        <w:t xml:space="preserve"> </w:t>
-      </w:r>
-      <w:proofErr w:type="spellStart"/>
-      <w:r>
-        <w:t>pooling</w:t>
-      </w:r>
-      <w:proofErr w:type="spellEnd"/>
-      <w:r>
-        <w:t>)</w:t>
+        <w:t> para Lambda/Amplify (connection pooling)</w:t>
       </w:r>
     </w:p>
     <w:p>
@@ -900,21 +591,7 @@
         <w:rPr>
           <w:lang w:val="en-US"/>
         </w:rPr>
-        <w:t> CloudWatch + </w:t>
-      </w:r>
-      <w:proofErr w:type="spellStart"/>
-      <w:r>
-        <w:rPr>
-          <w:lang w:val="en-US"/>
-        </w:rPr>
-        <w:t>pg_stat_statements</w:t>
-      </w:r>
-      <w:proofErr w:type="spellEnd"/>
-      <w:r>
-        <w:rPr>
-          <w:lang w:val="en-US"/>
-        </w:rPr>
-        <w:t> + slow query alerts</w:t>
+        <w:t> CloudWatch + pg_stat_statements + slow query alerts</w:t>
       </w:r>
     </w:p>
     <w:p>
@@ -1191,15 +868,7 @@
           </w:tcPr>
           <w:p>
             <w:r>
-              <w:t xml:space="preserve">Docker </w:t>
-            </w:r>
-            <w:proofErr w:type="spellStart"/>
-            <w:r>
-              <w:t>Compose</w:t>
-            </w:r>
-            <w:proofErr w:type="spellEnd"/>
-            <w:r>
-              <w:t xml:space="preserve"> PostgreSQL 16</w:t>
+              <w:t>Docker Compose PostgreSQL 16</w:t>
             </w:r>
           </w:p>
         </w:tc>
@@ -1323,13 +992,8 @@
           </w:tcPr>
           <w:p>
             <w:r>
-              <w:t xml:space="preserve">Instalar Prisma 6 + </w:t>
-            </w:r>
-            <w:proofErr w:type="spellStart"/>
-            <w:r>
-              <w:t>deps</w:t>
-            </w:r>
-            <w:proofErr w:type="spellEnd"/>
+              <w:t>Instalar Prisma 6 + deps</w:t>
+            </w:r>
           </w:p>
         </w:tc>
         <w:tc>
@@ -1452,15 +1116,7 @@
           </w:tcPr>
           <w:p>
             <w:r>
-              <w:t xml:space="preserve">Schema: Company + </w:t>
-            </w:r>
-            <w:proofErr w:type="spellStart"/>
-            <w:r>
-              <w:t>User</w:t>
-            </w:r>
-            <w:proofErr w:type="spellEnd"/>
-            <w:r>
-              <w:t xml:space="preserve"> + Auditoría</w:t>
+              <w:t>Schema: Company + User + Auditoría</w:t>
             </w:r>
           </w:p>
         </w:tc>
@@ -1584,13 +1240,8 @@
           </w:tcPr>
           <w:p>
             <w:r>
-              <w:t xml:space="preserve">Primera migración + </w:t>
-            </w:r>
-            <w:proofErr w:type="spellStart"/>
-            <w:r>
-              <w:t>seed</w:t>
-            </w:r>
-            <w:proofErr w:type="spellEnd"/>
+              <w:t>Primera migración + seed</w:t>
+            </w:r>
           </w:p>
         </w:tc>
         <w:tc>
@@ -1713,13 +1364,8 @@
           </w:tcPr>
           <w:p>
             <w:r>
-              <w:t xml:space="preserve">Prisma Client </w:t>
-            </w:r>
-            <w:proofErr w:type="spellStart"/>
-            <w:r>
-              <w:t>singleton</w:t>
-            </w:r>
-            <w:proofErr w:type="spellEnd"/>
+              <w:t>Prisma Client singleton</w:t>
+            </w:r>
           </w:p>
         </w:tc>
         <w:tc>
@@ -1842,21 +1488,8 @@
           </w:tcPr>
           <w:p>
             <w:r>
-              <w:t xml:space="preserve">Tenant </w:t>
-            </w:r>
-            <w:proofErr w:type="spellStart"/>
-            <w:r>
-              <w:t>Extension</w:t>
-            </w:r>
-            <w:proofErr w:type="spellEnd"/>
-            <w:r>
-              <w:t xml:space="preserve"> </w:t>
-            </w:r>
-            <w:proofErr w:type="spellStart"/>
-            <w:r>
-              <w:t>auto-inject</w:t>
-            </w:r>
-            <w:proofErr w:type="spellEnd"/>
+              <w:t>Tenant Extension auto-inject</w:t>
+            </w:r>
           </w:p>
         </w:tc>
         <w:tc>
@@ -1979,13 +1612,8 @@
           </w:tcPr>
           <w:p>
             <w:r>
-              <w:t>Validación </w:t>
-            </w:r>
-            <w:proofErr w:type="spellStart"/>
-            <w:r>
-              <w:t>max_users</w:t>
-            </w:r>
-            <w:proofErr w:type="spellEnd"/>
+              <w:t>Validación max_users</w:t>
+            </w:r>
           </w:p>
         </w:tc>
         <w:tc>
@@ -2107,13 +1735,8 @@
             <w:hideMark/>
           </w:tcPr>
           <w:p>
-            <w:proofErr w:type="spellStart"/>
-            <w:r>
-              <w:t>Tests</w:t>
-            </w:r>
-            <w:proofErr w:type="spellEnd"/>
-            <w:r>
-              <w:t xml:space="preserve"> E2E aislamiento</w:t>
+            <w:r>
+              <w:t>Tests E2E aislamiento</w:t>
             </w:r>
           </w:p>
         </w:tc>
@@ -2237,21 +1860,8 @@
           </w:tcPr>
           <w:p>
             <w:r>
-              <w:t xml:space="preserve">Smoke test </w:t>
-            </w:r>
-            <w:proofErr w:type="spellStart"/>
-            <w:r>
-              <w:t>Cognito</w:t>
-            </w:r>
-            <w:proofErr w:type="spellEnd"/>
-            <w:r>
-              <w:t xml:space="preserve"> </w:t>
-            </w:r>
-            <w:proofErr w:type="spellStart"/>
-            <w:r>
-              <w:t>sync</w:t>
-            </w:r>
-            <w:proofErr w:type="spellEnd"/>
+              <w:t>Smoke test Cognito sync</w:t>
+            </w:r>
           </w:p>
         </w:tc>
         <w:tc>
@@ -2376,13 +1986,8 @@
           </w:tcPr>
           <w:p>
             <w:r>
-              <w:t xml:space="preserve">Documentación + </w:t>
-            </w:r>
-            <w:proofErr w:type="spellStart"/>
-            <w:r>
-              <w:t>ADRs</w:t>
-            </w:r>
-            <w:proofErr w:type="spellEnd"/>
+              <w:t>Documentación + ADRs</w:t>
+            </w:r>
           </w:p>
         </w:tc>
         <w:tc>
@@ -2486,13 +2091,8 @@
       </w:r>
     </w:p>
     <w:p>
-      <w:proofErr w:type="spellStart"/>
-      <w:r>
-        <w:t>docker-compose.yml</w:t>
-      </w:r>
-      <w:proofErr w:type="spellEnd"/>
-      <w:r>
-        <w:t xml:space="preserve">                    </w:t>
+      <w:r>
+        <w:t xml:space="preserve">docker-compose.yml                    </w:t>
       </w:r>
       <w:r>
         <w:tab/>
@@ -2501,38 +2101,12 @@
         <w:tab/>
       </w:r>
       <w:r>
-        <w:t xml:space="preserve"># PostgreSQL 16 + </w:t>
-      </w:r>
-      <w:proofErr w:type="spellStart"/>
-      <w:r>
-        <w:t>pgAdmin</w:t>
-      </w:r>
-      <w:proofErr w:type="spellEnd"/>
-    </w:p>
-    <w:p>
-      <w:proofErr w:type="spellStart"/>
-      <w:r>
-        <w:t>docker</w:t>
-      </w:r>
-      <w:proofErr w:type="spellEnd"/>
-      <w:r>
-        <w:t>/</w:t>
-      </w:r>
-      <w:proofErr w:type="spellStart"/>
-      <w:r>
-        <w:t>postgres</w:t>
-      </w:r>
-      <w:proofErr w:type="spellEnd"/>
-      <w:r>
-        <w:t>/</w:t>
-      </w:r>
-      <w:proofErr w:type="spellStart"/>
-      <w:r>
-        <w:t>init.sql</w:t>
-      </w:r>
-      <w:proofErr w:type="spellEnd"/>
-      <w:r>
-        <w:t xml:space="preserve">             </w:t>
+        <w:t># PostgreSQL 16 + pgAdmin</w:t>
+      </w:r>
+    </w:p>
+    <w:p>
+      <w:r>
+        <w:t xml:space="preserve">docker/postgres/init.sql             </w:t>
       </w:r>
       <w:r>
         <w:tab/>
@@ -2541,28 +2115,12 @@
         <w:tab/>
       </w:r>
       <w:r>
-        <w:t xml:space="preserve"> # </w:t>
-      </w:r>
-      <w:proofErr w:type="spellStart"/>
-      <w:r>
-        <w:t>Extensions</w:t>
-      </w:r>
-      <w:proofErr w:type="spellEnd"/>
-      <w:r>
-        <w:t xml:space="preserve"> + configuración</w:t>
-      </w:r>
-    </w:p>
-    <w:p>
-      <w:r>
-        <w:t>prisma/</w:t>
-      </w:r>
-      <w:proofErr w:type="spellStart"/>
-      <w:r>
-        <w:t>schema.prisma</w:t>
-      </w:r>
-      <w:proofErr w:type="spellEnd"/>
-      <w:r>
-        <w:t xml:space="preserve">                 </w:t>
+        <w:t xml:space="preserve"> # Extensions + configuración</w:t>
+      </w:r>
+    </w:p>
+    <w:p>
+      <w:r>
+        <w:t xml:space="preserve">prisma/schema.prisma                 </w:t>
       </w:r>
       <w:r>
         <w:tab/>
@@ -2571,75 +2129,25 @@
         <w:tab/>
       </w:r>
       <w:r>
-        <w:t xml:space="preserve"> # Base </w:t>
-      </w:r>
-      <w:proofErr w:type="spellStart"/>
-      <w:r>
-        <w:t>config</w:t>
-      </w:r>
-      <w:proofErr w:type="spellEnd"/>
-      <w:r>
-        <w:t xml:space="preserve"> + </w:t>
-      </w:r>
-      <w:proofErr w:type="spellStart"/>
-      <w:r>
-        <w:t>generator</w:t>
-      </w:r>
-      <w:proofErr w:type="spellEnd"/>
-    </w:p>
-    <w:p>
-      <w:r>
-        <w:t>prisma/</w:t>
-      </w:r>
-      <w:proofErr w:type="spellStart"/>
-      <w:r>
-        <w:t>schema</w:t>
-      </w:r>
-      <w:proofErr w:type="spellEnd"/>
-      <w:r>
-        <w:t>/</w:t>
-      </w:r>
-      <w:proofErr w:type="spellStart"/>
-      <w:r>
-        <w:t>core.prisma</w:t>
-      </w:r>
-      <w:proofErr w:type="spellEnd"/>
-      <w:r>
-        <w:t xml:space="preserve">             </w:t>
+        <w:t xml:space="preserve"> # Base config + generator</w:t>
+      </w:r>
+    </w:p>
+    <w:p>
+      <w:r>
+        <w:t xml:space="preserve">prisma/schema/core.prisma             </w:t>
       </w:r>
       <w:r>
         <w:tab/>
         <w:t xml:space="preserve"> </w:t>
       </w:r>
       <w:r>
-        <w:t xml:space="preserve"># Company + </w:t>
-      </w:r>
-      <w:proofErr w:type="spellStart"/>
-      <w:r>
-        <w:t>User</w:t>
-      </w:r>
-      <w:proofErr w:type="spellEnd"/>
-      <w:r>
-        <w:t xml:space="preserve"> + Module + </w:t>
-      </w:r>
-      <w:proofErr w:type="spellStart"/>
-      <w:r>
-        <w:t>Permission</w:t>
-      </w:r>
-      <w:proofErr w:type="spellEnd"/>
+        <w:t># Company + User + Module + Permission</w:t>
+      </w:r>
     </w:p>
     <w:p>
       <w:r>
         <w:lastRenderedPageBreak/>
-        <w:t>prisma/</w:t>
-      </w:r>
-      <w:proofErr w:type="spellStart"/>
-      <w:r>
-        <w:t>migrations</w:t>
-      </w:r>
-      <w:proofErr w:type="spellEnd"/>
-      <w:r>
-        <w:t xml:space="preserve">/                    </w:t>
+        <w:t xml:space="preserve">prisma/migrations/                    </w:t>
       </w:r>
       <w:r>
         <w:tab/>
@@ -2648,52 +2156,20 @@
         <w:tab/>
       </w:r>
       <w:r>
-        <w:t xml:space="preserve"># </w:t>
-      </w:r>
-      <w:proofErr w:type="spellStart"/>
-      <w:proofErr w:type="gramStart"/>
-      <w:r>
-        <w:t>Auto-generadas</w:t>
-      </w:r>
-      <w:proofErr w:type="spellEnd"/>
-      <w:proofErr w:type="gramEnd"/>
-      <w:r>
-        <w:t xml:space="preserve"> por Prisma</w:t>
-      </w:r>
-    </w:p>
-    <w:p>
-      <w:pPr>
-        <w:rPr>
-          <w:lang w:val="en-US"/>
-        </w:rPr>
-      </w:pPr>
-      <w:proofErr w:type="spellStart"/>
-      <w:r>
-        <w:rPr>
-          <w:lang w:val="en-US"/>
-        </w:rPr>
-        <w:t>prisma</w:t>
-      </w:r>
-      <w:proofErr w:type="spellEnd"/>
-      <w:r>
-        <w:rPr>
-          <w:lang w:val="en-US"/>
-        </w:rPr>
-        <w:t>/seed/</w:t>
-      </w:r>
-      <w:proofErr w:type="spellStart"/>
-      <w:r>
-        <w:rPr>
-          <w:lang w:val="en-US"/>
-        </w:rPr>
-        <w:t>seed.ts</w:t>
-      </w:r>
-      <w:proofErr w:type="spellEnd"/>
-      <w:r>
-        <w:rPr>
-          <w:lang w:val="en-US"/>
-        </w:rPr>
-        <w:t xml:space="preserve">                  </w:t>
+        <w:t># Auto-generadas por Prisma</w:t>
+      </w:r>
+    </w:p>
+    <w:p>
+      <w:pPr>
+        <w:rPr>
+          <w:lang w:val="en-US"/>
+        </w:rPr>
+      </w:pPr>
+      <w:r>
+        <w:rPr>
+          <w:lang w:val="en-US"/>
+        </w:rPr>
+        <w:t xml:space="preserve">prisma/seed/seed.ts                  </w:t>
       </w:r>
       <w:r>
         <w:rPr>
@@ -2720,47 +2196,11 @@
           <w:lang w:val="en-US"/>
         </w:rPr>
       </w:pPr>
-      <w:proofErr w:type="spellStart"/>
-      <w:r>
-        <w:rPr>
-          <w:lang w:val="en-US"/>
-        </w:rPr>
-        <w:t>src</w:t>
-      </w:r>
-      <w:proofErr w:type="spellEnd"/>
-      <w:r>
-        <w:rPr>
-          <w:lang w:val="en-US"/>
-        </w:rPr>
-        <w:t>/lib/</w:t>
-      </w:r>
-      <w:proofErr w:type="spellStart"/>
-      <w:r>
-        <w:rPr>
-          <w:lang w:val="en-US"/>
-        </w:rPr>
-        <w:t>db</w:t>
-      </w:r>
-      <w:proofErr w:type="spellEnd"/>
-      <w:r>
-        <w:rPr>
-          <w:lang w:val="en-US"/>
-        </w:rPr>
-        <w:t>/</w:t>
-      </w:r>
-      <w:proofErr w:type="spellStart"/>
-      <w:r>
-        <w:rPr>
-          <w:lang w:val="en-US"/>
-        </w:rPr>
-        <w:t>prisma.ts</w:t>
-      </w:r>
-      <w:proofErr w:type="spellEnd"/>
-      <w:r>
-        <w:rPr>
-          <w:lang w:val="en-US"/>
-        </w:rPr>
-        <w:t xml:space="preserve">                  </w:t>
+      <w:r>
+        <w:rPr>
+          <w:lang w:val="en-US"/>
+        </w:rPr>
+        <w:t xml:space="preserve">src/lib/db/prisma.ts                  </w:t>
       </w:r>
       <w:r>
         <w:rPr>
@@ -2787,47 +2227,11 @@
           <w:lang w:val="en-US"/>
         </w:rPr>
       </w:pPr>
-      <w:proofErr w:type="spellStart"/>
-      <w:r>
-        <w:rPr>
-          <w:lang w:val="en-US"/>
-        </w:rPr>
-        <w:t>src</w:t>
-      </w:r>
-      <w:proofErr w:type="spellEnd"/>
-      <w:r>
-        <w:rPr>
-          <w:lang w:val="en-US"/>
-        </w:rPr>
-        <w:t>/lib/</w:t>
-      </w:r>
-      <w:proofErr w:type="spellStart"/>
-      <w:r>
-        <w:rPr>
-          <w:lang w:val="en-US"/>
-        </w:rPr>
-        <w:t>db</w:t>
-      </w:r>
-      <w:proofErr w:type="spellEnd"/>
-      <w:r>
-        <w:rPr>
-          <w:lang w:val="en-US"/>
-        </w:rPr>
-        <w:t>/extensions/</w:t>
-      </w:r>
-      <w:proofErr w:type="spellStart"/>
-      <w:r>
-        <w:rPr>
-          <w:lang w:val="en-US"/>
-        </w:rPr>
-        <w:t>tenant.ts</w:t>
-      </w:r>
-      <w:proofErr w:type="spellEnd"/>
-      <w:r>
-        <w:rPr>
-          <w:lang w:val="en-US"/>
-        </w:rPr>
-        <w:t xml:space="preserve">       </w:t>
+      <w:r>
+        <w:rPr>
+          <w:lang w:val="en-US"/>
+        </w:rPr>
+        <w:t xml:space="preserve">src/lib/db/extensions/tenant.ts       </w:t>
       </w:r>
       <w:r>
         <w:rPr>
@@ -2845,64 +2249,20 @@
         <w:rPr>
           <w:lang w:val="en-US"/>
         </w:rPr>
-        <w:t xml:space="preserve"># Auto-inject </w:t>
-      </w:r>
-      <w:proofErr w:type="spellStart"/>
-      <w:r>
-        <w:rPr>
-          <w:lang w:val="en-US"/>
-        </w:rPr>
-        <w:t>company_id</w:t>
-      </w:r>
-      <w:proofErr w:type="spellEnd"/>
-    </w:p>
-    <w:p>
-      <w:pPr>
-        <w:rPr>
-          <w:lang w:val="en-US"/>
-        </w:rPr>
-      </w:pPr>
-      <w:proofErr w:type="spellStart"/>
-      <w:r>
-        <w:rPr>
-          <w:lang w:val="en-US"/>
-        </w:rPr>
-        <w:t>src</w:t>
-      </w:r>
-      <w:proofErr w:type="spellEnd"/>
-      <w:r>
-        <w:rPr>
-          <w:lang w:val="en-US"/>
-        </w:rPr>
-        <w:t>/lib/</w:t>
-      </w:r>
-      <w:proofErr w:type="spellStart"/>
-      <w:r>
-        <w:rPr>
-          <w:lang w:val="en-US"/>
-        </w:rPr>
-        <w:t>db</w:t>
-      </w:r>
-      <w:proofErr w:type="spellEnd"/>
-      <w:r>
-        <w:rPr>
-          <w:lang w:val="en-US"/>
-        </w:rPr>
-        <w:t>/</w:t>
-      </w:r>
-      <w:proofErr w:type="spellStart"/>
-      <w:r>
-        <w:rPr>
-          <w:lang w:val="en-US"/>
-        </w:rPr>
-        <w:t>setCompanyContext.ts</w:t>
-      </w:r>
-      <w:proofErr w:type="spellEnd"/>
-      <w:r>
-        <w:rPr>
-          <w:lang w:val="en-US"/>
-        </w:rPr>
-        <w:t xml:space="preserve">      </w:t>
+        <w:t># Auto-inject company_id</w:t>
+      </w:r>
+    </w:p>
+    <w:p>
+      <w:pPr>
+        <w:rPr>
+          <w:lang w:val="en-US"/>
+        </w:rPr>
+      </w:pPr>
+      <w:r>
+        <w:rPr>
+          <w:lang w:val="en-US"/>
+        </w:rPr>
+        <w:t xml:space="preserve">src/lib/db/setCompanyContext.ts      </w:t>
       </w:r>
       <w:r>
         <w:rPr>
@@ -2914,58 +2274,20 @@
         <w:rPr>
           <w:lang w:val="en-US"/>
         </w:rPr>
-        <w:t xml:space="preserve"> # SET </w:t>
-      </w:r>
-      <w:proofErr w:type="spellStart"/>
-      <w:proofErr w:type="gramStart"/>
-      <w:r>
-        <w:rPr>
-          <w:lang w:val="en-US"/>
-        </w:rPr>
-        <w:t>app.current</w:t>
-      </w:r>
-      <w:proofErr w:type="gramEnd"/>
-      <w:r>
-        <w:rPr>
-          <w:lang w:val="en-US"/>
-        </w:rPr>
-        <w:t>_company_id</w:t>
-      </w:r>
-      <w:proofErr w:type="spellEnd"/>
-    </w:p>
-    <w:p>
-      <w:pPr>
-        <w:rPr>
-          <w:lang w:val="en-US"/>
-        </w:rPr>
-      </w:pPr>
-      <w:proofErr w:type="spellStart"/>
-      <w:r>
-        <w:rPr>
-          <w:lang w:val="en-US"/>
-        </w:rPr>
-        <w:t>src</w:t>
-      </w:r>
-      <w:proofErr w:type="spellEnd"/>
-      <w:r>
-        <w:rPr>
-          <w:lang w:val="en-US"/>
-        </w:rPr>
-        <w:t>/lib/validators/</w:t>
-      </w:r>
-      <w:proofErr w:type="spellStart"/>
-      <w:r>
-        <w:rPr>
-          <w:lang w:val="en-US"/>
-        </w:rPr>
-        <w:t>company.ts</w:t>
-      </w:r>
-      <w:proofErr w:type="spellEnd"/>
-      <w:r>
-        <w:rPr>
-          <w:lang w:val="en-US"/>
-        </w:rPr>
-        <w:t xml:space="preserve">         </w:t>
+        <w:t xml:space="preserve"> # SET app.current_company_id</w:t>
+      </w:r>
+    </w:p>
+    <w:p>
+      <w:pPr>
+        <w:rPr>
+          <w:lang w:val="en-US"/>
+        </w:rPr>
+      </w:pPr>
+      <w:r>
+        <w:rPr>
+          <w:lang w:val="en-US"/>
+        </w:rPr>
+        <w:t xml:space="preserve">src/lib/validators/company.ts         </w:t>
       </w:r>
       <w:r>
         <w:rPr>
@@ -2992,33 +2314,11 @@
           <w:lang w:val="en-US"/>
         </w:rPr>
       </w:pPr>
-      <w:proofErr w:type="spellStart"/>
-      <w:r>
-        <w:rPr>
-          <w:lang w:val="en-US"/>
-        </w:rPr>
-        <w:t>src</w:t>
-      </w:r>
-      <w:proofErr w:type="spellEnd"/>
-      <w:r>
-        <w:rPr>
-          <w:lang w:val="en-US"/>
-        </w:rPr>
-        <w:t>/lib/validators/</w:t>
-      </w:r>
-      <w:proofErr w:type="spellStart"/>
-      <w:r>
-        <w:rPr>
-          <w:lang w:val="en-US"/>
-        </w:rPr>
-        <w:t>user.ts</w:t>
-      </w:r>
-      <w:proofErr w:type="spellEnd"/>
-      <w:r>
-        <w:rPr>
-          <w:lang w:val="en-US"/>
-        </w:rPr>
-        <w:t xml:space="preserve">            </w:t>
+      <w:r>
+        <w:rPr>
+          <w:lang w:val="en-US"/>
+        </w:rPr>
+        <w:t xml:space="preserve">src/lib/validators/user.ts            </w:t>
       </w:r>
       <w:r>
         <w:rPr>
@@ -3040,21 +2340,8 @@
       </w:r>
     </w:p>
     <w:p>
-      <w:proofErr w:type="gramStart"/>
-      <w:r>
-        <w:t>.</w:t>
-      </w:r>
-      <w:proofErr w:type="spellStart"/>
-      <w:r>
-        <w:t>env</w:t>
-      </w:r>
-      <w:proofErr w:type="gramEnd"/>
-      <w:r>
-        <w:t>.local</w:t>
-      </w:r>
-      <w:proofErr w:type="spellEnd"/>
-      <w:r>
-        <w:t xml:space="preserve">                           </w:t>
+      <w:r>
+        <w:t xml:space="preserve">.env.local                           </w:t>
       </w:r>
       <w:r>
         <w:tab/>
@@ -3068,21 +2355,8 @@
       </w:r>
     </w:p>
     <w:p>
-      <w:proofErr w:type="spellStart"/>
-      <w:r>
-        <w:t>tests</w:t>
-      </w:r>
-      <w:proofErr w:type="spellEnd"/>
-      <w:r>
-        <w:t>/e2e/</w:t>
-      </w:r>
-      <w:proofErr w:type="spellStart"/>
-      <w:r>
-        <w:t>tenant-isolation.spec.ts</w:t>
-      </w:r>
-      <w:proofErr w:type="spellEnd"/>
-      <w:r>
-        <w:t xml:space="preserve">    </w:t>
+      <w:r>
+        <w:t xml:space="preserve">tests/e2e/tenant-isolation.spec.ts    </w:t>
       </w:r>
       <w:r>
         <w:tab/>
@@ -3274,44 +2548,8 @@
               <w:rPr>
                 <w:lang w:val="en-US"/>
               </w:rPr>
-              <w:t xml:space="preserve">Data leaking </w:t>
-            </w:r>
-            <w:proofErr w:type="spellStart"/>
-            <w:r>
-              <w:rPr>
-                <w:lang w:val="en-US"/>
-              </w:rPr>
-              <w:t>por</w:t>
-            </w:r>
-            <w:proofErr w:type="spellEnd"/>
-            <w:r>
-              <w:rPr>
-                <w:lang w:val="en-US"/>
-              </w:rPr>
-              <w:t xml:space="preserve"> </w:t>
-            </w:r>
-            <w:proofErr w:type="spellStart"/>
-            <w:r>
-              <w:rPr>
-                <w:lang w:val="en-US"/>
-              </w:rPr>
-              <w:t>olvido</w:t>
-            </w:r>
-            <w:proofErr w:type="spellEnd"/>
-            <w:r>
-              <w:rPr>
-                <w:lang w:val="en-US"/>
-              </w:rPr>
-              <w:t> </w:t>
-            </w:r>
-            <w:proofErr w:type="spellStart"/>
-            <w:r>
-              <w:rPr>
-                <w:lang w:val="en-US"/>
-              </w:rPr>
-              <w:t>company_id</w:t>
-            </w:r>
-            <w:proofErr w:type="spellEnd"/>
+              <w:t>Data leaking por olvido company_id</w:t>
+            </w:r>
           </w:p>
         </w:tc>
         <w:tc>
@@ -3363,23 +2601,7 @@
           </w:tcPr>
           <w:p>
             <w:r>
-              <w:t xml:space="preserve">Prisma </w:t>
-            </w:r>
-            <w:proofErr w:type="spellStart"/>
-            <w:r>
-              <w:t>Extension</w:t>
-            </w:r>
-            <w:proofErr w:type="spellEnd"/>
-            <w:r>
-              <w:t xml:space="preserve"> </w:t>
-            </w:r>
-            <w:proofErr w:type="spellStart"/>
-            <w:r>
-              <w:t>auto-inject</w:t>
-            </w:r>
-            <w:proofErr w:type="spellEnd"/>
-            <w:r>
-              <w:t xml:space="preserve"> obligatorio</w:t>
+              <w:t>Prisma Extension auto-inject obligatorio</w:t>
             </w:r>
           </w:p>
         </w:tc>
@@ -3407,15 +2629,7 @@
           </w:tcPr>
           <w:p>
             <w:r>
-              <w:t xml:space="preserve">Performance RLS en </w:t>
-            </w:r>
-            <w:proofErr w:type="spellStart"/>
-            <w:r>
-              <w:t>queries</w:t>
-            </w:r>
-            <w:proofErr w:type="spellEnd"/>
-            <w:r>
-              <w:t xml:space="preserve"> complejos</w:t>
+              <w:t>Performance RLS en queries complejos</w:t>
             </w:r>
           </w:p>
         </w:tc>
@@ -3468,13 +2682,8 @@
           </w:tcPr>
           <w:p>
             <w:r>
-              <w:t xml:space="preserve">Índices compuestos + </w:t>
-            </w:r>
-            <w:proofErr w:type="spellStart"/>
-            <w:r>
-              <w:t>monitoring</w:t>
-            </w:r>
-            <w:proofErr w:type="spellEnd"/>
+              <w:t>Índices compuestos + monitoring</w:t>
+            </w:r>
           </w:p>
         </w:tc>
       </w:tr>
@@ -3500,21 +2709,8 @@
             <w:hideMark/>
           </w:tcPr>
           <w:p>
-            <w:proofErr w:type="spellStart"/>
-            <w:r>
-              <w:t>Connection</w:t>
-            </w:r>
-            <w:proofErr w:type="spellEnd"/>
-            <w:r>
-              <w:t xml:space="preserve"> </w:t>
-            </w:r>
-            <w:proofErr w:type="spellStart"/>
-            <w:r>
-              <w:t>exhaustion</w:t>
-            </w:r>
-            <w:proofErr w:type="spellEnd"/>
-            <w:r>
-              <w:t xml:space="preserve"> en Lambda</w:t>
+            <w:r>
+              <w:t>Connection exhaustion en Lambda</w:t>
             </w:r>
           </w:p>
         </w:tc>
@@ -3647,27 +2843,9 @@
             <w:hideMark/>
           </w:tcPr>
           <w:p>
-            <w:proofErr w:type="spellStart"/>
-            <w:r>
-              <w:t>Checklist</w:t>
-            </w:r>
-            <w:proofErr w:type="spellEnd"/>
-            <w:r>
-              <w:t xml:space="preserve"> </w:t>
-            </w:r>
-            <w:proofErr w:type="spellStart"/>
-            <w:r>
-              <w:t>pre-deploy</w:t>
-            </w:r>
-            <w:proofErr w:type="spellEnd"/>
-            <w:r>
-              <w:t xml:space="preserve"> + </w:t>
-            </w:r>
-            <w:proofErr w:type="spellStart"/>
-            <w:r>
-              <w:t>backups</w:t>
-            </w:r>
-            <w:proofErr w:type="spellEnd"/>
+            <w:r>
+              <w:t>Checklist pre-deploy + backups</w:t>
+            </w:r>
           </w:p>
         </w:tc>
       </w:tr>
@@ -3703,21 +2881,7 @@
               <w:rPr>
                 <w:lang w:val="en-US"/>
               </w:rPr>
-              <w:t xml:space="preserve">UUIDs v4 </w:t>
-            </w:r>
-            <w:proofErr w:type="spellStart"/>
-            <w:r>
-              <w:rPr>
-                <w:lang w:val="en-US"/>
-              </w:rPr>
-              <w:t>causan</w:t>
-            </w:r>
-            <w:proofErr w:type="spellEnd"/>
-            <w:r>
-              <w:rPr>
-                <w:lang w:val="en-US"/>
-              </w:rPr>
-              <w:t xml:space="preserve"> page splits</w:t>
+              <w:t>UUIDs v4 causan page splits</w:t>
             </w:r>
           </w:p>
         </w:tc>
@@ -3823,23 +2987,7 @@
           <w:b/>
           <w:bCs/>
         </w:rPr>
-        <w:t xml:space="preserve">Pull </w:t>
-      </w:r>
-      <w:proofErr w:type="spellStart"/>
-      <w:r>
-        <w:rPr>
-          <w:b/>
-          <w:bCs/>
-        </w:rPr>
-        <w:t>Request</w:t>
-      </w:r>
-      <w:proofErr w:type="spellEnd"/>
-      <w:r>
-        <w:rPr>
-          <w:b/>
-          <w:bCs/>
-        </w:rPr>
-        <w:t xml:space="preserve"> #2 creado y actualizado</w:t>
+        <w:t>Pull Request #2 creado y actualizado</w:t>
       </w:r>
       <w:r>
         <w:t>: </w:t>
@@ -3865,42 +3013,17 @@
           <w:b/>
           <w:bCs/>
         </w:rPr>
-        <w:t xml:space="preserve">Archivos creados/modificados (2 </w:t>
-      </w:r>
-      <w:proofErr w:type="spellStart"/>
+        <w:t>Archivos creados/modificados (2 commits):</w:t>
+      </w:r>
+    </w:p>
+    <w:p>
       <w:r>
         <w:rPr>
           <w:b/>
           <w:bCs/>
         </w:rPr>
-        <w:t>commits</w:t>
-      </w:r>
-      <w:proofErr w:type="spellEnd"/>
-      <w:r>
-        <w:rPr>
-          <w:b/>
-          <w:bCs/>
-        </w:rPr>
-        <w:t>):</w:t>
-      </w:r>
-    </w:p>
-    <w:p>
-      <w:proofErr w:type="spellStart"/>
-      <w:r>
-        <w:rPr>
-          <w:b/>
-          <w:bCs/>
-        </w:rPr>
         <w:lastRenderedPageBreak/>
-        <w:t>Commit</w:t>
-      </w:r>
-      <w:proofErr w:type="spellEnd"/>
-      <w:r>
-        <w:rPr>
-          <w:b/>
-          <w:bCs/>
-        </w:rPr>
-        <w:t xml:space="preserve"> 1 - Implementación F0-07:</w:t>
+        <w:t>Commit 1 - Implementación F0-07:</w:t>
       </w:r>
     </w:p>
     <w:p>
@@ -3919,51 +3042,40 @@
             <w:rStyle w:val="Hipervnculo"/>
             <w:lang w:val="en-US"/>
           </w:rPr>
-          <w:t>docker-</w:t>
+          <w:t>docker-compose.yml</w:t>
         </w:r>
-        <w:proofErr w:type="spellStart"/>
+      </w:hyperlink>
+      <w:r>
+        <w:rPr>
+          <w:lang w:val="en-US"/>
+        </w:rPr>
+        <w:t> — MailHog agregado (SMTP localhost:1025, UI :8025)</w:t>
+      </w:r>
+    </w:p>
+    <w:p>
+      <w:pPr>
+        <w:numPr>
+          <w:ilvl w:val="0"/>
+          <w:numId w:val="3"/>
+        </w:numPr>
+        <w:rPr>
+          <w:lang w:val="en-US"/>
+        </w:rPr>
+      </w:pPr>
+      <w:hyperlink r:id="rId8" w:history="1">
         <w:r>
           <w:rPr>
             <w:rStyle w:val="Hipervnculo"/>
             <w:lang w:val="en-US"/>
           </w:rPr>
-          <w:t>compose.yml</w:t>
+          <w:t>.env.example</w:t>
         </w:r>
-        <w:proofErr w:type="spellEnd"/>
       </w:hyperlink>
       <w:r>
         <w:rPr>
           <w:lang w:val="en-US"/>
         </w:rPr>
-        <w:t xml:space="preserve"> — </w:t>
-      </w:r>
-      <w:proofErr w:type="spellStart"/>
-      <w:r>
-        <w:rPr>
-          <w:lang w:val="en-US"/>
-        </w:rPr>
-        <w:t>MailHog</w:t>
-      </w:r>
-      <w:proofErr w:type="spellEnd"/>
-      <w:r>
-        <w:rPr>
-          <w:lang w:val="en-US"/>
-        </w:rPr>
-        <w:t xml:space="preserve"> </w:t>
-      </w:r>
-      <w:proofErr w:type="spellStart"/>
-      <w:r>
-        <w:rPr>
-          <w:lang w:val="en-US"/>
-        </w:rPr>
-        <w:t>agregado</w:t>
-      </w:r>
-      <w:proofErr w:type="spellEnd"/>
-      <w:r>
-        <w:rPr>
-          <w:lang w:val="en-US"/>
-        </w:rPr>
-        <w:t xml:space="preserve"> (SMTP localhost:1025, UI :8025)</w:t>
+        <w:t> — 26+ variables documentadas (DB, App, AWS, Email, Storage, Monitoring, Feature Flags)</w:t>
       </w:r>
     </w:p>
     <w:p>
@@ -3976,66 +3088,7 @@
           <w:lang w:val="en-US"/>
         </w:rPr>
       </w:pPr>
-      <w:hyperlink r:id="rId8" w:history="1">
-        <w:proofErr w:type="gramStart"/>
-        <w:r>
-          <w:rPr>
-            <w:rStyle w:val="Hipervnculo"/>
-            <w:lang w:val="en-US"/>
-          </w:rPr>
-          <w:t>.</w:t>
-        </w:r>
-        <w:proofErr w:type="spellStart"/>
-        <w:r>
-          <w:rPr>
-            <w:rStyle w:val="Hipervnculo"/>
-            <w:lang w:val="en-US"/>
-          </w:rPr>
-          <w:t>env</w:t>
-        </w:r>
-        <w:proofErr w:type="gramEnd"/>
-        <w:r>
-          <w:rPr>
-            <w:rStyle w:val="Hipervnculo"/>
-            <w:lang w:val="en-US"/>
-          </w:rPr>
-          <w:t>.example</w:t>
-        </w:r>
-        <w:proofErr w:type="spellEnd"/>
-      </w:hyperlink>
-      <w:r>
-        <w:rPr>
-          <w:lang w:val="en-US"/>
-        </w:rPr>
-        <w:t xml:space="preserve"> — 26+ variables </w:t>
-      </w:r>
-      <w:proofErr w:type="spellStart"/>
-      <w:r>
-        <w:rPr>
-          <w:lang w:val="en-US"/>
-        </w:rPr>
-        <w:t>documentadas</w:t>
-      </w:r>
-      <w:proofErr w:type="spellEnd"/>
-      <w:r>
-        <w:rPr>
-          <w:lang w:val="en-US"/>
-        </w:rPr>
-        <w:t xml:space="preserve"> (DB, App, AWS, Email, Storage, Monitoring, Feature Flags)</w:t>
-      </w:r>
-    </w:p>
-    <w:p>
-      <w:pPr>
-        <w:numPr>
-          <w:ilvl w:val="0"/>
-          <w:numId w:val="3"/>
-        </w:numPr>
-        <w:rPr>
-          <w:lang w:val="en-US"/>
-        </w:rPr>
-      </w:pPr>
       <w:hyperlink r:id="rId9" w:history="1">
-        <w:proofErr w:type="spellStart"/>
         <w:r>
           <w:rPr>
             <w:rStyle w:val="Hipervnculo"/>
@@ -4043,41 +3096,12 @@
           </w:rPr>
           <w:t>env.ts</w:t>
         </w:r>
-        <w:proofErr w:type="spellEnd"/>
       </w:hyperlink>
       <w:r>
         <w:rPr>
           <w:lang w:val="en-US"/>
         </w:rPr>
-        <w:t xml:space="preserve"> — </w:t>
-      </w:r>
-      <w:proofErr w:type="spellStart"/>
-      <w:r>
-        <w:rPr>
-          <w:lang w:val="en-US"/>
-        </w:rPr>
-        <w:t>Validación</w:t>
-      </w:r>
-      <w:proofErr w:type="spellEnd"/>
-      <w:r>
-        <w:rPr>
-          <w:lang w:val="en-US"/>
-        </w:rPr>
-        <w:t xml:space="preserve"> Zod server-side (fail-fast </w:t>
-      </w:r>
-      <w:proofErr w:type="spellStart"/>
-      <w:r>
-        <w:rPr>
-          <w:lang w:val="en-US"/>
-        </w:rPr>
-        <w:t>en</w:t>
-      </w:r>
-      <w:proofErr w:type="spellEnd"/>
-      <w:r>
-        <w:rPr>
-          <w:lang w:val="en-US"/>
-        </w:rPr>
-        <w:t xml:space="preserve"> startup)</w:t>
+        <w:t> — Validación Zod server-side (fail-fast en startup)</w:t>
       </w:r>
     </w:p>
     <w:p>
@@ -4096,37 +3120,14 @@
             <w:rStyle w:val="Hipervnculo"/>
             <w:lang w:val="en-US"/>
           </w:rPr>
-          <w:t>env-</w:t>
+          <w:t>env-client.ts</w:t>
         </w:r>
-        <w:proofErr w:type="spellStart"/>
-        <w:r>
-          <w:rPr>
-            <w:rStyle w:val="Hipervnculo"/>
-            <w:lang w:val="en-US"/>
-          </w:rPr>
-          <w:t>client.ts</w:t>
-        </w:r>
-        <w:proofErr w:type="spellEnd"/>
       </w:hyperlink>
       <w:r>
         <w:rPr>
           <w:lang w:val="en-US"/>
         </w:rPr>
-        <w:t xml:space="preserve"> — </w:t>
-      </w:r>
-      <w:proofErr w:type="spellStart"/>
-      <w:r>
-        <w:rPr>
-          <w:lang w:val="en-US"/>
-        </w:rPr>
-        <w:t>Validación</w:t>
-      </w:r>
-      <w:proofErr w:type="spellEnd"/>
-      <w:r>
-        <w:rPr>
-          <w:lang w:val="en-US"/>
-        </w:rPr>
-        <w:t xml:space="preserve"> Zod client-side (NEXT_PUBLIC_*)</w:t>
+        <w:t> — Validación Zod client-side (NEXT_PUBLIC_*)</w:t>
       </w:r>
     </w:p>
     <w:p>
@@ -4137,25 +3138,15 @@
         </w:numPr>
       </w:pPr>
       <w:hyperlink r:id="rId11" w:history="1">
-        <w:proofErr w:type="spellStart"/>
         <w:r>
           <w:rPr>
             <w:rStyle w:val="Hipervnculo"/>
           </w:rPr>
           <w:t>dev-setup.mjs</w:t>
         </w:r>
-        <w:proofErr w:type="spellEnd"/>
       </w:hyperlink>
       <w:r>
-        <w:t xml:space="preserve"> — </w:t>
-      </w:r>
-      <w:proofErr w:type="spellStart"/>
-      <w:r>
-        <w:t>Setup</w:t>
-      </w:r>
-      <w:proofErr w:type="spellEnd"/>
-      <w:r>
-        <w:t xml:space="preserve"> automatizado en 1 comando (Node.js)</w:t>
+        <w:t> — Setup automatizado en 1 comando (Node.js)</w:t>
       </w:r>
     </w:p>
     <w:p>
@@ -4174,15 +3165,7 @@
         </w:r>
       </w:hyperlink>
       <w:r>
-        <w:t xml:space="preserve"> — Verificación 9 componentes (PowerShell, ASCII </w:t>
-      </w:r>
-      <w:proofErr w:type="spellStart"/>
-      <w:r>
-        <w:t>encoding</w:t>
-      </w:r>
-      <w:proofErr w:type="spellEnd"/>
-      <w:r>
-        <w:t>)</w:t>
+        <w:t> — Verificación 9 componentes (PowerShell, ASCII encoding)</w:t>
       </w:r>
     </w:p>
     <w:p>
@@ -4196,7 +3179,6 @@
         </w:rPr>
       </w:pPr>
       <w:hyperlink r:id="rId13" w:history="1">
-        <w:proofErr w:type="spellStart"/>
         <w:r>
           <w:rPr>
             <w:rStyle w:val="Hipervnculo"/>
@@ -4204,7 +3186,6 @@
           </w:rPr>
           <w:t>route.ts</w:t>
         </w:r>
-        <w:proofErr w:type="spellEnd"/>
       </w:hyperlink>
       <w:r>
         <w:rPr>
@@ -4224,7 +3205,6 @@
         </w:rPr>
       </w:pPr>
       <w:hyperlink r:id="rId14" w:history="1">
-        <w:proofErr w:type="spellStart"/>
         <w:r>
           <w:rPr>
             <w:rStyle w:val="Hipervnculo"/>
@@ -4232,7 +3212,6 @@
           </w:rPr>
           <w:t>amplify.yml</w:t>
         </w:r>
-        <w:proofErr w:type="spellEnd"/>
       </w:hyperlink>
       <w:r>
         <w:rPr>
@@ -4252,88 +3231,19 @@
         </w:rPr>
       </w:pPr>
       <w:hyperlink r:id="rId15" w:history="1">
-        <w:proofErr w:type="gramStart"/>
         <w:r>
           <w:rPr>
             <w:rStyle w:val="Hipervnculo"/>
             <w:lang w:val="en-US"/>
           </w:rPr>
-          <w:t>.</w:t>
+          <w:t>.gitignore</w:t>
         </w:r>
-        <w:proofErr w:type="spellStart"/>
-        <w:r>
-          <w:rPr>
-            <w:rStyle w:val="Hipervnculo"/>
-            <w:lang w:val="en-US"/>
-          </w:rPr>
-          <w:t>gitignore</w:t>
-        </w:r>
-        <w:proofErr w:type="spellEnd"/>
-        <w:proofErr w:type="gramEnd"/>
       </w:hyperlink>
       <w:r>
         <w:rPr>
           <w:lang w:val="en-US"/>
         </w:rPr>
-        <w:t xml:space="preserve"> — </w:t>
-      </w:r>
-      <w:proofErr w:type="spellStart"/>
-      <w:proofErr w:type="gramStart"/>
-      <w:r>
-        <w:rPr>
-          <w:lang w:val="en-US"/>
-        </w:rPr>
-        <w:t>Excluye</w:t>
-      </w:r>
-      <w:proofErr w:type="spellEnd"/>
-      <w:r>
-        <w:rPr>
-          <w:lang w:val="en-US"/>
-        </w:rPr>
-        <w:t xml:space="preserve"> .</w:t>
-      </w:r>
-      <w:proofErr w:type="spellStart"/>
-      <w:r>
-        <w:rPr>
-          <w:lang w:val="en-US"/>
-        </w:rPr>
-        <w:t>env</w:t>
-      </w:r>
-      <w:proofErr w:type="gramEnd"/>
-      <w:r>
-        <w:rPr>
-          <w:lang w:val="en-US"/>
-        </w:rPr>
-        <w:t>.staging</w:t>
-      </w:r>
-      <w:proofErr w:type="spellEnd"/>
-      <w:proofErr w:type="gramStart"/>
-      <w:r>
-        <w:rPr>
-          <w:lang w:val="en-US"/>
-        </w:rPr>
-        <w:t>/.</w:t>
-      </w:r>
-      <w:proofErr w:type="spellStart"/>
-      <w:r>
-        <w:rPr>
-          <w:lang w:val="en-US"/>
-        </w:rPr>
-        <w:t>env</w:t>
-      </w:r>
-      <w:proofErr w:type="gramEnd"/>
-      <w:r>
-        <w:rPr>
-          <w:lang w:val="en-US"/>
-        </w:rPr>
-        <w:t>.production</w:t>
-      </w:r>
-      <w:proofErr w:type="spellEnd"/>
-      <w:r>
-        <w:rPr>
-          <w:lang w:val="en-US"/>
-        </w:rPr>
-        <w:t>/docker data</w:t>
+        <w:t> — Excluye .env.staging/.env.production/docker data</w:t>
       </w:r>
     </w:p>
     <w:p>
@@ -4347,8 +3257,6 @@
         </w:rPr>
       </w:pPr>
       <w:hyperlink r:id="rId16" w:history="1">
-        <w:proofErr w:type="spellStart"/>
-        <w:proofErr w:type="gramStart"/>
         <w:r>
           <w:rPr>
             <w:rStyle w:val="Hipervnculo"/>
@@ -4356,80 +3264,21 @@
           </w:rPr>
           <w:t>package.json</w:t>
         </w:r>
-        <w:proofErr w:type="spellEnd"/>
-        <w:proofErr w:type="gramEnd"/>
       </w:hyperlink>
       <w:r>
         <w:rPr>
           <w:lang w:val="en-US"/>
         </w:rPr>
-        <w:t xml:space="preserve"> — Scripts: </w:t>
-      </w:r>
-      <w:proofErr w:type="spellStart"/>
-      <w:proofErr w:type="gramStart"/>
-      <w:r>
-        <w:rPr>
-          <w:lang w:val="en-US"/>
-        </w:rPr>
-        <w:t>dev:setup</w:t>
-      </w:r>
-      <w:proofErr w:type="spellEnd"/>
-      <w:proofErr w:type="gramEnd"/>
-      <w:r>
-        <w:rPr>
-          <w:lang w:val="en-US"/>
-        </w:rPr>
-        <w:t xml:space="preserve">, </w:t>
-      </w:r>
-      <w:proofErr w:type="spellStart"/>
-      <w:proofErr w:type="gramStart"/>
-      <w:r>
-        <w:rPr>
-          <w:lang w:val="en-US"/>
-        </w:rPr>
-        <w:t>dev:verify</w:t>
-      </w:r>
-      <w:proofErr w:type="spellEnd"/>
-      <w:proofErr w:type="gramEnd"/>
-      <w:r>
-        <w:rPr>
-          <w:lang w:val="en-US"/>
-        </w:rPr>
-        <w:t xml:space="preserve">, </w:t>
-      </w:r>
-      <w:proofErr w:type="spellStart"/>
-      <w:proofErr w:type="gramStart"/>
-      <w:r>
-        <w:rPr>
-          <w:lang w:val="en-US"/>
-        </w:rPr>
-        <w:t>docker:up</w:t>
-      </w:r>
-      <w:proofErr w:type="spellEnd"/>
-      <w:proofErr w:type="gramEnd"/>
-      <w:r>
-        <w:rPr>
-          <w:lang w:val="en-US"/>
-        </w:rPr>
-        <w:t>/down/reset/logs</w:t>
-      </w:r>
-    </w:p>
-    <w:p>
-      <w:proofErr w:type="spellStart"/>
+        <w:t> — Scripts: dev:setup, dev:verify, docker:up/down/reset/logs</w:t>
+      </w:r>
+    </w:p>
+    <w:p>
       <w:r>
         <w:rPr>
           <w:b/>
           <w:bCs/>
         </w:rPr>
-        <w:t>Commit</w:t>
-      </w:r>
-      <w:proofErr w:type="spellEnd"/>
-      <w:r>
-        <w:rPr>
-          <w:b/>
-          <w:bCs/>
-        </w:rPr>
-        <w:t xml:space="preserve"> 2 - Documentación:</w:t>
+        <w:t>Commit 2 - Documentación:</w:t>
       </w:r>
     </w:p>
     <w:p>
@@ -4448,62 +3297,18 @@
         </w:r>
       </w:hyperlink>
       <w:r>
-        <w:t xml:space="preserve"> — Sección detallada "Ambiente Local (F0-07)" con servicios Docker, validación </w:t>
-      </w:r>
-      <w:proofErr w:type="spellStart"/>
-      <w:r>
-        <w:t>Zod</w:t>
-      </w:r>
-      <w:proofErr w:type="spellEnd"/>
-      <w:r>
-        <w:t xml:space="preserve">, scripts, </w:t>
-      </w:r>
-      <w:proofErr w:type="spellStart"/>
-      <w:r>
-        <w:t>health</w:t>
-      </w:r>
-      <w:proofErr w:type="spellEnd"/>
-      <w:r>
-        <w:t xml:space="preserve"> endpoint, </w:t>
-      </w:r>
-      <w:proofErr w:type="spellStart"/>
-      <w:r>
-        <w:fldChar w:fldCharType="begin"/>
-      </w:r>
-      <w:r>
-        <w:instrText>HYPERLINK "vscode-file://vscode-app/c:/Users/MARVIN/AppData/Local/Programs/Microsoft%20VS%20Code/ce099c1ed2/resources/app/out/vs/code/electron-browser/workbench/workbench.html"</w:instrText>
-      </w:r>
-      <w:r>
-        <w:fldChar w:fldCharType="separate"/>
-      </w:r>
-      <w:r>
-        <w:rPr>
-          <w:rStyle w:val="Hipervnculo"/>
-        </w:rPr>
-        <w:t>amplify.yml</w:t>
-      </w:r>
-      <w:proofErr w:type="spellEnd"/>
-      <w:r>
-        <w:fldChar w:fldCharType="end"/>
-      </w:r>
-      <w:r>
-        <w:t> </w:t>
-      </w:r>
-      <w:proofErr w:type="spellStart"/>
-      <w:r>
-        <w:t>config</w:t>
-      </w:r>
-      <w:proofErr w:type="spellEnd"/>
-      <w:r>
-        <w:t xml:space="preserve">, y notas importantes (puerto 5433, </w:t>
-      </w:r>
-      <w:proofErr w:type="spellStart"/>
-      <w:r>
-        <w:t>encoding</w:t>
-      </w:r>
-      <w:proofErr w:type="spellEnd"/>
-      <w:r>
-        <w:t xml:space="preserve"> ASCII)</w:t>
+        <w:t> — Sección detallada "Ambiente Local (F0-07)" con servicios Docker, validación Zod, scripts, health endpoint, </w:t>
+      </w:r>
+      <w:hyperlink r:id="rId18" w:history="1">
+        <w:r>
+          <w:rPr>
+            <w:rStyle w:val="Hipervnculo"/>
+          </w:rPr>
+          <w:t>amplify.yml</w:t>
+        </w:r>
+      </w:hyperlink>
+      <w:r>
+        <w:t> config, y notas importantes (puerto 5433, encoding ASCII)</w:t>
       </w:r>
     </w:p>
     <w:p>
@@ -4513,21 +3318,8 @@
           <w:numId w:val="4"/>
         </w:numPr>
       </w:pPr>
-      <w:proofErr w:type="spellStart"/>
-      <w:r>
-        <w:t>Roadmap</w:t>
-      </w:r>
-      <w:proofErr w:type="spellEnd"/>
-      <w:r>
-        <w:t xml:space="preserve"> actualizado: F0-07 marcado como completado (local </w:t>
-      </w:r>
-      <w:proofErr w:type="spellStart"/>
-      <w:r>
-        <w:t>environment</w:t>
-      </w:r>
-      <w:proofErr w:type="spellEnd"/>
-      <w:r>
-        <w:t>)</w:t>
+      <w:r>
+        <w:t>Roadmap actualizado: F0-07 marcado como completado (local environment)</w:t>
       </w:r>
     </w:p>
     <w:p>
@@ -4572,15 +3364,7 @@
         <w:t>✅</w:t>
       </w:r>
       <w:r>
-        <w:t xml:space="preserve"> PostgreSQL (</w:t>
-      </w:r>
-      <w:proofErr w:type="spellStart"/>
-      <w:r>
-        <w:t>nexoerp-postgres</w:t>
-      </w:r>
-      <w:proofErr w:type="spellEnd"/>
-      <w:r>
-        <w:t>): [OK] (puerto 5433)</w:t>
+        <w:t xml:space="preserve"> PostgreSQL (nexoerp-postgres): [OK] (puerto 5433)</w:t>
       </w:r>
     </w:p>
     <w:p>
@@ -4595,79 +3379,25 @@
       </w:r>
     </w:p>
     <w:p>
-      <w:pPr>
-        <w:rPr>
-          <w:lang w:val="en-US"/>
-        </w:rPr>
-      </w:pPr>
-      <w:proofErr w:type="gramStart"/>
       <w:r>
         <w:rPr>
           <w:rFonts w:ascii="Segoe UI Emoji" w:hAnsi="Segoe UI Emoji" w:cs="Segoe UI Emoji"/>
-          <w:lang w:val="en-US"/>
         </w:rPr>
         <w:t>✅</w:t>
       </w:r>
       <w:r>
-        <w:rPr>
-          <w:lang w:val="en-US"/>
-        </w:rPr>
-        <w:t xml:space="preserve"> .</w:t>
-      </w:r>
-      <w:proofErr w:type="spellStart"/>
-      <w:r>
-        <w:rPr>
-          <w:lang w:val="en-US"/>
-        </w:rPr>
-        <w:t>env</w:t>
-      </w:r>
-      <w:proofErr w:type="gramEnd"/>
-      <w:r>
-        <w:rPr>
-          <w:lang w:val="en-US"/>
-        </w:rPr>
-        <w:t>.local</w:t>
-      </w:r>
-      <w:proofErr w:type="spellEnd"/>
-      <w:r>
-        <w:rPr>
-          <w:lang w:val="en-US"/>
-        </w:rPr>
-        <w:t>: [OK]</w:t>
-      </w:r>
-    </w:p>
-    <w:p>
-      <w:pPr>
-        <w:rPr>
-          <w:lang w:val="en-US"/>
-        </w:rPr>
-      </w:pPr>
+        <w:t xml:space="preserve"> .env.local: [OK]</w:t>
+      </w:r>
+    </w:p>
+    <w:p>
       <w:r>
         <w:rPr>
           <w:rFonts w:ascii="Segoe UI Emoji" w:hAnsi="Segoe UI Emoji" w:cs="Segoe UI Emoji"/>
-          <w:lang w:val="en-US"/>
         </w:rPr>
         <w:t>✅</w:t>
       </w:r>
       <w:r>
-        <w:rPr>
-          <w:lang w:val="en-US"/>
-        </w:rPr>
-        <w:t xml:space="preserve"> </w:t>
-      </w:r>
-      <w:proofErr w:type="spellStart"/>
-      <w:r>
-        <w:rPr>
-          <w:lang w:val="en-US"/>
-        </w:rPr>
-        <w:t>node_modules</w:t>
-      </w:r>
-      <w:proofErr w:type="spellEnd"/>
-      <w:r>
-        <w:rPr>
-          <w:lang w:val="en-US"/>
-        </w:rPr>
-        <w:t>: [OK]</w:t>
+        <w:t xml:space="preserve"> node_modules: [OK]</w:t>
       </w:r>
     </w:p>
     <w:p>
@@ -4710,21 +3440,7 @@
         <w:rPr>
           <w:lang w:val="en-US"/>
         </w:rPr>
-        <w:t xml:space="preserve"> </w:t>
-      </w:r>
-      <w:proofErr w:type="spellStart"/>
-      <w:r>
-        <w:rPr>
-          <w:lang w:val="en-US"/>
-        </w:rPr>
-        <w:t>pgAdmin</w:t>
-      </w:r>
-      <w:proofErr w:type="spellEnd"/>
-      <w:r>
-        <w:rPr>
-          <w:lang w:val="en-US"/>
-        </w:rPr>
-        <w:t>: [OK] (http://localhost:5050)</w:t>
+        <w:t xml:space="preserve"> pgAdmin: [OK] (http://localhost:5050)</w:t>
       </w:r>
     </w:p>
     <w:p>
@@ -4744,21 +3460,7 @@
         <w:rPr>
           <w:lang w:val="en-US"/>
         </w:rPr>
-        <w:t xml:space="preserve"> </w:t>
-      </w:r>
-      <w:proofErr w:type="spellStart"/>
-      <w:r>
-        <w:rPr>
-          <w:lang w:val="en-US"/>
-        </w:rPr>
-        <w:t>MailHog</w:t>
-      </w:r>
-      <w:proofErr w:type="spellEnd"/>
-      <w:r>
-        <w:rPr>
-          <w:lang w:val="en-US"/>
-        </w:rPr>
-        <w:t>: [OK] (http://localhost:8025)</w:t>
+        <w:t xml:space="preserve"> MailHog: [OK] (http://localhost:8025)</w:t>
       </w:r>
     </w:p>
     <w:p>
@@ -4790,274 +3492,57 @@
       </w:r>
     </w:p>
     <w:p>
-      <w:proofErr w:type="spellStart"/>
-      <w:r>
-        <w:t>npm</w:t>
-      </w:r>
-      <w:proofErr w:type="spellEnd"/>
-      <w:r>
-        <w:t xml:space="preserve"> run </w:t>
-      </w:r>
-      <w:proofErr w:type="spellStart"/>
-      <w:proofErr w:type="gramStart"/>
-      <w:r>
-        <w:t>dev:setup</w:t>
-      </w:r>
-      <w:proofErr w:type="spellEnd"/>
-      <w:proofErr w:type="gramEnd"/>
-      <w:r>
-        <w:t xml:space="preserve">     # </w:t>
-      </w:r>
-      <w:proofErr w:type="spellStart"/>
-      <w:r>
-        <w:t>Setup</w:t>
-      </w:r>
-      <w:proofErr w:type="spellEnd"/>
-      <w:r>
-        <w:t xml:space="preserve"> completo automatizado</w:t>
-      </w:r>
-    </w:p>
-    <w:p>
-      <w:proofErr w:type="spellStart"/>
-      <w:r>
-        <w:t>npm</w:t>
-      </w:r>
-      <w:proofErr w:type="spellEnd"/>
-      <w:r>
-        <w:t xml:space="preserve"> run </w:t>
-      </w:r>
-      <w:proofErr w:type="spellStart"/>
-      <w:proofErr w:type="gramStart"/>
-      <w:r>
-        <w:t>dev:verify</w:t>
-      </w:r>
-      <w:proofErr w:type="spellEnd"/>
-      <w:proofErr w:type="gramEnd"/>
-      <w:r>
-        <w:t xml:space="preserve">    # Verificación de 9 componentes</w:t>
-      </w:r>
-    </w:p>
-    <w:p>
-      <w:pPr>
-        <w:rPr>
-          <w:lang w:val="en-US"/>
-        </w:rPr>
-      </w:pPr>
-      <w:proofErr w:type="spellStart"/>
-      <w:r>
-        <w:rPr>
-          <w:lang w:val="en-US"/>
-        </w:rPr>
-        <w:t>npm</w:t>
-      </w:r>
-      <w:proofErr w:type="spellEnd"/>
-      <w:r>
-        <w:rPr>
-          <w:lang w:val="en-US"/>
-        </w:rPr>
-        <w:t xml:space="preserve"> run </w:t>
-      </w:r>
-      <w:proofErr w:type="spellStart"/>
-      <w:proofErr w:type="gramStart"/>
-      <w:r>
-        <w:rPr>
-          <w:lang w:val="en-US"/>
-        </w:rPr>
-        <w:t>docker:up</w:t>
-      </w:r>
-      <w:proofErr w:type="spellEnd"/>
-      <w:proofErr w:type="gramEnd"/>
-      <w:r>
-        <w:rPr>
-          <w:lang w:val="en-US"/>
-        </w:rPr>
-        <w:t xml:space="preserve">     # </w:t>
-      </w:r>
-      <w:proofErr w:type="spellStart"/>
-      <w:r>
-        <w:rPr>
-          <w:lang w:val="en-US"/>
-        </w:rPr>
-        <w:t>Iniciar</w:t>
-      </w:r>
-      <w:proofErr w:type="spellEnd"/>
-      <w:r>
-        <w:rPr>
-          <w:lang w:val="en-US"/>
-        </w:rPr>
-        <w:t xml:space="preserve"> </w:t>
-      </w:r>
-      <w:proofErr w:type="spellStart"/>
-      <w:r>
-        <w:rPr>
-          <w:lang w:val="en-US"/>
-        </w:rPr>
-        <w:t>servicios</w:t>
-      </w:r>
-      <w:proofErr w:type="spellEnd"/>
-      <w:r>
-        <w:rPr>
-          <w:lang w:val="en-US"/>
-        </w:rPr>
-        <w:t xml:space="preserve"> Docker</w:t>
-      </w:r>
-    </w:p>
-    <w:p>
-      <w:pPr>
-        <w:rPr>
-          <w:lang w:val="en-US"/>
-        </w:rPr>
-      </w:pPr>
-      <w:proofErr w:type="spellStart"/>
-      <w:r>
-        <w:rPr>
-          <w:lang w:val="en-US"/>
-        </w:rPr>
-        <w:t>npm</w:t>
-      </w:r>
-      <w:proofErr w:type="spellEnd"/>
-      <w:r>
-        <w:rPr>
-          <w:lang w:val="en-US"/>
-        </w:rPr>
-        <w:t xml:space="preserve"> run </w:t>
-      </w:r>
-      <w:proofErr w:type="spellStart"/>
-      <w:proofErr w:type="gramStart"/>
-      <w:r>
-        <w:rPr>
-          <w:lang w:val="en-US"/>
-        </w:rPr>
-        <w:t>docker:down</w:t>
-      </w:r>
-      <w:proofErr w:type="spellEnd"/>
-      <w:proofErr w:type="gramEnd"/>
-      <w:r>
-        <w:rPr>
-          <w:lang w:val="en-US"/>
-        </w:rPr>
-        <w:t xml:space="preserve">   # </w:t>
-      </w:r>
-      <w:proofErr w:type="spellStart"/>
-      <w:r>
-        <w:rPr>
-          <w:lang w:val="en-US"/>
-        </w:rPr>
-        <w:t>Detener</w:t>
-      </w:r>
-      <w:proofErr w:type="spellEnd"/>
-      <w:r>
-        <w:rPr>
-          <w:lang w:val="en-US"/>
-        </w:rPr>
-        <w:t xml:space="preserve"> </w:t>
-      </w:r>
-      <w:proofErr w:type="spellStart"/>
-      <w:r>
-        <w:rPr>
-          <w:lang w:val="en-US"/>
-        </w:rPr>
-        <w:t>servicios</w:t>
-      </w:r>
-      <w:proofErr w:type="spellEnd"/>
-    </w:p>
-    <w:p>
-      <w:pPr>
-        <w:rPr>
-          <w:lang w:val="en-US"/>
-        </w:rPr>
-      </w:pPr>
-      <w:proofErr w:type="spellStart"/>
-      <w:r>
-        <w:rPr>
-          <w:lang w:val="en-US"/>
-        </w:rPr>
-        <w:t>npm</w:t>
-      </w:r>
-      <w:proofErr w:type="spellEnd"/>
-      <w:r>
-        <w:rPr>
-          <w:lang w:val="en-US"/>
-        </w:rPr>
-        <w:t xml:space="preserve"> run </w:t>
-      </w:r>
-      <w:proofErr w:type="spellStart"/>
-      <w:proofErr w:type="gramStart"/>
-      <w:r>
-        <w:rPr>
-          <w:lang w:val="en-US"/>
-        </w:rPr>
-        <w:t>docker:reset</w:t>
-      </w:r>
-      <w:proofErr w:type="spellEnd"/>
-      <w:proofErr w:type="gramEnd"/>
-      <w:r>
-        <w:rPr>
-          <w:lang w:val="en-US"/>
-        </w:rPr>
-        <w:t xml:space="preserve">  # Reset </w:t>
-      </w:r>
-      <w:proofErr w:type="spellStart"/>
-      <w:r>
-        <w:rPr>
-          <w:lang w:val="en-US"/>
-        </w:rPr>
-        <w:t>completo</w:t>
-      </w:r>
-      <w:proofErr w:type="spellEnd"/>
-      <w:r>
-        <w:rPr>
-          <w:lang w:val="en-US"/>
-        </w:rPr>
-        <w:t xml:space="preserve"> (</w:t>
-      </w:r>
-      <w:proofErr w:type="spellStart"/>
-      <w:r>
-        <w:rPr>
-          <w:lang w:val="en-US"/>
-        </w:rPr>
-        <w:t>elimina</w:t>
-      </w:r>
-      <w:proofErr w:type="spellEnd"/>
-      <w:r>
-        <w:rPr>
-          <w:lang w:val="en-US"/>
-        </w:rPr>
-        <w:t xml:space="preserve"> </w:t>
-      </w:r>
-      <w:proofErr w:type="spellStart"/>
-      <w:r>
-        <w:rPr>
-          <w:lang w:val="en-US"/>
-        </w:rPr>
-        <w:t>volúmenes</w:t>
-      </w:r>
-      <w:proofErr w:type="spellEnd"/>
-      <w:r>
-        <w:rPr>
-          <w:lang w:val="en-US"/>
-        </w:rPr>
-        <w:t>)</w:t>
-      </w:r>
-    </w:p>
-    <w:p>
-      <w:proofErr w:type="spellStart"/>
-      <w:r>
-        <w:t>npm</w:t>
-      </w:r>
-      <w:proofErr w:type="spellEnd"/>
-      <w:r>
-        <w:t xml:space="preserve"> run </w:t>
-      </w:r>
-      <w:proofErr w:type="spellStart"/>
-      <w:proofErr w:type="gramStart"/>
-      <w:r>
-        <w:t>docker:logs</w:t>
-      </w:r>
-      <w:proofErr w:type="spellEnd"/>
-      <w:proofErr w:type="gramEnd"/>
-      <w:r>
-        <w:t xml:space="preserve">   # Ver logs de todos los servicios</w:t>
+      <w:r>
+        <w:t>npm run dev:setup     # Setup completo automatizado</w:t>
+      </w:r>
+    </w:p>
+    <w:p>
+      <w:r>
+        <w:t>npm run dev:verify    # Verificación de 9 componentes</w:t>
+      </w:r>
+    </w:p>
+    <w:p>
+      <w:pPr>
+        <w:rPr>
+          <w:lang w:val="en-US"/>
+        </w:rPr>
+      </w:pPr>
+      <w:r>
+        <w:rPr>
+          <w:lang w:val="en-US"/>
+        </w:rPr>
+        <w:t>npm run docker:up     # Iniciar servicios Docker</w:t>
+      </w:r>
+    </w:p>
+    <w:p>
+      <w:pPr>
+        <w:rPr>
+          <w:lang w:val="en-US"/>
+        </w:rPr>
+      </w:pPr>
+      <w:r>
+        <w:rPr>
+          <w:lang w:val="en-US"/>
+        </w:rPr>
+        <w:t>npm run docker:down   # Detener servicios</w:t>
+      </w:r>
+    </w:p>
+    <w:p>
+      <w:pPr>
+        <w:rPr>
+          <w:lang w:val="en-US"/>
+        </w:rPr>
+      </w:pPr>
+      <w:r>
+        <w:rPr>
+          <w:lang w:val="en-US"/>
+        </w:rPr>
+        <w:t>npm run docker:reset  # Reset completo (elimina volúmenes)</w:t>
+      </w:r>
+    </w:p>
+    <w:p>
+      <w:r>
+        <w:t>npm run docker:logs   # Ver logs de todos los servicios</w:t>
       </w:r>
     </w:p>
     <w:p/>
@@ -5082,7 +3567,7 @@
                     <pic:cNvPicPr/>
                   </pic:nvPicPr>
                   <pic:blipFill>
-                    <a:blip r:embed="rId18"/>
+                    <a:blip r:embed="rId19"/>
                     <a:stretch>
                       <a:fillRect/>
                     </a:stretch>
@@ -5170,7 +3655,7 @@
       <w:r>
         <w:t>Sigue </w:t>
       </w:r>
-      <w:hyperlink r:id="rId19" w:history="1">
+      <w:hyperlink r:id="rId20" w:history="1">
         <w:r>
           <w:rPr>
             <w:rStyle w:val="Hipervnculo"/>
@@ -5205,31 +3690,7 @@
         </w:numPr>
       </w:pPr>
       <w:r>
-        <w:t xml:space="preserve">Lambda </w:t>
-      </w:r>
-      <w:proofErr w:type="spellStart"/>
-      <w:r>
-        <w:t>PostConfirmation</w:t>
-      </w:r>
-      <w:proofErr w:type="spellEnd"/>
-      <w:r>
-        <w:t xml:space="preserve"> (</w:t>
-      </w:r>
-      <w:proofErr w:type="spellStart"/>
-      <w:r>
-        <w:t>Cognito</w:t>
-      </w:r>
-      <w:proofErr w:type="spellEnd"/>
-      <w:r>
-        <w:t xml:space="preserve"> → Prisma </w:t>
-      </w:r>
-      <w:proofErr w:type="spellStart"/>
-      <w:r>
-        <w:t>sync</w:t>
-      </w:r>
-      <w:proofErr w:type="spellEnd"/>
-      <w:r>
-        <w:t>)</w:t>
+        <w:t>Lambda PostConfirmation (Cognito → Prisma sync)</w:t>
       </w:r>
     </w:p>
     <w:p>
@@ -5240,15 +3701,7 @@
         </w:numPr>
       </w:pPr>
       <w:r>
-        <w:t>API middleware para extraer </w:t>
-      </w:r>
-      <w:proofErr w:type="spellStart"/>
-      <w:r>
-        <w:t>company_id</w:t>
-      </w:r>
-      <w:proofErr w:type="spellEnd"/>
-      <w:r>
-        <w:t> del JWT</w:t>
+        <w:t>API middleware para extraer company_id del JWT</w:t>
       </w:r>
     </w:p>
     <w:p>
@@ -5259,29 +3712,8 @@
         </w:numPr>
       </w:pPr>
       <w:r>
-        <w:t xml:space="preserve">CRUD </w:t>
-      </w:r>
-      <w:proofErr w:type="spellStart"/>
-      <w:r>
-        <w:t>APIs</w:t>
-      </w:r>
-      <w:proofErr w:type="spellEnd"/>
-      <w:r>
-        <w:t xml:space="preserve"> para </w:t>
-      </w:r>
-      <w:proofErr w:type="spellStart"/>
-      <w:r>
-        <w:t>Users</w:t>
-      </w:r>
-      <w:proofErr w:type="spellEnd"/>
-      <w:r>
-        <w:t xml:space="preserve"> &amp; </w:t>
-      </w:r>
-      <w:proofErr w:type="spellStart"/>
-      <w:r>
-        <w:t>Companies</w:t>
-      </w:r>
-      <w:proofErr w:type="spellEnd"/>
+        <w:t>CRUD APIs para Users &amp; Companies</w:t>
+      </w:r>
     </w:p>
     <w:p>
       <w:pPr>
@@ -5291,15 +3723,7 @@
         </w:numPr>
       </w:pPr>
       <w:r>
-        <w:t xml:space="preserve">Consolidar </w:t>
-      </w:r>
-      <w:proofErr w:type="spellStart"/>
-      <w:r>
-        <w:t>ADRs</w:t>
-      </w:r>
-      <w:proofErr w:type="spellEnd"/>
-      <w:r>
-        <w:t xml:space="preserve"> en ARCHITECTURE.md</w:t>
+        <w:t>Consolidar ADRs en ARCHITECTURE.md</w:t>
       </w:r>
     </w:p>
     <w:p>
@@ -5337,23 +3761,7 @@
     </w:p>
     <w:p>
       <w:r>
-        <w:t xml:space="preserve">@devops-nexoERP Necesito configurar AWS </w:t>
-      </w:r>
-      <w:proofErr w:type="spellStart"/>
-      <w:r>
-        <w:t>Amplify</w:t>
-      </w:r>
-      <w:proofErr w:type="spellEnd"/>
-      <w:r>
-        <w:t xml:space="preserve"> Gen 2 con </w:t>
-      </w:r>
-      <w:proofErr w:type="spellStart"/>
-      <w:r>
-        <w:t>Cognito</w:t>
-      </w:r>
-      <w:proofErr w:type="spellEnd"/>
-      <w:r>
-        <w:t>, S3, y RDS</w:t>
+        <w:t>@devops-nexoERP Necesito configurar AWS Amplify Gen 2 con Cognito, S3, y RDS</w:t>
       </w:r>
     </w:p>
     <w:p/>
@@ -5364,15 +3772,7 @@
     </w:p>
     <w:p>
       <w:r>
-        <w:t xml:space="preserve">@uxui-designer-nexoERP Necesito implementar CRUD de usuarios con </w:t>
-      </w:r>
-      <w:proofErr w:type="spellStart"/>
-      <w:r>
-        <w:t>TanStack</w:t>
-      </w:r>
-      <w:proofErr w:type="spellEnd"/>
-      <w:r>
-        <w:t xml:space="preserve"> Table</w:t>
+        <w:t>@uxui-designer-nexoERP Necesito implementar CRUD de usuarios con TanStack Table</w:t>
       </w:r>
     </w:p>
     <w:p/>
@@ -5383,42 +3783,19 @@
     </w:p>
     <w:p>
       <w:r>
-        <w:t xml:space="preserve">@security-auditor-nexoERP Necesito auditoría completa antes de </w:t>
-      </w:r>
-      <w:proofErr w:type="spellStart"/>
-      <w:r>
-        <w:t>merge</w:t>
-      </w:r>
-      <w:proofErr w:type="spellEnd"/>
-      <w:r>
-        <w:t xml:space="preserve"> a </w:t>
-      </w:r>
-      <w:proofErr w:type="spellStart"/>
-      <w:r>
-        <w:t>staging</w:t>
-      </w:r>
-      <w:proofErr w:type="spellEnd"/>
+        <w:t>@security-auditor-nexoERP Necesito auditoría completa antes de merge a staging</w:t>
+      </w:r>
     </w:p>
     <w:p/>
     <w:p>
       <w:r>
-        <w:t xml:space="preserve"># Para validación de </w:t>
-      </w:r>
-      <w:proofErr w:type="spellStart"/>
-      <w:r>
-        <w:t>tests</w:t>
-      </w:r>
-      <w:proofErr w:type="spellEnd"/>
-    </w:p>
-    <w:p>
-      <w:r>
-        <w:t xml:space="preserve">@qa-nexoERP Necesito revisión de cobertura de </w:t>
-      </w:r>
-      <w:proofErr w:type="spellStart"/>
-      <w:r>
-        <w:t>tests</w:t>
-      </w:r>
-      <w:proofErr w:type="spellEnd"/>
+        <w:t># Para validación de tests</w:t>
+      </w:r>
+    </w:p>
+    <w:p>
+      <w:r>
+        <w:t>@qa-nexoERP Necesito revisión de cobertura de tests</w:t>
+      </w:r>
     </w:p>
     <w:p/>
     <w:p>
@@ -5624,13 +4001,8 @@
             <w:hideMark/>
           </w:tcPr>
           <w:p>
-            <w:proofErr w:type="spellStart"/>
-            <w:r>
-              <w:t>Staging</w:t>
-            </w:r>
-            <w:proofErr w:type="spellEnd"/>
-            <w:r>
-              <w:t xml:space="preserve"> URL (/)</w:t>
+            <w:r>
+              <w:t>Staging URL (/)</w:t>
             </w:r>
           </w:p>
         </w:tc>
@@ -5660,15 +4032,7 @@
               <w:t>200 OK</w:t>
             </w:r>
             <w:r>
-              <w:t> - "</w:t>
-            </w:r>
-            <w:proofErr w:type="spellStart"/>
-            <w:r>
-              <w:t>NexoERP</w:t>
-            </w:r>
-            <w:proofErr w:type="spellEnd"/>
-            <w:r>
-              <w:t>"</w:t>
+              <w:t> - "NexoERP"</w:t>
             </w:r>
           </w:p>
         </w:tc>
@@ -5695,15 +4059,7 @@
           </w:tcPr>
           <w:p>
             <w:r>
-              <w:t>Dashboard (/</w:t>
-            </w:r>
-            <w:proofErr w:type="spellStart"/>
-            <w:r>
-              <w:t>dashboard</w:t>
-            </w:r>
-            <w:proofErr w:type="spellEnd"/>
-            <w:r>
-              <w:t>)</w:t>
+              <w:t>Dashboard (/dashboard)</w:t>
             </w:r>
           </w:p>
         </w:tc>
@@ -5759,29 +4115,8 @@
             <w:hideMark/>
           </w:tcPr>
           <w:p>
-            <w:proofErr w:type="spellStart"/>
-            <w:r>
-              <w:t>Users</w:t>
-            </w:r>
-            <w:proofErr w:type="spellEnd"/>
-            <w:r>
-              <w:t xml:space="preserve"> (/</w:t>
-            </w:r>
-            <w:proofErr w:type="spellStart"/>
-            <w:r>
-              <w:t>dashboard</w:t>
-            </w:r>
-            <w:proofErr w:type="spellEnd"/>
-            <w:r>
-              <w:t>/</w:t>
-            </w:r>
-            <w:proofErr w:type="spellStart"/>
-            <w:r>
-              <w:t>users</w:t>
-            </w:r>
-            <w:proofErr w:type="spellEnd"/>
-            <w:r>
-              <w:t>)</w:t>
+            <w:r>
+              <w:t>Users (/dashboard/users)</w:t>
             </w:r>
           </w:p>
         </w:tc>
@@ -5846,21 +4181,7 @@
               <w:rPr>
                 <w:lang w:val="en-US"/>
               </w:rPr>
-              <w:t>API (/</w:t>
-            </w:r>
-            <w:proofErr w:type="spellStart"/>
-            <w:r>
-              <w:rPr>
-                <w:lang w:val="en-US"/>
-              </w:rPr>
-              <w:t>api</w:t>
-            </w:r>
-            <w:proofErr w:type="spellEnd"/>
-            <w:r>
-              <w:rPr>
-                <w:lang w:val="en-US"/>
-              </w:rPr>
-              <w:t>/v1/core/users)</w:t>
+              <w:t>API (/api/v1/core/users)</w:t>
             </w:r>
           </w:p>
         </w:tc>
@@ -5890,15 +4211,7 @@
               <w:t>400</w:t>
             </w:r>
             <w:r>
-              <w:t xml:space="preserve"> - Correcto (requiere </w:t>
-            </w:r>
-            <w:proofErr w:type="spellStart"/>
-            <w:r>
-              <w:t>auth</w:t>
-            </w:r>
-            <w:proofErr w:type="spellEnd"/>
-            <w:r>
-              <w:t>)</w:t>
+              <w:t> - Correcto (requiere auth)</w:t>
             </w:r>
           </w:p>
         </w:tc>
@@ -5924,13 +4237,8 @@
             <w:hideMark/>
           </w:tcPr>
           <w:p>
-            <w:proofErr w:type="spellStart"/>
-            <w:r>
-              <w:t>Headers</w:t>
-            </w:r>
-            <w:proofErr w:type="spellEnd"/>
-            <w:r>
-              <w:t xml:space="preserve"> de seguridad</w:t>
+            <w:r>
+              <w:t>Headers de seguridad</w:t>
             </w:r>
           </w:p>
         </w:tc>
@@ -5986,21 +4294,8 @@
             <w:hideMark/>
           </w:tcPr>
           <w:p>
-            <w:proofErr w:type="spellStart"/>
-            <w:r>
-              <w:t>Tests</w:t>
-            </w:r>
-            <w:proofErr w:type="spellEnd"/>
-            <w:r>
-              <w:t xml:space="preserve"> locales (</w:t>
-            </w:r>
-            <w:proofErr w:type="spellStart"/>
-            <w:r>
-              <w:t>Vitest</w:t>
-            </w:r>
-            <w:proofErr w:type="spellEnd"/>
-            <w:r>
-              <w:t>)</w:t>
+            <w:r>
+              <w:t>Tests locales (Vitest)</w:t>
             </w:r>
           </w:p>
         </w:tc>
@@ -6057,11 +4352,9 @@
             <w:hideMark/>
           </w:tcPr>
           <w:p>
-            <w:proofErr w:type="spellStart"/>
             <w:r>
               <w:t>CloudFront</w:t>
             </w:r>
-            <w:proofErr w:type="spellEnd"/>
           </w:p>
         </w:tc>
         <w:tc>
@@ -6096,62 +4389,22 @@
           <w:b/>
           <w:bCs/>
         </w:rPr>
-        <w:t xml:space="preserve">Fase 1 </w:t>
-      </w:r>
-      <w:proofErr w:type="spellStart"/>
+        <w:t>Fase 1 deployada y validada en staging.</w:t>
+      </w:r>
+    </w:p>
+    <w:p>
+      <w:r>
+        <w:t>Ahora que todo está confirmado, el siguiente paso según el documento es </w:t>
+      </w:r>
       <w:r>
         <w:rPr>
           <w:b/>
           <w:bCs/>
         </w:rPr>
-        <w:t>deployada</w:t>
-      </w:r>
-      <w:proofErr w:type="spellEnd"/>
-      <w:r>
-        <w:rPr>
-          <w:b/>
-          <w:bCs/>
-        </w:rPr>
-        <w:t xml:space="preserve"> y validada en </w:t>
-      </w:r>
-      <w:proofErr w:type="spellStart"/>
-      <w:r>
-        <w:rPr>
-          <w:b/>
-          <w:bCs/>
-        </w:rPr>
-        <w:t>staging</w:t>
-      </w:r>
-      <w:proofErr w:type="spellEnd"/>
-      <w:r>
-        <w:rPr>
-          <w:b/>
-          <w:bCs/>
-        </w:rPr>
-        <w:t>.</w:t>
-      </w:r>
-    </w:p>
-    <w:p>
-      <w:r>
-        <w:t>Ahora que todo está confirmado, el siguiente paso según el documento es </w:t>
-      </w:r>
-      <w:r>
-        <w:rPr>
-          <w:b/>
-          <w:bCs/>
-        </w:rPr>
         <w:t>Fase 1.5: Completar el módulo Core</w:t>
       </w:r>
       <w:r>
-        <w:t xml:space="preserve">. Los </w:t>
-      </w:r>
-      <w:proofErr w:type="spellStart"/>
-      <w:r>
-        <w:t>items</w:t>
-      </w:r>
-      <w:proofErr w:type="spellEnd"/>
-      <w:r>
-        <w:t xml:space="preserve"> pendientes son:</w:t>
+        <w:t>. Los items pendientes son:</w:t>
       </w:r>
     </w:p>
     <w:p>
@@ -6170,59 +4423,13 @@
           <w:bCs/>
           <w:lang w:val="en-US"/>
         </w:rPr>
-        <w:t xml:space="preserve">API Middleware </w:t>
-      </w:r>
-      <w:proofErr w:type="gramStart"/>
-      <w:r>
-        <w:rPr>
-          <w:b/>
-          <w:bCs/>
-          <w:lang w:val="en-US"/>
-        </w:rPr>
-        <w:t>auth</w:t>
-      </w:r>
-      <w:proofErr w:type="gramEnd"/>
-      <w:r>
-        <w:rPr>
-          <w:lang w:val="en-US"/>
-        </w:rPr>
-        <w:t xml:space="preserve"> - </w:t>
-      </w:r>
-      <w:proofErr w:type="spellStart"/>
-      <w:r>
-        <w:rPr>
-          <w:lang w:val="en-US"/>
-        </w:rPr>
-        <w:t>Extraer</w:t>
-      </w:r>
-      <w:proofErr w:type="spellEnd"/>
-      <w:r>
-        <w:rPr>
-          <w:lang w:val="en-US"/>
-        </w:rPr>
-        <w:t> </w:t>
-      </w:r>
-      <w:proofErr w:type="spellStart"/>
-      <w:proofErr w:type="gramStart"/>
-      <w:r>
-        <w:rPr>
-          <w:lang w:val="en-US"/>
-        </w:rPr>
-        <w:t>company</w:t>
-      </w:r>
-      <w:proofErr w:type="gramEnd"/>
-      <w:r>
-        <w:rPr>
-          <w:lang w:val="en-US"/>
-        </w:rPr>
-        <w:t>_id</w:t>
-      </w:r>
-      <w:proofErr w:type="spellEnd"/>
-      <w:r>
-        <w:rPr>
-          <w:lang w:val="en-US"/>
-        </w:rPr>
-        <w:t> del JWT Cognito</w:t>
+        <w:t>API Middleware auth</w:t>
+      </w:r>
+      <w:r>
+        <w:rPr>
+          <w:lang w:val="en-US"/>
+        </w:rPr>
+        <w:t> - Extraer company_id del JWT Cognito</w:t>
       </w:r>
     </w:p>
     <w:p>
@@ -6237,32 +4444,11 @@
           <w:b/>
           <w:bCs/>
         </w:rPr>
-        <w:t xml:space="preserve">Conectar </w:t>
-      </w:r>
-      <w:proofErr w:type="spellStart"/>
-      <w:r>
-        <w:rPr>
-          <w:b/>
-          <w:bCs/>
-        </w:rPr>
-        <w:t>frontend</w:t>
-      </w:r>
-      <w:proofErr w:type="spellEnd"/>
-      <w:r>
-        <w:rPr>
-          <w:b/>
-          <w:bCs/>
-        </w:rPr>
-        <w:t xml:space="preserve"> a API real</w:t>
-      </w:r>
-      <w:r>
-        <w:t xml:space="preserve"> - Reemplazar datos </w:t>
-      </w:r>
-      <w:proofErr w:type="spellStart"/>
-      <w:r>
-        <w:t>mock</w:t>
-      </w:r>
-      <w:proofErr w:type="spellEnd"/>
+        <w:t>Conectar frontend a API real</w:t>
+      </w:r>
+      <w:r>
+        <w:t> - Reemplazar datos mock</w:t>
+      </w:r>
     </w:p>
     <w:p>
       <w:pPr>
@@ -6296,31 +4482,13 @@
           <w:numId w:val="6"/>
         </w:numPr>
       </w:pPr>
-      <w:proofErr w:type="spellStart"/>
       <w:r>
         <w:rPr>
           <w:b/>
           <w:bCs/>
         </w:rPr>
-        <w:t>Tests</w:t>
-      </w:r>
-      <w:proofErr w:type="spellEnd"/>
-      <w:r>
-        <w:rPr>
-          <w:b/>
-          <w:bCs/>
-        </w:rPr>
-        <w:t xml:space="preserve"> E2E de API </w:t>
-      </w:r>
-      <w:proofErr w:type="spellStart"/>
-      <w:r>
-        <w:rPr>
-          <w:b/>
-          <w:bCs/>
-        </w:rPr>
-        <w:t>Routes</w:t>
-      </w:r>
-      <w:proofErr w:type="spellEnd"/>
+        <w:t>Tests E2E de API Routes</w:t>
+      </w:r>
     </w:p>
     <w:p>
       <w:pPr>
@@ -6334,25 +4502,11 @@
           <w:b/>
           <w:bCs/>
         </w:rPr>
-        <w:t>Página /</w:t>
-      </w:r>
-      <w:proofErr w:type="spellStart"/>
-      <w:r>
-        <w:rPr>
-          <w:b/>
-          <w:bCs/>
-        </w:rPr>
-        <w:t>login</w:t>
-      </w:r>
-      <w:proofErr w:type="spellEnd"/>
-      <w:r>
-        <w:t xml:space="preserve"> - Flujo de autenticación con </w:t>
-      </w:r>
-      <w:proofErr w:type="spellStart"/>
-      <w:r>
-        <w:t>Cognito</w:t>
-      </w:r>
-      <w:proofErr w:type="spellEnd"/>
+        <w:t>Página /login</w:t>
+      </w:r>
+      <w:r>
+        <w:t> - Flujo de autenticación con Cognito</w:t>
+      </w:r>
     </w:p>
     <w:p/>
     <w:p/>
@@ -6406,7 +4560,7 @@
         </w:rPr>
         <w:br/>
       </w:r>
-      <w:hyperlink r:id="rId20" w:history="1">
+      <w:hyperlink r:id="rId21" w:history="1">
         <w:r>
           <w:rPr>
             <w:rStyle w:val="Hipervnculo"/>
@@ -6424,28 +4578,18 @@
         </w:numPr>
       </w:pPr>
       <w:r>
-        <w:t xml:space="preserve">Contexto de </w:t>
-      </w:r>
-      <w:proofErr w:type="spellStart"/>
-      <w:r>
-        <w:t>auth</w:t>
-      </w:r>
-      <w:proofErr w:type="spellEnd"/>
-      <w:r>
-        <w:t xml:space="preserve"> tipado y errores de autenticación:</w:t>
+        <w:t>Contexto de auth tipado y errores de autenticación:</w:t>
       </w:r>
       <w:r>
         <w:br/>
       </w:r>
-      <w:hyperlink r:id="rId21" w:history="1">
-        <w:proofErr w:type="spellStart"/>
+      <w:hyperlink r:id="rId22" w:history="1">
         <w:r>
           <w:rPr>
             <w:rStyle w:val="Hipervnculo"/>
           </w:rPr>
           <w:t>auth.ts</w:t>
         </w:r>
-        <w:proofErr w:type="spellEnd"/>
       </w:hyperlink>
     </w:p>
     <w:p>
@@ -6461,15 +4605,13 @@
       <w:r>
         <w:br/>
       </w:r>
-      <w:hyperlink r:id="rId22" w:history="1">
-        <w:proofErr w:type="spellStart"/>
+      <w:hyperlink r:id="rId23" w:history="1">
         <w:r>
           <w:rPr>
             <w:rStyle w:val="Hipervnculo"/>
           </w:rPr>
           <w:t>request-auth.ts</w:t>
         </w:r>
-        <w:proofErr w:type="spellEnd"/>
       </w:hyperlink>
     </w:p>
     <w:p>
@@ -6508,13 +4650,8 @@
         </w:numPr>
       </w:pPr>
       <w:r>
-        <w:t xml:space="preserve">Verifica JWT contra JWKS de </w:t>
-      </w:r>
-      <w:proofErr w:type="spellStart"/>
-      <w:r>
-        <w:t>Cognito</w:t>
-      </w:r>
-      <w:proofErr w:type="spellEnd"/>
+        <w:t>Verifica JWT contra JWKS de Cognito</w:t>
+      </w:r>
     </w:p>
     <w:p>
       <w:pPr>
@@ -6532,7 +4669,7 @@
         </w:rPr>
         <w:t>Inyecta headers internos </w:t>
       </w:r>
-      <w:hyperlink r:id="rId23" w:history="1">
+      <w:hyperlink r:id="rId24" w:history="1">
         <w:r>
           <w:rPr>
             <w:rStyle w:val="Hipervnculo"/>
@@ -6547,7 +4684,7 @@
         </w:rPr>
         <w:t>, </w:t>
       </w:r>
-      <w:hyperlink r:id="rId24" w:history="1">
+      <w:hyperlink r:id="rId25" w:history="1">
         <w:r>
           <w:rPr>
             <w:rStyle w:val="Hipervnculo"/>
@@ -6562,7 +4699,7 @@
         </w:rPr>
         <w:t>, </w:t>
       </w:r>
-      <w:hyperlink r:id="rId25" w:history="1">
+      <w:hyperlink r:id="rId26" w:history="1">
         <w:r>
           <w:rPr>
             <w:rStyle w:val="Hipervnculo"/>
@@ -6583,7 +4720,7 @@
         </w:rPr>
         <w:br/>
       </w:r>
-      <w:hyperlink r:id="rId26" w:history="1">
+      <w:hyperlink r:id="rId27" w:history="1">
         <w:r>
           <w:rPr>
             <w:rStyle w:val="Hipervnculo"/>
@@ -6609,7 +4746,7 @@
         </w:rPr>
         <w:t>Integración en endpoints Core Users (elimina </w:t>
       </w:r>
-      <w:hyperlink r:id="rId27" w:history="1">
+      <w:hyperlink r:id="rId28" w:history="1">
         <w:r>
           <w:rPr>
             <w:rStyle w:val="Hipervnculo"/>
@@ -6630,8 +4767,7 @@
         </w:rPr>
         <w:br/>
       </w:r>
-      <w:hyperlink r:id="rId28" w:history="1">
-        <w:proofErr w:type="spellStart"/>
+      <w:hyperlink r:id="rId29" w:history="1">
         <w:r>
           <w:rPr>
             <w:rStyle w:val="Hipervnculo"/>
@@ -6639,7 +4775,6 @@
           </w:rPr>
           <w:t>route.ts</w:t>
         </w:r>
-        <w:proofErr w:type="spellEnd"/>
       </w:hyperlink>
       <w:r>
         <w:rPr>
@@ -6647,23 +4782,14 @@
         </w:rPr>
         <w:br/>
       </w:r>
-      <w:hyperlink r:id="rId29" w:history="1">
+      <w:hyperlink r:id="rId30" w:history="1">
         <w:r>
           <w:rPr>
             <w:rStyle w:val="Hipervnculo"/>
             <w:lang w:val="en-US"/>
           </w:rPr>
-          <w:t>src/app/api/v1/core/users/[id]/</w:t>
+          <w:t>src/app/api/v1/core/users/[id]/route.ts</w:t>
         </w:r>
-        <w:proofErr w:type="spellStart"/>
-        <w:r>
-          <w:rPr>
-            <w:rStyle w:val="Hipervnculo"/>
-            <w:lang w:val="en-US"/>
-          </w:rPr>
-          <w:t>route.ts</w:t>
-        </w:r>
-        <w:proofErr w:type="spellEnd"/>
       </w:hyperlink>
     </w:p>
     <w:p>
@@ -6674,28 +4800,18 @@
         </w:numPr>
       </w:pPr>
       <w:r>
-        <w:t xml:space="preserve">Variables de entorno </w:t>
-      </w:r>
-      <w:proofErr w:type="spellStart"/>
-      <w:r>
-        <w:t>Cognito</w:t>
-      </w:r>
-      <w:proofErr w:type="spellEnd"/>
-      <w:r>
-        <w:t xml:space="preserve"> agregadas al validador server:</w:t>
+        <w:t>Variables de entorno Cognito agregadas al validador server:</w:t>
       </w:r>
       <w:r>
         <w:br/>
       </w:r>
-      <w:hyperlink r:id="rId30" w:history="1">
-        <w:proofErr w:type="spellStart"/>
+      <w:hyperlink r:id="rId31" w:history="1">
         <w:r>
           <w:rPr>
             <w:rStyle w:val="Hipervnculo"/>
           </w:rPr>
           <w:t>env.ts</w:t>
         </w:r>
-        <w:proofErr w:type="spellEnd"/>
       </w:hyperlink>
     </w:p>
     <w:p>
@@ -6711,28 +4827,24 @@
       <w:r>
         <w:br/>
       </w:r>
-      <w:hyperlink r:id="rId31" w:history="1">
-        <w:proofErr w:type="spellStart"/>
+      <w:hyperlink r:id="rId32" w:history="1">
         <w:r>
           <w:rPr>
             <w:rStyle w:val="Hipervnculo"/>
           </w:rPr>
           <w:t>package.json</w:t>
         </w:r>
-        <w:proofErr w:type="spellEnd"/>
       </w:hyperlink>
       <w:r>
         <w:br/>
       </w:r>
-      <w:hyperlink r:id="rId32" w:history="1">
-        <w:proofErr w:type="spellStart"/>
+      <w:hyperlink r:id="rId33" w:history="1">
         <w:r>
           <w:rPr>
             <w:rStyle w:val="Hipervnculo"/>
           </w:rPr>
           <w:t>package-lock.json</w:t>
         </w:r>
-        <w:proofErr w:type="spellEnd"/>
       </w:hyperlink>
     </w:p>
     <w:p>
@@ -6742,51 +4854,872 @@
           <w:numId w:val="9"/>
         </w:numPr>
       </w:pPr>
-      <w:proofErr w:type="spellStart"/>
-      <w:r>
-        <w:t>Tests</w:t>
-      </w:r>
-      <w:proofErr w:type="spellEnd"/>
-      <w:r>
-        <w:t xml:space="preserve"> nuevos de </w:t>
-      </w:r>
-      <w:proofErr w:type="spellStart"/>
-      <w:r>
-        <w:t>auth</w:t>
-      </w:r>
-      <w:proofErr w:type="spellEnd"/>
-      <w:r>
-        <w:t>:</w:t>
+      <w:r>
+        <w:t>Tests nuevos de auth:</w:t>
       </w:r>
       <w:r>
         <w:br/>
       </w:r>
-      <w:hyperlink r:id="rId33" w:history="1">
-        <w:proofErr w:type="spellStart"/>
+      <w:hyperlink r:id="rId34" w:history="1">
         <w:r>
           <w:rPr>
             <w:rStyle w:val="Hipervnculo"/>
           </w:rPr>
           <w:t>cognito-jwt.test.ts</w:t>
         </w:r>
-        <w:proofErr w:type="spellEnd"/>
       </w:hyperlink>
       <w:r>
         <w:br/>
       </w:r>
-      <w:hyperlink r:id="rId34" w:history="1">
-        <w:proofErr w:type="spellStart"/>
+      <w:hyperlink r:id="rId35" w:history="1">
         <w:r>
           <w:rPr>
             <w:rStyle w:val="Hipervnculo"/>
           </w:rPr>
           <w:t>request-auth.test.ts</w:t>
         </w:r>
-        <w:proofErr w:type="spellEnd"/>
       </w:hyperlink>
     </w:p>
     <w:p/>
     <w:p/>
+    <w:p/>
+    <w:p/>
+    <w:p/>
+    <w:p>
+      <w:r>
+        <w:lastRenderedPageBreak/>
+        <w:t>CONTACTOS</w:t>
+      </w:r>
+    </w:p>
+    <w:p>
+      <w:pPr>
+        <w:rPr>
+          <w:lang w:val="en-US"/>
+        </w:rPr>
+      </w:pPr>
+      <w:r>
+        <w:rPr>
+          <w:noProof/>
+        </w:rPr>
+        <w:drawing>
+          <wp:inline distT="0" distB="0" distL="0" distR="0" wp14:anchorId="6A23DA8A" wp14:editId="0272A86D">
+            <wp:extent cx="5612130" cy="1900555"/>
+            <wp:effectExtent l="0" t="0" r="7620" b="4445"/>
+            <wp:docPr id="283997491" name="Imagen 1"/>
+            <wp:cNvGraphicFramePr>
+              <a:graphicFrameLocks xmlns:a="http://schemas.openxmlformats.org/drawingml/2006/main" noChangeAspect="1"/>
+            </wp:cNvGraphicFramePr>
+            <a:graphic xmlns:a="http://schemas.openxmlformats.org/drawingml/2006/main">
+              <a:graphicData uri="http://schemas.openxmlformats.org/drawingml/2006/picture">
+                <pic:pic xmlns:pic="http://schemas.openxmlformats.org/drawingml/2006/picture">
+                  <pic:nvPicPr>
+                    <pic:cNvPr id="283997491" name=""/>
+                    <pic:cNvPicPr/>
+                  </pic:nvPicPr>
+                  <pic:blipFill>
+                    <a:blip r:embed="rId36"/>
+                    <a:stretch>
+                      <a:fillRect/>
+                    </a:stretch>
+                  </pic:blipFill>
+                  <pic:spPr>
+                    <a:xfrm>
+                      <a:off x="0" y="0"/>
+                      <a:ext cx="5612130" cy="1900555"/>
+                    </a:xfrm>
+                    <a:prstGeom prst="rect">
+                      <a:avLst/>
+                    </a:prstGeom>
+                  </pic:spPr>
+                </pic:pic>
+              </a:graphicData>
+            </a:graphic>
+          </wp:inline>
+        </w:drawing>
+      </w:r>
+    </w:p>
+    <w:p/>
+    <w:p>
+      <w:r>
+        <w:rPr>
+          <w:noProof/>
+        </w:rPr>
+        <w:drawing>
+          <wp:inline distT="0" distB="0" distL="0" distR="0" wp14:anchorId="5C5A4BDE" wp14:editId="76DFBD33">
+            <wp:extent cx="5612130" cy="3872230"/>
+            <wp:effectExtent l="0" t="0" r="7620" b="0"/>
+            <wp:docPr id="920110753" name="Imagen 1"/>
+            <wp:cNvGraphicFramePr>
+              <a:graphicFrameLocks xmlns:a="http://schemas.openxmlformats.org/drawingml/2006/main" noChangeAspect="1"/>
+            </wp:cNvGraphicFramePr>
+            <a:graphic xmlns:a="http://schemas.openxmlformats.org/drawingml/2006/main">
+              <a:graphicData uri="http://schemas.openxmlformats.org/drawingml/2006/picture">
+                <pic:pic xmlns:pic="http://schemas.openxmlformats.org/drawingml/2006/picture">
+                  <pic:nvPicPr>
+                    <pic:cNvPr id="920110753" name=""/>
+                    <pic:cNvPicPr/>
+                  </pic:nvPicPr>
+                  <pic:blipFill>
+                    <a:blip r:embed="rId37"/>
+                    <a:stretch>
+                      <a:fillRect/>
+                    </a:stretch>
+                  </pic:blipFill>
+                  <pic:spPr>
+                    <a:xfrm>
+                      <a:off x="0" y="0"/>
+                      <a:ext cx="5612130" cy="3872230"/>
+                    </a:xfrm>
+                    <a:prstGeom prst="rect">
+                      <a:avLst/>
+                    </a:prstGeom>
+                  </pic:spPr>
+                </pic:pic>
+              </a:graphicData>
+            </a:graphic>
+          </wp:inline>
+        </w:drawing>
+      </w:r>
+    </w:p>
+    <w:p/>
+    <w:p>
+      <w:pPr>
+        <w:numPr>
+          <w:ilvl w:val="0"/>
+          <w:numId w:val="10"/>
+        </w:numPr>
+      </w:pPr>
+      <w:r>
+        <w:t>prisma/schema/core.prisma</w:t>
+      </w:r>
+    </w:p>
+    <w:p>
+      <w:pPr>
+        <w:pStyle w:val="prc-actionlist-actionlistitem-so4vc"/>
+        <w:numPr>
+          <w:ilvl w:val="0"/>
+          <w:numId w:val="10"/>
+        </w:numPr>
+        <w:shd w:val="clear" w:color="auto" w:fill="0D1117"/>
+        <w:rPr>
+          <w:rFonts w:ascii="Segoe UI" w:hAnsi="Segoe UI" w:cs="Segoe UI"/>
+          <w:color w:val="F0F6FC"/>
+          <w:sz w:val="21"/>
+          <w:szCs w:val="21"/>
+        </w:rPr>
+      </w:pPr>
+      <w:r>
+        <w:rPr>
+          <w:rStyle w:val="input-monospace"/>
+          <w:rFonts w:ascii="Consolas" w:eastAsiaTheme="majorEastAsia" w:hAnsi="Consolas" w:cs="Segoe UI"/>
+          <w:color w:val="F0F6FC"/>
+          <w:sz w:val="18"/>
+          <w:szCs w:val="18"/>
+        </w:rPr>
+        <w:t>prisma/seed/index.ts</w:t>
+      </w:r>
+    </w:p>
+    <w:p>
+      <w:pPr>
+        <w:pStyle w:val="prc-actionlist-actionlistitem-so4vc"/>
+        <w:numPr>
+          <w:ilvl w:val="0"/>
+          <w:numId w:val="10"/>
+        </w:numPr>
+        <w:shd w:val="clear" w:color="auto" w:fill="0D1117"/>
+        <w:rPr>
+          <w:rFonts w:ascii="Segoe UI" w:hAnsi="Segoe UI" w:cs="Segoe UI"/>
+          <w:color w:val="F0F6FC"/>
+          <w:sz w:val="21"/>
+          <w:szCs w:val="21"/>
+          <w:lang w:val="en-US"/>
+        </w:rPr>
+      </w:pPr>
+      <w:r>
+        <w:rPr>
+          <w:rStyle w:val="input-monospace"/>
+          <w:rFonts w:ascii="Consolas" w:eastAsiaTheme="majorEastAsia" w:hAnsi="Consolas" w:cs="Segoe UI"/>
+          <w:color w:val="F0F6FC"/>
+          <w:sz w:val="18"/>
+          <w:szCs w:val="18"/>
+          <w:lang w:val="en-US"/>
+        </w:rPr>
+        <w:t>src/lib/db/tenant-extension.ts</w:t>
+      </w:r>
+    </w:p>
+    <w:p>
+      <w:pPr>
+        <w:rPr>
+          <w:lang w:val="en-US"/>
+        </w:rPr>
+      </w:pPr>
+    </w:p>
+    <w:p>
+      <w:r>
+        <w:rPr>
+          <w:noProof/>
+        </w:rPr>
+        <w:lastRenderedPageBreak/>
+        <w:drawing>
+          <wp:inline distT="0" distB="0" distL="0" distR="0" wp14:anchorId="7AD1CD0A" wp14:editId="506FD6E5">
+            <wp:extent cx="5612130" cy="1982470"/>
+            <wp:effectExtent l="0" t="0" r="7620" b="0"/>
+            <wp:docPr id="819053236" name="Imagen 1"/>
+            <wp:cNvGraphicFramePr>
+              <a:graphicFrameLocks xmlns:a="http://schemas.openxmlformats.org/drawingml/2006/main" noChangeAspect="1"/>
+            </wp:cNvGraphicFramePr>
+            <a:graphic xmlns:a="http://schemas.openxmlformats.org/drawingml/2006/main">
+              <a:graphicData uri="http://schemas.openxmlformats.org/drawingml/2006/picture">
+                <pic:pic xmlns:pic="http://schemas.openxmlformats.org/drawingml/2006/picture">
+                  <pic:nvPicPr>
+                    <pic:cNvPr id="819053236" name=""/>
+                    <pic:cNvPicPr/>
+                  </pic:nvPicPr>
+                  <pic:blipFill>
+                    <a:blip r:embed="rId38"/>
+                    <a:stretch>
+                      <a:fillRect/>
+                    </a:stretch>
+                  </pic:blipFill>
+                  <pic:spPr>
+                    <a:xfrm>
+                      <a:off x="0" y="0"/>
+                      <a:ext cx="5612130" cy="1982470"/>
+                    </a:xfrm>
+                    <a:prstGeom prst="rect">
+                      <a:avLst/>
+                    </a:prstGeom>
+                  </pic:spPr>
+                </pic:pic>
+              </a:graphicData>
+            </a:graphic>
+          </wp:inline>
+        </w:drawing>
+      </w:r>
+    </w:p>
+    <w:p/>
+    <w:p>
+      <w:r>
+        <w:rPr>
+          <w:noProof/>
+        </w:rPr>
+        <w:drawing>
+          <wp:inline distT="0" distB="0" distL="0" distR="0" wp14:anchorId="3734FCBB" wp14:editId="06092844">
+            <wp:extent cx="5612130" cy="1708150"/>
+            <wp:effectExtent l="0" t="0" r="7620" b="6350"/>
+            <wp:docPr id="525445772" name="Imagen 1"/>
+            <wp:cNvGraphicFramePr>
+              <a:graphicFrameLocks xmlns:a="http://schemas.openxmlformats.org/drawingml/2006/main" noChangeAspect="1"/>
+            </wp:cNvGraphicFramePr>
+            <a:graphic xmlns:a="http://schemas.openxmlformats.org/drawingml/2006/main">
+              <a:graphicData uri="http://schemas.openxmlformats.org/drawingml/2006/picture">
+                <pic:pic xmlns:pic="http://schemas.openxmlformats.org/drawingml/2006/picture">
+                  <pic:nvPicPr>
+                    <pic:cNvPr id="525445772" name=""/>
+                    <pic:cNvPicPr/>
+                  </pic:nvPicPr>
+                  <pic:blipFill>
+                    <a:blip r:embed="rId39"/>
+                    <a:stretch>
+                      <a:fillRect/>
+                    </a:stretch>
+                  </pic:blipFill>
+                  <pic:spPr>
+                    <a:xfrm>
+                      <a:off x="0" y="0"/>
+                      <a:ext cx="5612130" cy="1708150"/>
+                    </a:xfrm>
+                    <a:prstGeom prst="rect">
+                      <a:avLst/>
+                    </a:prstGeom>
+                  </pic:spPr>
+                </pic:pic>
+              </a:graphicData>
+            </a:graphic>
+          </wp:inline>
+        </w:drawing>
+      </w:r>
+    </w:p>
+    <w:p/>
+    <w:p>
+      <w:pPr>
+        <w:rPr>
+          <w:lang w:val="en-US"/>
+        </w:rPr>
+      </w:pPr>
+      <w:r>
+        <w:rPr>
+          <w:noProof/>
+        </w:rPr>
+        <w:drawing>
+          <wp:inline distT="0" distB="0" distL="0" distR="0" wp14:anchorId="7A135784" wp14:editId="79CED29E">
+            <wp:extent cx="5612130" cy="1892935"/>
+            <wp:effectExtent l="0" t="0" r="7620" b="0"/>
+            <wp:docPr id="1697097439" name="Imagen 1"/>
+            <wp:cNvGraphicFramePr>
+              <a:graphicFrameLocks xmlns:a="http://schemas.openxmlformats.org/drawingml/2006/main" noChangeAspect="1"/>
+            </wp:cNvGraphicFramePr>
+            <a:graphic xmlns:a="http://schemas.openxmlformats.org/drawingml/2006/main">
+              <a:graphicData uri="http://schemas.openxmlformats.org/drawingml/2006/picture">
+                <pic:pic xmlns:pic="http://schemas.openxmlformats.org/drawingml/2006/picture">
+                  <pic:nvPicPr>
+                    <pic:cNvPr id="1697097439" name=""/>
+                    <pic:cNvPicPr/>
+                  </pic:nvPicPr>
+                  <pic:blipFill>
+                    <a:blip r:embed="rId40"/>
+                    <a:stretch>
+                      <a:fillRect/>
+                    </a:stretch>
+                  </pic:blipFill>
+                  <pic:spPr>
+                    <a:xfrm>
+                      <a:off x="0" y="0"/>
+                      <a:ext cx="5612130" cy="1892935"/>
+                    </a:xfrm>
+                    <a:prstGeom prst="rect">
+                      <a:avLst/>
+                    </a:prstGeom>
+                  </pic:spPr>
+                </pic:pic>
+              </a:graphicData>
+            </a:graphic>
+          </wp:inline>
+        </w:drawing>
+      </w:r>
+    </w:p>
+    <w:p>
+      <w:pPr>
+        <w:rPr>
+          <w:lang w:val="en-US"/>
+        </w:rPr>
+      </w:pPr>
+    </w:p>
+    <w:p>
+      <w:pPr>
+        <w:rPr>
+          <w:lang w:val="en-US"/>
+        </w:rPr>
+      </w:pPr>
+      <w:r>
+        <w:rPr>
+          <w:lang w:val="en-US"/>
+        </w:rPr>
+        <w:lastRenderedPageBreak/>
+        <w:drawing>
+          <wp:inline distT="0" distB="0" distL="0" distR="0" wp14:anchorId="4073CF39" wp14:editId="0B521A33">
+            <wp:extent cx="5612130" cy="1348105"/>
+            <wp:effectExtent l="0" t="0" r="7620" b="4445"/>
+            <wp:docPr id="222358603" name="Imagen 1"/>
+            <wp:cNvGraphicFramePr>
+              <a:graphicFrameLocks xmlns:a="http://schemas.openxmlformats.org/drawingml/2006/main" noChangeAspect="1"/>
+            </wp:cNvGraphicFramePr>
+            <a:graphic xmlns:a="http://schemas.openxmlformats.org/drawingml/2006/main">
+              <a:graphicData uri="http://schemas.openxmlformats.org/drawingml/2006/picture">
+                <pic:pic xmlns:pic="http://schemas.openxmlformats.org/drawingml/2006/picture">
+                  <pic:nvPicPr>
+                    <pic:cNvPr id="222358603" name=""/>
+                    <pic:cNvPicPr/>
+                  </pic:nvPicPr>
+                  <pic:blipFill>
+                    <a:blip r:embed="rId41"/>
+                    <a:stretch>
+                      <a:fillRect/>
+                    </a:stretch>
+                  </pic:blipFill>
+                  <pic:spPr>
+                    <a:xfrm>
+                      <a:off x="0" y="0"/>
+                      <a:ext cx="5612130" cy="1348105"/>
+                    </a:xfrm>
+                    <a:prstGeom prst="rect">
+                      <a:avLst/>
+                    </a:prstGeom>
+                  </pic:spPr>
+                </pic:pic>
+              </a:graphicData>
+            </a:graphic>
+          </wp:inline>
+        </w:drawing>
+      </w:r>
+    </w:p>
+    <w:p>
+      <w:r>
+        <w:rPr>
+          <w:noProof/>
+        </w:rPr>
+        <w:drawing>
+          <wp:inline distT="0" distB="0" distL="0" distR="0" wp14:anchorId="3A6CED44" wp14:editId="404C33B4">
+            <wp:extent cx="5612130" cy="1706880"/>
+            <wp:effectExtent l="0" t="0" r="7620" b="7620"/>
+            <wp:docPr id="992999119" name="Imagen 1"/>
+            <wp:cNvGraphicFramePr>
+              <a:graphicFrameLocks xmlns:a="http://schemas.openxmlformats.org/drawingml/2006/main" noChangeAspect="1"/>
+            </wp:cNvGraphicFramePr>
+            <a:graphic xmlns:a="http://schemas.openxmlformats.org/drawingml/2006/main">
+              <a:graphicData uri="http://schemas.openxmlformats.org/drawingml/2006/picture">
+                <pic:pic xmlns:pic="http://schemas.openxmlformats.org/drawingml/2006/picture">
+                  <pic:nvPicPr>
+                    <pic:cNvPr id="992999119" name=""/>
+                    <pic:cNvPicPr/>
+                  </pic:nvPicPr>
+                  <pic:blipFill>
+                    <a:blip r:embed="rId42"/>
+                    <a:stretch>
+                      <a:fillRect/>
+                    </a:stretch>
+                  </pic:blipFill>
+                  <pic:spPr>
+                    <a:xfrm>
+                      <a:off x="0" y="0"/>
+                      <a:ext cx="5612130" cy="1706880"/>
+                    </a:xfrm>
+                    <a:prstGeom prst="rect">
+                      <a:avLst/>
+                    </a:prstGeom>
+                  </pic:spPr>
+                </pic:pic>
+              </a:graphicData>
+            </a:graphic>
+          </wp:inline>
+        </w:drawing>
+      </w:r>
+    </w:p>
+    <w:p>
+      <w:r>
+        <w:drawing>
+          <wp:inline distT="0" distB="0" distL="0" distR="0" wp14:anchorId="01C41A1B" wp14:editId="479BD6D5">
+            <wp:extent cx="5612130" cy="2260600"/>
+            <wp:effectExtent l="0" t="0" r="7620" b="6350"/>
+            <wp:docPr id="766830047" name="Imagen 1"/>
+            <wp:cNvGraphicFramePr>
+              <a:graphicFrameLocks xmlns:a="http://schemas.openxmlformats.org/drawingml/2006/main" noChangeAspect="1"/>
+            </wp:cNvGraphicFramePr>
+            <a:graphic xmlns:a="http://schemas.openxmlformats.org/drawingml/2006/main">
+              <a:graphicData uri="http://schemas.openxmlformats.org/drawingml/2006/picture">
+                <pic:pic xmlns:pic="http://schemas.openxmlformats.org/drawingml/2006/picture">
+                  <pic:nvPicPr>
+                    <pic:cNvPr id="766830047" name=""/>
+                    <pic:cNvPicPr/>
+                  </pic:nvPicPr>
+                  <pic:blipFill>
+                    <a:blip r:embed="rId43"/>
+                    <a:stretch>
+                      <a:fillRect/>
+                    </a:stretch>
+                  </pic:blipFill>
+                  <pic:spPr>
+                    <a:xfrm>
+                      <a:off x="0" y="0"/>
+                      <a:ext cx="5612130" cy="2260600"/>
+                    </a:xfrm>
+                    <a:prstGeom prst="rect">
+                      <a:avLst/>
+                    </a:prstGeom>
+                  </pic:spPr>
+                </pic:pic>
+              </a:graphicData>
+            </a:graphic>
+          </wp:inline>
+        </w:drawing>
+      </w:r>
+    </w:p>
+    <w:p/>
+    <w:p>
+      <w:r>
+        <w:t>FACTURACION</w:t>
+      </w:r>
+    </w:p>
+    <w:p>
+      <w:r>
+        <w:drawing>
+          <wp:inline distT="0" distB="0" distL="0" distR="0" wp14:anchorId="35ED6244" wp14:editId="37A87FD9">
+            <wp:extent cx="5612130" cy="1560195"/>
+            <wp:effectExtent l="0" t="0" r="7620" b="1905"/>
+            <wp:docPr id="1719567835" name="Imagen 1"/>
+            <wp:cNvGraphicFramePr>
+              <a:graphicFrameLocks xmlns:a="http://schemas.openxmlformats.org/drawingml/2006/main" noChangeAspect="1"/>
+            </wp:cNvGraphicFramePr>
+            <a:graphic xmlns:a="http://schemas.openxmlformats.org/drawingml/2006/main">
+              <a:graphicData uri="http://schemas.openxmlformats.org/drawingml/2006/picture">
+                <pic:pic xmlns:pic="http://schemas.openxmlformats.org/drawingml/2006/picture">
+                  <pic:nvPicPr>
+                    <pic:cNvPr id="1719567835" name=""/>
+                    <pic:cNvPicPr/>
+                  </pic:nvPicPr>
+                  <pic:blipFill>
+                    <a:blip r:embed="rId44"/>
+                    <a:stretch>
+                      <a:fillRect/>
+                    </a:stretch>
+                  </pic:blipFill>
+                  <pic:spPr>
+                    <a:xfrm>
+                      <a:off x="0" y="0"/>
+                      <a:ext cx="5612130" cy="1560195"/>
+                    </a:xfrm>
+                    <a:prstGeom prst="rect">
+                      <a:avLst/>
+                    </a:prstGeom>
+                  </pic:spPr>
+                </pic:pic>
+              </a:graphicData>
+            </a:graphic>
+          </wp:inline>
+        </w:drawing>
+      </w:r>
+    </w:p>
+    <w:p/>
+    <w:p>
+      <w:r>
+        <w:lastRenderedPageBreak/>
+        <w:t>TEST DE FACTURACION</w:t>
+      </w:r>
+    </w:p>
+    <w:p>
+      <w:pPr>
+        <w:rPr>
+          <w:lang w:val="en-US"/>
+        </w:rPr>
+      </w:pPr>
+      <w:r>
+        <w:drawing>
+          <wp:inline distT="0" distB="0" distL="0" distR="0" wp14:anchorId="4C0571FB" wp14:editId="094970EF">
+            <wp:extent cx="5612130" cy="2585720"/>
+            <wp:effectExtent l="0" t="0" r="7620" b="5080"/>
+            <wp:docPr id="804241161" name="Imagen 1"/>
+            <wp:cNvGraphicFramePr>
+              <a:graphicFrameLocks xmlns:a="http://schemas.openxmlformats.org/drawingml/2006/main" noChangeAspect="1"/>
+            </wp:cNvGraphicFramePr>
+            <a:graphic xmlns:a="http://schemas.openxmlformats.org/drawingml/2006/main">
+              <a:graphicData uri="http://schemas.openxmlformats.org/drawingml/2006/picture">
+                <pic:pic xmlns:pic="http://schemas.openxmlformats.org/drawingml/2006/picture">
+                  <pic:nvPicPr>
+                    <pic:cNvPr id="804241161" name=""/>
+                    <pic:cNvPicPr/>
+                  </pic:nvPicPr>
+                  <pic:blipFill>
+                    <a:blip r:embed="rId45"/>
+                    <a:stretch>
+                      <a:fillRect/>
+                    </a:stretch>
+                  </pic:blipFill>
+                  <pic:spPr>
+                    <a:xfrm>
+                      <a:off x="0" y="0"/>
+                      <a:ext cx="5612130" cy="2585720"/>
+                    </a:xfrm>
+                    <a:prstGeom prst="rect">
+                      <a:avLst/>
+                    </a:prstGeom>
+                  </pic:spPr>
+                </pic:pic>
+              </a:graphicData>
+            </a:graphic>
+          </wp:inline>
+        </w:drawing>
+      </w:r>
+    </w:p>
+    <w:p>
+      <w:pPr>
+        <w:rPr>
+          <w:lang w:val="en-US"/>
+        </w:rPr>
+      </w:pPr>
+    </w:p>
+    <w:p>
+      <w:pPr>
+        <w:rPr>
+          <w:lang w:val="en-US"/>
+        </w:rPr>
+      </w:pPr>
+      <w:r>
+        <w:rPr>
+          <w:lang w:val="en-US"/>
+        </w:rPr>
+        <w:t>Pantallas de facturacion</w:t>
+      </w:r>
+    </w:p>
+    <w:p>
+      <w:pPr>
+        <w:rPr>
+          <w:lang w:val="en-US"/>
+        </w:rPr>
+      </w:pPr>
+      <w:r>
+        <w:rPr>
+          <w:lang w:val="en-US"/>
+        </w:rPr>
+        <w:drawing>
+          <wp:inline distT="0" distB="0" distL="0" distR="0" wp14:anchorId="6088AC37" wp14:editId="075DDD43">
+            <wp:extent cx="5612130" cy="1402080"/>
+            <wp:effectExtent l="0" t="0" r="7620" b="7620"/>
+            <wp:docPr id="855672664" name="Imagen 1"/>
+            <wp:cNvGraphicFramePr>
+              <a:graphicFrameLocks xmlns:a="http://schemas.openxmlformats.org/drawingml/2006/main" noChangeAspect="1"/>
+            </wp:cNvGraphicFramePr>
+            <a:graphic xmlns:a="http://schemas.openxmlformats.org/drawingml/2006/main">
+              <a:graphicData uri="http://schemas.openxmlformats.org/drawingml/2006/picture">
+                <pic:pic xmlns:pic="http://schemas.openxmlformats.org/drawingml/2006/picture">
+                  <pic:nvPicPr>
+                    <pic:cNvPr id="855672664" name=""/>
+                    <pic:cNvPicPr/>
+                  </pic:nvPicPr>
+                  <pic:blipFill>
+                    <a:blip r:embed="rId46"/>
+                    <a:stretch>
+                      <a:fillRect/>
+                    </a:stretch>
+                  </pic:blipFill>
+                  <pic:spPr>
+                    <a:xfrm>
+                      <a:off x="0" y="0"/>
+                      <a:ext cx="5612130" cy="1402080"/>
+                    </a:xfrm>
+                    <a:prstGeom prst="rect">
+                      <a:avLst/>
+                    </a:prstGeom>
+                  </pic:spPr>
+                </pic:pic>
+              </a:graphicData>
+            </a:graphic>
+          </wp:inline>
+        </w:drawing>
+      </w:r>
+    </w:p>
+    <w:p>
+      <w:pPr>
+        <w:rPr>
+          <w:lang w:val="en-US"/>
+        </w:rPr>
+      </w:pPr>
+    </w:p>
+    <w:p>
+      <w:pPr>
+        <w:rPr>
+          <w:lang w:val="en-US"/>
+        </w:rPr>
+      </w:pPr>
+      <w:r>
+        <w:rPr>
+          <w:lang w:val="en-US"/>
+        </w:rPr>
+        <w:drawing>
+          <wp:inline distT="0" distB="0" distL="0" distR="0" wp14:anchorId="6B85A80C" wp14:editId="6DE3CCC6">
+            <wp:extent cx="5612130" cy="2603500"/>
+            <wp:effectExtent l="0" t="0" r="7620" b="6350"/>
+            <wp:docPr id="1284808097" name="Imagen 1"/>
+            <wp:cNvGraphicFramePr>
+              <a:graphicFrameLocks xmlns:a="http://schemas.openxmlformats.org/drawingml/2006/main" noChangeAspect="1"/>
+            </wp:cNvGraphicFramePr>
+            <a:graphic xmlns:a="http://schemas.openxmlformats.org/drawingml/2006/main">
+              <a:graphicData uri="http://schemas.openxmlformats.org/drawingml/2006/picture">
+                <pic:pic xmlns:pic="http://schemas.openxmlformats.org/drawingml/2006/picture">
+                  <pic:nvPicPr>
+                    <pic:cNvPr id="1284808097" name=""/>
+                    <pic:cNvPicPr/>
+                  </pic:nvPicPr>
+                  <pic:blipFill>
+                    <a:blip r:embed="rId47"/>
+                    <a:stretch>
+                      <a:fillRect/>
+                    </a:stretch>
+                  </pic:blipFill>
+                  <pic:spPr>
+                    <a:xfrm>
+                      <a:off x="0" y="0"/>
+                      <a:ext cx="5612130" cy="2603500"/>
+                    </a:xfrm>
+                    <a:prstGeom prst="rect">
+                      <a:avLst/>
+                    </a:prstGeom>
+                  </pic:spPr>
+                </pic:pic>
+              </a:graphicData>
+            </a:graphic>
+          </wp:inline>
+        </w:drawing>
+      </w:r>
+    </w:p>
+    <w:p>
+      <w:pPr>
+        <w:rPr>
+          <w:lang w:val="en-US"/>
+        </w:rPr>
+      </w:pPr>
+      <w:r>
+        <w:rPr>
+          <w:lang w:val="en-US"/>
+        </w:rPr>
+        <w:lastRenderedPageBreak/>
+        <w:drawing>
+          <wp:inline distT="0" distB="0" distL="0" distR="0" wp14:anchorId="5D7C1708" wp14:editId="7854498A">
+            <wp:extent cx="5612130" cy="3660775"/>
+            <wp:effectExtent l="0" t="0" r="7620" b="0"/>
+            <wp:docPr id="1096241687" name="Imagen 1"/>
+            <wp:cNvGraphicFramePr>
+              <a:graphicFrameLocks xmlns:a="http://schemas.openxmlformats.org/drawingml/2006/main" noChangeAspect="1"/>
+            </wp:cNvGraphicFramePr>
+            <a:graphic xmlns:a="http://schemas.openxmlformats.org/drawingml/2006/main">
+              <a:graphicData uri="http://schemas.openxmlformats.org/drawingml/2006/picture">
+                <pic:pic xmlns:pic="http://schemas.openxmlformats.org/drawingml/2006/picture">
+                  <pic:nvPicPr>
+                    <pic:cNvPr id="1096241687" name=""/>
+                    <pic:cNvPicPr/>
+                  </pic:nvPicPr>
+                  <pic:blipFill>
+                    <a:blip r:embed="rId48"/>
+                    <a:stretch>
+                      <a:fillRect/>
+                    </a:stretch>
+                  </pic:blipFill>
+                  <pic:spPr>
+                    <a:xfrm>
+                      <a:off x="0" y="0"/>
+                      <a:ext cx="5612130" cy="3660775"/>
+                    </a:xfrm>
+                    <a:prstGeom prst="rect">
+                      <a:avLst/>
+                    </a:prstGeom>
+                  </pic:spPr>
+                </pic:pic>
+              </a:graphicData>
+            </a:graphic>
+          </wp:inline>
+        </w:drawing>
+      </w:r>
+    </w:p>
+    <w:p>
+      <w:pPr>
+        <w:rPr>
+          <w:lang w:val="en-US"/>
+        </w:rPr>
+      </w:pPr>
+    </w:p>
+    <w:p>
+      <w:pPr>
+        <w:rPr>
+          <w:lang w:val="en-US"/>
+        </w:rPr>
+      </w:pPr>
+    </w:p>
+    <w:p>
+      <w:pPr>
+        <w:rPr>
+          <w:lang w:val="en-US"/>
+        </w:rPr>
+      </w:pPr>
+    </w:p>
+    <w:p>
+      <w:pPr>
+        <w:rPr>
+          <w:lang w:val="en-US"/>
+        </w:rPr>
+      </w:pPr>
+    </w:p>
+    <w:p>
+      <w:pPr>
+        <w:rPr>
+          <w:lang w:val="en-US"/>
+        </w:rPr>
+      </w:pPr>
+    </w:p>
+    <w:p>
+      <w:pPr>
+        <w:rPr>
+          <w:lang w:val="en-US"/>
+        </w:rPr>
+      </w:pPr>
+    </w:p>
+    <w:p>
+      <w:pPr>
+        <w:rPr>
+          <w:lang w:val="en-US"/>
+        </w:rPr>
+      </w:pPr>
+    </w:p>
+    <w:p>
+      <w:pPr>
+        <w:rPr>
+          <w:lang w:val="en-US"/>
+        </w:rPr>
+      </w:pPr>
+    </w:p>
+    <w:p>
+      <w:pPr>
+        <w:rPr>
+          <w:lang w:val="en-US"/>
+        </w:rPr>
+      </w:pPr>
+    </w:p>
+    <w:p>
+      <w:pPr>
+        <w:rPr>
+          <w:lang w:val="en-US"/>
+        </w:rPr>
+      </w:pPr>
+    </w:p>
+    <w:p>
+      <w:pPr>
+        <w:rPr>
+          <w:lang w:val="en-US"/>
+        </w:rPr>
+      </w:pPr>
+      <w:r>
+        <w:rPr>
+          <w:lang w:val="en-US"/>
+        </w:rPr>
+        <w:t>TEST DE FRONTEND INVOICES</w:t>
+      </w:r>
+    </w:p>
+    <w:p>
+      <w:pPr>
+        <w:rPr>
+          <w:lang w:val="en-US"/>
+        </w:rPr>
+      </w:pPr>
+      <w:r>
+        <w:rPr>
+          <w:lang w:val="en-US"/>
+        </w:rPr>
+        <w:lastRenderedPageBreak/>
+        <w:drawing>
+          <wp:inline distT="0" distB="0" distL="0" distR="0" wp14:anchorId="19482AA5" wp14:editId="0898CD3E">
+            <wp:extent cx="5612130" cy="2723515"/>
+            <wp:effectExtent l="0" t="0" r="7620" b="635"/>
+            <wp:docPr id="641463485" name="Imagen 1"/>
+            <wp:cNvGraphicFramePr>
+              <a:graphicFrameLocks xmlns:a="http://schemas.openxmlformats.org/drawingml/2006/main" noChangeAspect="1"/>
+            </wp:cNvGraphicFramePr>
+            <a:graphic xmlns:a="http://schemas.openxmlformats.org/drawingml/2006/main">
+              <a:graphicData uri="http://schemas.openxmlformats.org/drawingml/2006/picture">
+                <pic:pic xmlns:pic="http://schemas.openxmlformats.org/drawingml/2006/picture">
+                  <pic:nvPicPr>
+                    <pic:cNvPr id="641463485" name=""/>
+                    <pic:cNvPicPr/>
+                  </pic:nvPicPr>
+                  <pic:blipFill>
+                    <a:blip r:embed="rId49"/>
+                    <a:stretch>
+                      <a:fillRect/>
+                    </a:stretch>
+                  </pic:blipFill>
+                  <pic:spPr>
+                    <a:xfrm>
+                      <a:off x="0" y="0"/>
+                      <a:ext cx="5612130" cy="2723515"/>
+                    </a:xfrm>
+                    <a:prstGeom prst="rect">
+                      <a:avLst/>
+                    </a:prstGeom>
+                  </pic:spPr>
+                </pic:pic>
+              </a:graphicData>
+            </a:graphic>
+          </wp:inline>
+        </w:drawing>
+      </w:r>
+    </w:p>
     <w:sectPr>
       <w:pgSz w:w="12240" w:h="15840"/>
       <w:pgMar w:top="1417" w:right="1701" w:bottom="1417" w:left="1701" w:header="708" w:footer="708" w:gutter="0"/>
@@ -7256,6 +6189,155 @@
     </w:lvl>
   </w:abstractNum>
   <w:abstractNum w:abstractNumId="4" w15:restartNumberingAfterBreak="0">
+    <w:nsid w:val="37BF698E"/>
+    <w:multiLevelType w:val="multilevel"/>
+    <w:tmpl w:val="69DA63F0"/>
+    <w:lvl w:ilvl="0">
+      <w:start w:val="1"/>
+      <w:numFmt w:val="bullet"/>
+      <w:lvlText w:val=""/>
+      <w:lvlJc w:val="left"/>
+      <w:pPr>
+        <w:tabs>
+          <w:tab w:val="num" w:pos="720"/>
+        </w:tabs>
+        <w:ind w:left="720" w:hanging="360"/>
+      </w:pPr>
+      <w:rPr>
+        <w:rFonts w:ascii="Symbol" w:hAnsi="Symbol" w:hint="default"/>
+        <w:sz w:val="20"/>
+      </w:rPr>
+    </w:lvl>
+    <w:lvl w:ilvl="1" w:tentative="1">
+      <w:start w:val="1"/>
+      <w:numFmt w:val="bullet"/>
+      <w:lvlText w:val="o"/>
+      <w:lvlJc w:val="left"/>
+      <w:pPr>
+        <w:tabs>
+          <w:tab w:val="num" w:pos="1440"/>
+        </w:tabs>
+        <w:ind w:left="1440" w:hanging="360"/>
+      </w:pPr>
+      <w:rPr>
+        <w:rFonts w:ascii="Courier New" w:hAnsi="Courier New" w:hint="default"/>
+        <w:sz w:val="20"/>
+      </w:rPr>
+    </w:lvl>
+    <w:lvl w:ilvl="2" w:tentative="1">
+      <w:start w:val="1"/>
+      <w:numFmt w:val="bullet"/>
+      <w:lvlText w:val=""/>
+      <w:lvlJc w:val="left"/>
+      <w:pPr>
+        <w:tabs>
+          <w:tab w:val="num" w:pos="2160"/>
+        </w:tabs>
+        <w:ind w:left="2160" w:hanging="360"/>
+      </w:pPr>
+      <w:rPr>
+        <w:rFonts w:ascii="Wingdings" w:hAnsi="Wingdings" w:hint="default"/>
+        <w:sz w:val="20"/>
+      </w:rPr>
+    </w:lvl>
+    <w:lvl w:ilvl="3" w:tentative="1">
+      <w:start w:val="1"/>
+      <w:numFmt w:val="bullet"/>
+      <w:lvlText w:val=""/>
+      <w:lvlJc w:val="left"/>
+      <w:pPr>
+        <w:tabs>
+          <w:tab w:val="num" w:pos="2880"/>
+        </w:tabs>
+        <w:ind w:left="2880" w:hanging="360"/>
+      </w:pPr>
+      <w:rPr>
+        <w:rFonts w:ascii="Wingdings" w:hAnsi="Wingdings" w:hint="default"/>
+        <w:sz w:val="20"/>
+      </w:rPr>
+    </w:lvl>
+    <w:lvl w:ilvl="4" w:tentative="1">
+      <w:start w:val="1"/>
+      <w:numFmt w:val="bullet"/>
+      <w:lvlText w:val=""/>
+      <w:lvlJc w:val="left"/>
+      <w:pPr>
+        <w:tabs>
+          <w:tab w:val="num" w:pos="3600"/>
+        </w:tabs>
+        <w:ind w:left="3600" w:hanging="360"/>
+      </w:pPr>
+      <w:rPr>
+        <w:rFonts w:ascii="Wingdings" w:hAnsi="Wingdings" w:hint="default"/>
+        <w:sz w:val="20"/>
+      </w:rPr>
+    </w:lvl>
+    <w:lvl w:ilvl="5" w:tentative="1">
+      <w:start w:val="1"/>
+      <w:numFmt w:val="bullet"/>
+      <w:lvlText w:val=""/>
+      <w:lvlJc w:val="left"/>
+      <w:pPr>
+        <w:tabs>
+          <w:tab w:val="num" w:pos="4320"/>
+        </w:tabs>
+        <w:ind w:left="4320" w:hanging="360"/>
+      </w:pPr>
+      <w:rPr>
+        <w:rFonts w:ascii="Wingdings" w:hAnsi="Wingdings" w:hint="default"/>
+        <w:sz w:val="20"/>
+      </w:rPr>
+    </w:lvl>
+    <w:lvl w:ilvl="6" w:tentative="1">
+      <w:start w:val="1"/>
+      <w:numFmt w:val="bullet"/>
+      <w:lvlText w:val=""/>
+      <w:lvlJc w:val="left"/>
+      <w:pPr>
+        <w:tabs>
+          <w:tab w:val="num" w:pos="5040"/>
+        </w:tabs>
+        <w:ind w:left="5040" w:hanging="360"/>
+      </w:pPr>
+      <w:rPr>
+        <w:rFonts w:ascii="Wingdings" w:hAnsi="Wingdings" w:hint="default"/>
+        <w:sz w:val="20"/>
+      </w:rPr>
+    </w:lvl>
+    <w:lvl w:ilvl="7" w:tentative="1">
+      <w:start w:val="1"/>
+      <w:numFmt w:val="bullet"/>
+      <w:lvlText w:val=""/>
+      <w:lvlJc w:val="left"/>
+      <w:pPr>
+        <w:tabs>
+          <w:tab w:val="num" w:pos="5760"/>
+        </w:tabs>
+        <w:ind w:left="5760" w:hanging="360"/>
+      </w:pPr>
+      <w:rPr>
+        <w:rFonts w:ascii="Wingdings" w:hAnsi="Wingdings" w:hint="default"/>
+        <w:sz w:val="20"/>
+      </w:rPr>
+    </w:lvl>
+    <w:lvl w:ilvl="8" w:tentative="1">
+      <w:start w:val="1"/>
+      <w:numFmt w:val="bullet"/>
+      <w:lvlText w:val=""/>
+      <w:lvlJc w:val="left"/>
+      <w:pPr>
+        <w:tabs>
+          <w:tab w:val="num" w:pos="6480"/>
+        </w:tabs>
+        <w:ind w:left="6480" w:hanging="360"/>
+      </w:pPr>
+      <w:rPr>
+        <w:rFonts w:ascii="Wingdings" w:hAnsi="Wingdings" w:hint="default"/>
+        <w:sz w:val="20"/>
+      </w:rPr>
+    </w:lvl>
+  </w:abstractNum>
+  <w:abstractNum w:abstractNumId="5" w15:restartNumberingAfterBreak="0">
     <w:nsid w:val="3D9F31E0"/>
     <w:multiLevelType w:val="multilevel"/>
     <w:tmpl w:val="4088EC92"/>
@@ -7368,7 +6450,7 @@
       </w:pPr>
     </w:lvl>
   </w:abstractNum>
-  <w:abstractNum w:abstractNumId="5" w15:restartNumberingAfterBreak="0">
+  <w:abstractNum w:abstractNumId="6" w15:restartNumberingAfterBreak="0">
     <w:nsid w:val="46143C00"/>
     <w:multiLevelType w:val="multilevel"/>
     <w:tmpl w:val="05608E72"/>
@@ -7517,7 +6599,7 @@
       </w:rPr>
     </w:lvl>
   </w:abstractNum>
-  <w:abstractNum w:abstractNumId="6" w15:restartNumberingAfterBreak="0">
+  <w:abstractNum w:abstractNumId="7" w15:restartNumberingAfterBreak="0">
     <w:nsid w:val="4A9D2586"/>
     <w:multiLevelType w:val="multilevel"/>
     <w:tmpl w:val="72C4246C"/>
@@ -7666,7 +6748,156 @@
       </w:rPr>
     </w:lvl>
   </w:abstractNum>
-  <w:abstractNum w:abstractNumId="7" w15:restartNumberingAfterBreak="0">
+  <w:abstractNum w:abstractNumId="8" w15:restartNumberingAfterBreak="0">
+    <w:nsid w:val="62E36C35"/>
+    <w:multiLevelType w:val="multilevel"/>
+    <w:tmpl w:val="1DFE0466"/>
+    <w:lvl w:ilvl="0">
+      <w:start w:val="1"/>
+      <w:numFmt w:val="bullet"/>
+      <w:lvlText w:val=""/>
+      <w:lvlJc w:val="left"/>
+      <w:pPr>
+        <w:tabs>
+          <w:tab w:val="num" w:pos="720"/>
+        </w:tabs>
+        <w:ind w:left="720" w:hanging="360"/>
+      </w:pPr>
+      <w:rPr>
+        <w:rFonts w:ascii="Symbol" w:hAnsi="Symbol" w:hint="default"/>
+        <w:sz w:val="20"/>
+      </w:rPr>
+    </w:lvl>
+    <w:lvl w:ilvl="1" w:tentative="1">
+      <w:start w:val="1"/>
+      <w:numFmt w:val="bullet"/>
+      <w:lvlText w:val="o"/>
+      <w:lvlJc w:val="left"/>
+      <w:pPr>
+        <w:tabs>
+          <w:tab w:val="num" w:pos="1440"/>
+        </w:tabs>
+        <w:ind w:left="1440" w:hanging="360"/>
+      </w:pPr>
+      <w:rPr>
+        <w:rFonts w:ascii="Courier New" w:hAnsi="Courier New" w:hint="default"/>
+        <w:sz w:val="20"/>
+      </w:rPr>
+    </w:lvl>
+    <w:lvl w:ilvl="2" w:tentative="1">
+      <w:start w:val="1"/>
+      <w:numFmt w:val="bullet"/>
+      <w:lvlText w:val=""/>
+      <w:lvlJc w:val="left"/>
+      <w:pPr>
+        <w:tabs>
+          <w:tab w:val="num" w:pos="2160"/>
+        </w:tabs>
+        <w:ind w:left="2160" w:hanging="360"/>
+      </w:pPr>
+      <w:rPr>
+        <w:rFonts w:ascii="Wingdings" w:hAnsi="Wingdings" w:hint="default"/>
+        <w:sz w:val="20"/>
+      </w:rPr>
+    </w:lvl>
+    <w:lvl w:ilvl="3" w:tentative="1">
+      <w:start w:val="1"/>
+      <w:numFmt w:val="bullet"/>
+      <w:lvlText w:val=""/>
+      <w:lvlJc w:val="left"/>
+      <w:pPr>
+        <w:tabs>
+          <w:tab w:val="num" w:pos="2880"/>
+        </w:tabs>
+        <w:ind w:left="2880" w:hanging="360"/>
+      </w:pPr>
+      <w:rPr>
+        <w:rFonts w:ascii="Wingdings" w:hAnsi="Wingdings" w:hint="default"/>
+        <w:sz w:val="20"/>
+      </w:rPr>
+    </w:lvl>
+    <w:lvl w:ilvl="4" w:tentative="1">
+      <w:start w:val="1"/>
+      <w:numFmt w:val="bullet"/>
+      <w:lvlText w:val=""/>
+      <w:lvlJc w:val="left"/>
+      <w:pPr>
+        <w:tabs>
+          <w:tab w:val="num" w:pos="3600"/>
+        </w:tabs>
+        <w:ind w:left="3600" w:hanging="360"/>
+      </w:pPr>
+      <w:rPr>
+        <w:rFonts w:ascii="Wingdings" w:hAnsi="Wingdings" w:hint="default"/>
+        <w:sz w:val="20"/>
+      </w:rPr>
+    </w:lvl>
+    <w:lvl w:ilvl="5" w:tentative="1">
+      <w:start w:val="1"/>
+      <w:numFmt w:val="bullet"/>
+      <w:lvlText w:val=""/>
+      <w:lvlJc w:val="left"/>
+      <w:pPr>
+        <w:tabs>
+          <w:tab w:val="num" w:pos="4320"/>
+        </w:tabs>
+        <w:ind w:left="4320" w:hanging="360"/>
+      </w:pPr>
+      <w:rPr>
+        <w:rFonts w:ascii="Wingdings" w:hAnsi="Wingdings" w:hint="default"/>
+        <w:sz w:val="20"/>
+      </w:rPr>
+    </w:lvl>
+    <w:lvl w:ilvl="6" w:tentative="1">
+      <w:start w:val="1"/>
+      <w:numFmt w:val="bullet"/>
+      <w:lvlText w:val=""/>
+      <w:lvlJc w:val="left"/>
+      <w:pPr>
+        <w:tabs>
+          <w:tab w:val="num" w:pos="5040"/>
+        </w:tabs>
+        <w:ind w:left="5040" w:hanging="360"/>
+      </w:pPr>
+      <w:rPr>
+        <w:rFonts w:ascii="Wingdings" w:hAnsi="Wingdings" w:hint="default"/>
+        <w:sz w:val="20"/>
+      </w:rPr>
+    </w:lvl>
+    <w:lvl w:ilvl="7" w:tentative="1">
+      <w:start w:val="1"/>
+      <w:numFmt w:val="bullet"/>
+      <w:lvlText w:val=""/>
+      <w:lvlJc w:val="left"/>
+      <w:pPr>
+        <w:tabs>
+          <w:tab w:val="num" w:pos="5760"/>
+        </w:tabs>
+        <w:ind w:left="5760" w:hanging="360"/>
+      </w:pPr>
+      <w:rPr>
+        <w:rFonts w:ascii="Wingdings" w:hAnsi="Wingdings" w:hint="default"/>
+        <w:sz w:val="20"/>
+      </w:rPr>
+    </w:lvl>
+    <w:lvl w:ilvl="8" w:tentative="1">
+      <w:start w:val="1"/>
+      <w:numFmt w:val="bullet"/>
+      <w:lvlText w:val=""/>
+      <w:lvlJc w:val="left"/>
+      <w:pPr>
+        <w:tabs>
+          <w:tab w:val="num" w:pos="6480"/>
+        </w:tabs>
+        <w:ind w:left="6480" w:hanging="360"/>
+      </w:pPr>
+      <w:rPr>
+        <w:rFonts w:ascii="Wingdings" w:hAnsi="Wingdings" w:hint="default"/>
+        <w:sz w:val="20"/>
+      </w:rPr>
+    </w:lvl>
+  </w:abstractNum>
+  <w:abstractNum w:abstractNumId="9" w15:restartNumberingAfterBreak="0">
     <w:nsid w:val="64654211"/>
     <w:multiLevelType w:val="multilevel"/>
     <w:tmpl w:val="823818C0"/>
@@ -7815,7 +7046,156 @@
       </w:rPr>
     </w:lvl>
   </w:abstractNum>
-  <w:abstractNum w:abstractNumId="8" w15:restartNumberingAfterBreak="0">
+  <w:abstractNum w:abstractNumId="10" w15:restartNumberingAfterBreak="0">
+    <w:nsid w:val="694A0B0E"/>
+    <w:multiLevelType w:val="multilevel"/>
+    <w:tmpl w:val="A6F800D0"/>
+    <w:lvl w:ilvl="0">
+      <w:start w:val="1"/>
+      <w:numFmt w:val="bullet"/>
+      <w:lvlText w:val=""/>
+      <w:lvlJc w:val="left"/>
+      <w:pPr>
+        <w:tabs>
+          <w:tab w:val="num" w:pos="720"/>
+        </w:tabs>
+        <w:ind w:left="720" w:hanging="360"/>
+      </w:pPr>
+      <w:rPr>
+        <w:rFonts w:ascii="Symbol" w:hAnsi="Symbol" w:hint="default"/>
+        <w:sz w:val="20"/>
+      </w:rPr>
+    </w:lvl>
+    <w:lvl w:ilvl="1" w:tentative="1">
+      <w:start w:val="1"/>
+      <w:numFmt w:val="bullet"/>
+      <w:lvlText w:val="o"/>
+      <w:lvlJc w:val="left"/>
+      <w:pPr>
+        <w:tabs>
+          <w:tab w:val="num" w:pos="1440"/>
+        </w:tabs>
+        <w:ind w:left="1440" w:hanging="360"/>
+      </w:pPr>
+      <w:rPr>
+        <w:rFonts w:ascii="Courier New" w:hAnsi="Courier New" w:hint="default"/>
+        <w:sz w:val="20"/>
+      </w:rPr>
+    </w:lvl>
+    <w:lvl w:ilvl="2" w:tentative="1">
+      <w:start w:val="1"/>
+      <w:numFmt w:val="bullet"/>
+      <w:lvlText w:val=""/>
+      <w:lvlJc w:val="left"/>
+      <w:pPr>
+        <w:tabs>
+          <w:tab w:val="num" w:pos="2160"/>
+        </w:tabs>
+        <w:ind w:left="2160" w:hanging="360"/>
+      </w:pPr>
+      <w:rPr>
+        <w:rFonts w:ascii="Wingdings" w:hAnsi="Wingdings" w:hint="default"/>
+        <w:sz w:val="20"/>
+      </w:rPr>
+    </w:lvl>
+    <w:lvl w:ilvl="3" w:tentative="1">
+      <w:start w:val="1"/>
+      <w:numFmt w:val="bullet"/>
+      <w:lvlText w:val=""/>
+      <w:lvlJc w:val="left"/>
+      <w:pPr>
+        <w:tabs>
+          <w:tab w:val="num" w:pos="2880"/>
+        </w:tabs>
+        <w:ind w:left="2880" w:hanging="360"/>
+      </w:pPr>
+      <w:rPr>
+        <w:rFonts w:ascii="Wingdings" w:hAnsi="Wingdings" w:hint="default"/>
+        <w:sz w:val="20"/>
+      </w:rPr>
+    </w:lvl>
+    <w:lvl w:ilvl="4" w:tentative="1">
+      <w:start w:val="1"/>
+      <w:numFmt w:val="bullet"/>
+      <w:lvlText w:val=""/>
+      <w:lvlJc w:val="left"/>
+      <w:pPr>
+        <w:tabs>
+          <w:tab w:val="num" w:pos="3600"/>
+        </w:tabs>
+        <w:ind w:left="3600" w:hanging="360"/>
+      </w:pPr>
+      <w:rPr>
+        <w:rFonts w:ascii="Wingdings" w:hAnsi="Wingdings" w:hint="default"/>
+        <w:sz w:val="20"/>
+      </w:rPr>
+    </w:lvl>
+    <w:lvl w:ilvl="5" w:tentative="1">
+      <w:start w:val="1"/>
+      <w:numFmt w:val="bullet"/>
+      <w:lvlText w:val=""/>
+      <w:lvlJc w:val="left"/>
+      <w:pPr>
+        <w:tabs>
+          <w:tab w:val="num" w:pos="4320"/>
+        </w:tabs>
+        <w:ind w:left="4320" w:hanging="360"/>
+      </w:pPr>
+      <w:rPr>
+        <w:rFonts w:ascii="Wingdings" w:hAnsi="Wingdings" w:hint="default"/>
+        <w:sz w:val="20"/>
+      </w:rPr>
+    </w:lvl>
+    <w:lvl w:ilvl="6" w:tentative="1">
+      <w:start w:val="1"/>
+      <w:numFmt w:val="bullet"/>
+      <w:lvlText w:val=""/>
+      <w:lvlJc w:val="left"/>
+      <w:pPr>
+        <w:tabs>
+          <w:tab w:val="num" w:pos="5040"/>
+        </w:tabs>
+        <w:ind w:left="5040" w:hanging="360"/>
+      </w:pPr>
+      <w:rPr>
+        <w:rFonts w:ascii="Wingdings" w:hAnsi="Wingdings" w:hint="default"/>
+        <w:sz w:val="20"/>
+      </w:rPr>
+    </w:lvl>
+    <w:lvl w:ilvl="7" w:tentative="1">
+      <w:start w:val="1"/>
+      <w:numFmt w:val="bullet"/>
+      <w:lvlText w:val=""/>
+      <w:lvlJc w:val="left"/>
+      <w:pPr>
+        <w:tabs>
+          <w:tab w:val="num" w:pos="5760"/>
+        </w:tabs>
+        <w:ind w:left="5760" w:hanging="360"/>
+      </w:pPr>
+      <w:rPr>
+        <w:rFonts w:ascii="Wingdings" w:hAnsi="Wingdings" w:hint="default"/>
+        <w:sz w:val="20"/>
+      </w:rPr>
+    </w:lvl>
+    <w:lvl w:ilvl="8" w:tentative="1">
+      <w:start w:val="1"/>
+      <w:numFmt w:val="bullet"/>
+      <w:lvlText w:val=""/>
+      <w:lvlJc w:val="left"/>
+      <w:pPr>
+        <w:tabs>
+          <w:tab w:val="num" w:pos="6480"/>
+        </w:tabs>
+        <w:ind w:left="6480" w:hanging="360"/>
+      </w:pPr>
+      <w:rPr>
+        <w:rFonts w:ascii="Wingdings" w:hAnsi="Wingdings" w:hint="default"/>
+        <w:sz w:val="20"/>
+      </w:rPr>
+    </w:lvl>
+  </w:abstractNum>
+  <w:abstractNum w:abstractNumId="11" w15:restartNumberingAfterBreak="0">
     <w:nsid w:val="7D027B65"/>
     <w:multiLevelType w:val="multilevel"/>
     <w:tmpl w:val="52D053EE"/>
@@ -7932,13 +7312,13 @@
     <w:abstractNumId w:val="3"/>
   </w:num>
   <w:num w:numId="2" w16cid:durableId="552040752">
-    <w:abstractNumId w:val="4"/>
+    <w:abstractNumId w:val="5"/>
   </w:num>
   <w:num w:numId="3" w16cid:durableId="227307605">
-    <w:abstractNumId w:val="5"/>
+    <w:abstractNumId w:val="6"/>
   </w:num>
   <w:num w:numId="4" w16cid:durableId="1112020264">
-    <w:abstractNumId w:val="6"/>
+    <w:abstractNumId w:val="7"/>
   </w:num>
   <w:num w:numId="5" w16cid:durableId="571740311">
     <w:abstractNumId w:val="1"/>
@@ -7950,9 +7330,18 @@
     <w:abstractNumId w:val="0"/>
   </w:num>
   <w:num w:numId="8" w16cid:durableId="1590767705">
-    <w:abstractNumId w:val="7"/>
+    <w:abstractNumId w:val="9"/>
   </w:num>
   <w:num w:numId="9" w16cid:durableId="546142853">
+    <w:abstractNumId w:val="11"/>
+  </w:num>
+  <w:num w:numId="10" w16cid:durableId="1151678075">
+    <w:abstractNumId w:val="4"/>
+  </w:num>
+  <w:num w:numId="11" w16cid:durableId="1325745818">
+    <w:abstractNumId w:val="10"/>
+  </w:num>
+  <w:num w:numId="12" w16cid:durableId="26377342">
     <w:abstractNumId w:val="8"/>
   </w:num>
 </w:numbering>
@@ -8559,6 +7948,7 @@
   <w:style w:type="character" w:default="1" w:styleId="Fuentedeprrafopredeter">
     <w:name w:val="Default Paragraph Font"/>
     <w:uiPriority w:val="1"/>
+    <w:semiHidden/>
     <w:unhideWhenUsed/>
   </w:style>
   <w:style w:type="table" w:default="1" w:styleId="Tablanormal">
@@ -8893,6 +8283,25 @@
       <w:shd w:val="clear" w:color="auto" w:fill="E1DFDD"/>
     </w:rPr>
   </w:style>
+  <w:style w:type="paragraph" w:customStyle="1" w:styleId="prc-actionlist-actionlistitem-so4vc">
+    <w:name w:val="prc-actionlist-actionlistitem-so4vc"/>
+    <w:basedOn w:val="Normal"/>
+    <w:rsid w:val="00F20BB9"/>
+    <w:pPr>
+      <w:spacing w:before="100" w:beforeAutospacing="1" w:after="100" w:afterAutospacing="1" w:line="240" w:lineRule="auto"/>
+    </w:pPr>
+    <w:rPr>
+      <w:rFonts w:ascii="Times New Roman" w:eastAsia="Times New Roman" w:hAnsi="Times New Roman" w:cs="Times New Roman"/>
+      <w:kern w:val="0"/>
+      <w:lang w:eastAsia="es-MX"/>
+      <w14:ligatures w14:val="none"/>
+    </w:rPr>
+  </w:style>
+  <w:style w:type="character" w:customStyle="1" w:styleId="input-monospace">
+    <w:name w:val="input-monospace"/>
+    <w:basedOn w:val="Fuentedeprrafopredeter"/>
+    <w:rsid w:val="00F20BB9"/>
+  </w:style>
 </w:styles>
 </file>
 

</xml_diff>

<commit_message>
feat(ui): sprint 6.5 — dashboard redesign, sidebar/header refactor, dev config
- Rediseño completo del dashboard con nuevos KPIs y layout
- Refactor de dashboard-sidebar y dashboard-header (estructura, estilos)
- Actualización de globals.css y layout raíz
- Cambio dev script: turbopack → --no-turbo --port 3001
- Actualización de documentación FASES DE DESARROLLO
- Fix: remove unused cn import in dashboard-sidebar

Co-Authored-By: Claude Sonnet 4.6 <noreply@anthropic.com>
</commit_message>
<xml_diff>
--- a/FASES DE DESARROLLO NEXO.docx
+++ b/FASES DE DESARROLLO NEXO.docx
@@ -5653,13 +5653,69 @@
     </w:p>
     <w:p/>
     <w:p>
+      <w:pPr>
+        <w:rPr>
+          <w:lang w:val="en-US"/>
+        </w:rPr>
+      </w:pPr>
+      <w:r>
+        <w:rPr>
+          <w:lang w:val="en-US"/>
+        </w:rPr>
+        <w:t>TEST DE FRONTEND INVOICES</w:t>
+      </w:r>
+    </w:p>
+    <w:p/>
+    <w:p>
+      <w:r>
+        <w:rPr>
+          <w:lang w:val="en-US"/>
+        </w:rPr>
+        <w:lastRenderedPageBreak/>
+        <w:drawing>
+          <wp:inline distT="0" distB="0" distL="0" distR="0" wp14:anchorId="645073FA" wp14:editId="41268F1E">
+            <wp:extent cx="5612130" cy="2723515"/>
+            <wp:effectExtent l="0" t="0" r="7620" b="635"/>
+            <wp:docPr id="641463485" name="Imagen 1"/>
+            <wp:cNvGraphicFramePr>
+              <a:graphicFrameLocks xmlns:a="http://schemas.openxmlformats.org/drawingml/2006/main" noChangeAspect="1"/>
+            </wp:cNvGraphicFramePr>
+            <a:graphic xmlns:a="http://schemas.openxmlformats.org/drawingml/2006/main">
+              <a:graphicData uri="http://schemas.openxmlformats.org/drawingml/2006/picture">
+                <pic:pic xmlns:pic="http://schemas.openxmlformats.org/drawingml/2006/picture">
+                  <pic:nvPicPr>
+                    <pic:cNvPr id="641463485" name=""/>
+                    <pic:cNvPicPr/>
+                  </pic:nvPicPr>
+                  <pic:blipFill>
+                    <a:blip r:embed="rId50"/>
+                    <a:stretch>
+                      <a:fillRect/>
+                    </a:stretch>
+                  </pic:blipFill>
+                  <pic:spPr>
+                    <a:xfrm>
+                      <a:off x="0" y="0"/>
+                      <a:ext cx="5612130" cy="2723515"/>
+                    </a:xfrm>
+                    <a:prstGeom prst="rect">
+                      <a:avLst/>
+                    </a:prstGeom>
+                  </pic:spPr>
+                </pic:pic>
+              </a:graphicData>
+            </a:graphic>
+          </wp:inline>
+        </w:drawing>
+      </w:r>
+    </w:p>
+    <w:p>
       <w:r>
         <w:t>Conciliacion bancaria</w:t>
       </w:r>
     </w:p>
     <w:p>
       <w:r>
-        <w:lastRenderedPageBreak/>
         <w:drawing>
           <wp:inline distT="0" distB="0" distL="0" distR="0" wp14:anchorId="06A6E4F3" wp14:editId="7D4B553F">
             <wp:extent cx="5612130" cy="1830705"/>
@@ -5676,7 +5732,7 @@
                     <pic:cNvPicPr/>
                   </pic:nvPicPr>
                   <pic:blipFill>
-                    <a:blip r:embed="rId50"/>
+                    <a:blip r:embed="rId51"/>
                     <a:stretch>
                       <a:fillRect/>
                     </a:stretch>
@@ -5697,97 +5753,19 @@
         </w:drawing>
       </w:r>
     </w:p>
-    <w:p>
-      <w:pPr>
-        <w:rPr>
-          <w:lang w:val="en-US"/>
-        </w:rPr>
-      </w:pPr>
-    </w:p>
-    <w:p>
-      <w:pPr>
-        <w:rPr>
-          <w:lang w:val="en-US"/>
-        </w:rPr>
-      </w:pPr>
-    </w:p>
-    <w:p>
-      <w:pPr>
-        <w:rPr>
-          <w:lang w:val="en-US"/>
-        </w:rPr>
-      </w:pPr>
-    </w:p>
-    <w:p>
-      <w:pPr>
-        <w:rPr>
-          <w:lang w:val="en-US"/>
-        </w:rPr>
-      </w:pPr>
-    </w:p>
-    <w:p>
-      <w:pPr>
-        <w:rPr>
-          <w:lang w:val="en-US"/>
-        </w:rPr>
-      </w:pPr>
-    </w:p>
-    <w:p>
-      <w:pPr>
-        <w:rPr>
-          <w:lang w:val="en-US"/>
-        </w:rPr>
-      </w:pPr>
-    </w:p>
-    <w:p>
-      <w:pPr>
-        <w:rPr>
-          <w:lang w:val="en-US"/>
-        </w:rPr>
-      </w:pPr>
-    </w:p>
-    <w:p>
-      <w:pPr>
-        <w:rPr>
-          <w:lang w:val="en-US"/>
-        </w:rPr>
-      </w:pPr>
-    </w:p>
-    <w:p>
-      <w:pPr>
-        <w:rPr>
-          <w:lang w:val="en-US"/>
-        </w:rPr>
-      </w:pPr>
-    </w:p>
-    <w:p>
-      <w:pPr>
-        <w:rPr>
-          <w:lang w:val="en-US"/>
-        </w:rPr>
-      </w:pPr>
-      <w:r>
-        <w:rPr>
-          <w:lang w:val="en-US"/>
-        </w:rPr>
-        <w:t>TEST DE FRONTEND INVOICES</w:t>
-      </w:r>
-    </w:p>
-    <w:p>
-      <w:pPr>
-        <w:rPr>
-          <w:lang w:val="en-US"/>
-        </w:rPr>
-      </w:pPr>
-      <w:r>
-        <w:rPr>
-          <w:lang w:val="en-US"/>
-        </w:rPr>
+    <w:p/>
+    <w:p>
+      <w:r>
+        <w:t>FASE 3 en un 85 %</w:t>
+      </w:r>
+    </w:p>
+    <w:p>
+      <w:r>
         <w:drawing>
-          <wp:inline distT="0" distB="0" distL="0" distR="0" wp14:anchorId="19482AA5" wp14:editId="0898CD3E">
-            <wp:extent cx="5612130" cy="2723515"/>
-            <wp:effectExtent l="0" t="0" r="7620" b="635"/>
-            <wp:docPr id="641463485" name="Imagen 1"/>
+          <wp:inline distT="0" distB="0" distL="0" distR="0" wp14:anchorId="377FC99C" wp14:editId="04792FBD">
+            <wp:extent cx="5363570" cy="2465737"/>
+            <wp:effectExtent l="0" t="0" r="8890" b="0"/>
+            <wp:docPr id="493050132" name="Imagen 1"/>
             <wp:cNvGraphicFramePr>
               <a:graphicFrameLocks xmlns:a="http://schemas.openxmlformats.org/drawingml/2006/main" noChangeAspect="1"/>
             </wp:cNvGraphicFramePr>
@@ -5795,11 +5773,11 @@
               <a:graphicData uri="http://schemas.openxmlformats.org/drawingml/2006/picture">
                 <pic:pic xmlns:pic="http://schemas.openxmlformats.org/drawingml/2006/picture">
                   <pic:nvPicPr>
-                    <pic:cNvPr id="641463485" name=""/>
+                    <pic:cNvPr id="493050132" name=""/>
                     <pic:cNvPicPr/>
                   </pic:nvPicPr>
                   <pic:blipFill>
-                    <a:blip r:embed="rId51"/>
+                    <a:blip r:embed="rId52"/>
                     <a:stretch>
                       <a:fillRect/>
                     </a:stretch>
@@ -5807,7 +5785,7 @@
                   <pic:spPr>
                     <a:xfrm>
                       <a:off x="0" y="0"/>
-                      <a:ext cx="5612130" cy="2723515"/>
+                      <a:ext cx="5367860" cy="2467709"/>
                     </a:xfrm>
                     <a:prstGeom prst="rect">
                       <a:avLst/>
@@ -5819,6 +5797,441 @@
           </wp:inline>
         </w:drawing>
       </w:r>
+    </w:p>
+    <w:p>
+      <w:pPr>
+        <w:rPr>
+          <w:lang w:val="en-US"/>
+        </w:rPr>
+      </w:pPr>
+    </w:p>
+    <w:p>
+      <w:r>
+        <w:rPr>
+          <w:noProof/>
+        </w:rPr>
+        <w:drawing>
+          <wp:inline distT="0" distB="0" distL="0" distR="0" wp14:anchorId="767E3289" wp14:editId="02ED072D">
+            <wp:extent cx="5628513" cy="1728677"/>
+            <wp:effectExtent l="0" t="0" r="0" b="5080"/>
+            <wp:docPr id="1440165765" name="Imagen 2"/>
+            <wp:cNvGraphicFramePr>
+              <a:graphicFrameLocks xmlns:a="http://schemas.openxmlformats.org/drawingml/2006/main" noChangeAspect="1"/>
+            </wp:cNvGraphicFramePr>
+            <a:graphic xmlns:a="http://schemas.openxmlformats.org/drawingml/2006/main">
+              <a:graphicData uri="http://schemas.openxmlformats.org/drawingml/2006/picture">
+                <pic:pic xmlns:pic="http://schemas.openxmlformats.org/drawingml/2006/picture">
+                  <pic:nvPicPr>
+                    <pic:cNvPr id="0" name="Picture 3"/>
+                    <pic:cNvPicPr>
+                      <a:picLocks noChangeAspect="1" noChangeArrowheads="1"/>
+                    </pic:cNvPicPr>
+                  </pic:nvPicPr>
+                  <pic:blipFill>
+                    <a:blip r:embed="rId53" cstate="print">
+                      <a:extLst>
+                        <a:ext uri="{28A0092B-C50C-407E-A947-70E740481C1C}">
+                          <a14:useLocalDpi xmlns:a14="http://schemas.microsoft.com/office/drawing/2010/main" val="0"/>
+                        </a:ext>
+                      </a:extLst>
+                    </a:blip>
+                    <a:srcRect/>
+                    <a:stretch>
+                      <a:fillRect/>
+                    </a:stretch>
+                  </pic:blipFill>
+                  <pic:spPr bwMode="auto">
+                    <a:xfrm>
+                      <a:off x="0" y="0"/>
+                      <a:ext cx="5658260" cy="1737813"/>
+                    </a:xfrm>
+                    <a:prstGeom prst="rect">
+                      <a:avLst/>
+                    </a:prstGeom>
+                    <a:noFill/>
+                  </pic:spPr>
+                </pic:pic>
+              </a:graphicData>
+            </a:graphic>
+          </wp:inline>
+        </w:drawing>
+      </w:r>
+    </w:p>
+    <w:p>
+      <w:r>
+        <w:t xml:space="preserve">PLANIFICACION FASE 4 </w:t>
+      </w:r>
+    </w:p>
+    <w:p>
+      <w:r>
+        <w:drawing>
+          <wp:inline distT="0" distB="0" distL="0" distR="0" wp14:anchorId="6C3EC1EC" wp14:editId="4417CD38">
+            <wp:extent cx="5612130" cy="2904490"/>
+            <wp:effectExtent l="0" t="0" r="7620" b="0"/>
+            <wp:docPr id="1696272210" name="Imagen 1"/>
+            <wp:cNvGraphicFramePr>
+              <a:graphicFrameLocks xmlns:a="http://schemas.openxmlformats.org/drawingml/2006/main" noChangeAspect="1"/>
+            </wp:cNvGraphicFramePr>
+            <a:graphic xmlns:a="http://schemas.openxmlformats.org/drawingml/2006/main">
+              <a:graphicData uri="http://schemas.openxmlformats.org/drawingml/2006/picture">
+                <pic:pic xmlns:pic="http://schemas.openxmlformats.org/drawingml/2006/picture">
+                  <pic:nvPicPr>
+                    <pic:cNvPr id="1696272210" name=""/>
+                    <pic:cNvPicPr/>
+                  </pic:nvPicPr>
+                  <pic:blipFill>
+                    <a:blip r:embed="rId54"/>
+                    <a:stretch>
+                      <a:fillRect/>
+                    </a:stretch>
+                  </pic:blipFill>
+                  <pic:spPr>
+                    <a:xfrm>
+                      <a:off x="0" y="0"/>
+                      <a:ext cx="5612130" cy="2904490"/>
+                    </a:xfrm>
+                    <a:prstGeom prst="rect">
+                      <a:avLst/>
+                    </a:prstGeom>
+                  </pic:spPr>
+                </pic:pic>
+              </a:graphicData>
+            </a:graphic>
+          </wp:inline>
+        </w:drawing>
+      </w:r>
+    </w:p>
+    <w:p/>
+    <w:p>
+      <w:r>
+        <w:lastRenderedPageBreak/>
+        <w:drawing>
+          <wp:inline distT="0" distB="0" distL="0" distR="0" wp14:anchorId="45617851" wp14:editId="3D6AF524">
+            <wp:extent cx="5612130" cy="2493645"/>
+            <wp:effectExtent l="0" t="0" r="7620" b="1905"/>
+            <wp:docPr id="1884697555" name="Imagen 1"/>
+            <wp:cNvGraphicFramePr>
+              <a:graphicFrameLocks xmlns:a="http://schemas.openxmlformats.org/drawingml/2006/main" noChangeAspect="1"/>
+            </wp:cNvGraphicFramePr>
+            <a:graphic xmlns:a="http://schemas.openxmlformats.org/drawingml/2006/main">
+              <a:graphicData uri="http://schemas.openxmlformats.org/drawingml/2006/picture">
+                <pic:pic xmlns:pic="http://schemas.openxmlformats.org/drawingml/2006/picture">
+                  <pic:nvPicPr>
+                    <pic:cNvPr id="1884697555" name=""/>
+                    <pic:cNvPicPr/>
+                  </pic:nvPicPr>
+                  <pic:blipFill>
+                    <a:blip r:embed="rId55"/>
+                    <a:stretch>
+                      <a:fillRect/>
+                    </a:stretch>
+                  </pic:blipFill>
+                  <pic:spPr>
+                    <a:xfrm>
+                      <a:off x="0" y="0"/>
+                      <a:ext cx="5612130" cy="2493645"/>
+                    </a:xfrm>
+                    <a:prstGeom prst="rect">
+                      <a:avLst/>
+                    </a:prstGeom>
+                  </pic:spPr>
+                </pic:pic>
+              </a:graphicData>
+            </a:graphic>
+          </wp:inline>
+        </w:drawing>
+      </w:r>
+    </w:p>
+    <w:p/>
+    <w:p>
+      <w:r>
+        <w:drawing>
+          <wp:inline distT="0" distB="0" distL="0" distR="0" wp14:anchorId="3C6D9A75" wp14:editId="7ED24B7C">
+            <wp:extent cx="5612130" cy="1247775"/>
+            <wp:effectExtent l="0" t="0" r="7620" b="9525"/>
+            <wp:docPr id="1766079544" name="Imagen 1"/>
+            <wp:cNvGraphicFramePr>
+              <a:graphicFrameLocks xmlns:a="http://schemas.openxmlformats.org/drawingml/2006/main" noChangeAspect="1"/>
+            </wp:cNvGraphicFramePr>
+            <a:graphic xmlns:a="http://schemas.openxmlformats.org/drawingml/2006/main">
+              <a:graphicData uri="http://schemas.openxmlformats.org/drawingml/2006/picture">
+                <pic:pic xmlns:pic="http://schemas.openxmlformats.org/drawingml/2006/picture">
+                  <pic:nvPicPr>
+                    <pic:cNvPr id="1766079544" name=""/>
+                    <pic:cNvPicPr/>
+                  </pic:nvPicPr>
+                  <pic:blipFill>
+                    <a:blip r:embed="rId56"/>
+                    <a:stretch>
+                      <a:fillRect/>
+                    </a:stretch>
+                  </pic:blipFill>
+                  <pic:spPr>
+                    <a:xfrm>
+                      <a:off x="0" y="0"/>
+                      <a:ext cx="5612130" cy="1247775"/>
+                    </a:xfrm>
+                    <a:prstGeom prst="rect">
+                      <a:avLst/>
+                    </a:prstGeom>
+                  </pic:spPr>
+                </pic:pic>
+              </a:graphicData>
+            </a:graphic>
+          </wp:inline>
+        </w:drawing>
+      </w:r>
+    </w:p>
+    <w:p/>
+    <w:p>
+      <w:r>
+        <w:drawing>
+          <wp:inline distT="0" distB="0" distL="0" distR="0" wp14:anchorId="347D12C1" wp14:editId="154A19A7">
+            <wp:extent cx="5612130" cy="1240790"/>
+            <wp:effectExtent l="0" t="0" r="7620" b="0"/>
+            <wp:docPr id="528883500" name="Imagen 1"/>
+            <wp:cNvGraphicFramePr>
+              <a:graphicFrameLocks xmlns:a="http://schemas.openxmlformats.org/drawingml/2006/main" noChangeAspect="1"/>
+            </wp:cNvGraphicFramePr>
+            <a:graphic xmlns:a="http://schemas.openxmlformats.org/drawingml/2006/main">
+              <a:graphicData uri="http://schemas.openxmlformats.org/drawingml/2006/picture">
+                <pic:pic xmlns:pic="http://schemas.openxmlformats.org/drawingml/2006/picture">
+                  <pic:nvPicPr>
+                    <pic:cNvPr id="528883500" name=""/>
+                    <pic:cNvPicPr/>
+                  </pic:nvPicPr>
+                  <pic:blipFill>
+                    <a:blip r:embed="rId57"/>
+                    <a:stretch>
+                      <a:fillRect/>
+                    </a:stretch>
+                  </pic:blipFill>
+                  <pic:spPr>
+                    <a:xfrm>
+                      <a:off x="0" y="0"/>
+                      <a:ext cx="5612130" cy="1240790"/>
+                    </a:xfrm>
+                    <a:prstGeom prst="rect">
+                      <a:avLst/>
+                    </a:prstGeom>
+                  </pic:spPr>
+                </pic:pic>
+              </a:graphicData>
+            </a:graphic>
+          </wp:inline>
+        </w:drawing>
+      </w:r>
+    </w:p>
+    <w:p>
+      <w:r>
+        <w:drawing>
+          <wp:inline distT="0" distB="0" distL="0" distR="0" wp14:anchorId="66924746" wp14:editId="0858F495">
+            <wp:extent cx="5612130" cy="1949450"/>
+            <wp:effectExtent l="0" t="0" r="7620" b="0"/>
+            <wp:docPr id="2006111848" name="Imagen 1"/>
+            <wp:cNvGraphicFramePr>
+              <a:graphicFrameLocks xmlns:a="http://schemas.openxmlformats.org/drawingml/2006/main" noChangeAspect="1"/>
+            </wp:cNvGraphicFramePr>
+            <a:graphic xmlns:a="http://schemas.openxmlformats.org/drawingml/2006/main">
+              <a:graphicData uri="http://schemas.openxmlformats.org/drawingml/2006/picture">
+                <pic:pic xmlns:pic="http://schemas.openxmlformats.org/drawingml/2006/picture">
+                  <pic:nvPicPr>
+                    <pic:cNvPr id="2006111848" name=""/>
+                    <pic:cNvPicPr/>
+                  </pic:nvPicPr>
+                  <pic:blipFill rotWithShape="1">
+                    <a:blip r:embed="rId58"/>
+                    <a:srcRect b="56954"/>
+                    <a:stretch>
+                      <a:fillRect/>
+                    </a:stretch>
+                  </pic:blipFill>
+                  <pic:spPr bwMode="auto">
+                    <a:xfrm>
+                      <a:off x="0" y="0"/>
+                      <a:ext cx="5612130" cy="1949450"/>
+                    </a:xfrm>
+                    <a:prstGeom prst="rect">
+                      <a:avLst/>
+                    </a:prstGeom>
+                    <a:ln>
+                      <a:noFill/>
+                    </a:ln>
+                    <a:extLst>
+                      <a:ext uri="{53640926-AAD7-44D8-BBD7-CCE9431645EC}">
+                        <a14:shadowObscured xmlns:a14="http://schemas.microsoft.com/office/drawing/2010/main"/>
+                      </a:ext>
+                    </a:extLst>
+                  </pic:spPr>
+                </pic:pic>
+              </a:graphicData>
+            </a:graphic>
+          </wp:inline>
+        </w:drawing>
+      </w:r>
+    </w:p>
+    <w:p>
+      <w:r>
+        <w:lastRenderedPageBreak/>
+        <w:drawing>
+          <wp:inline distT="0" distB="0" distL="0" distR="0" wp14:anchorId="1F475428" wp14:editId="1353404E">
+            <wp:extent cx="5612130" cy="2490470"/>
+            <wp:effectExtent l="0" t="0" r="7620" b="5080"/>
+            <wp:docPr id="983598144" name="Imagen 1"/>
+            <wp:cNvGraphicFramePr>
+              <a:graphicFrameLocks xmlns:a="http://schemas.openxmlformats.org/drawingml/2006/main" noChangeAspect="1"/>
+            </wp:cNvGraphicFramePr>
+            <a:graphic xmlns:a="http://schemas.openxmlformats.org/drawingml/2006/main">
+              <a:graphicData uri="http://schemas.openxmlformats.org/drawingml/2006/picture">
+                <pic:pic xmlns:pic="http://schemas.openxmlformats.org/drawingml/2006/picture">
+                  <pic:nvPicPr>
+                    <pic:cNvPr id="2006111848" name=""/>
+                    <pic:cNvPicPr/>
+                  </pic:nvPicPr>
+                  <pic:blipFill rotWithShape="1">
+                    <a:blip r:embed="rId58"/>
+                    <a:srcRect t="45008"/>
+                    <a:stretch>
+                      <a:fillRect/>
+                    </a:stretch>
+                  </pic:blipFill>
+                  <pic:spPr bwMode="auto">
+                    <a:xfrm>
+                      <a:off x="0" y="0"/>
+                      <a:ext cx="5612130" cy="2490470"/>
+                    </a:xfrm>
+                    <a:prstGeom prst="rect">
+                      <a:avLst/>
+                    </a:prstGeom>
+                    <a:ln>
+                      <a:noFill/>
+                    </a:ln>
+                    <a:extLst>
+                      <a:ext uri="{53640926-AAD7-44D8-BBD7-CCE9431645EC}">
+                        <a14:shadowObscured xmlns:a14="http://schemas.microsoft.com/office/drawing/2010/main"/>
+                      </a:ext>
+                    </a:extLst>
+                  </pic:spPr>
+                </pic:pic>
+              </a:graphicData>
+            </a:graphic>
+          </wp:inline>
+        </w:drawing>
+      </w:r>
+    </w:p>
+    <w:p>
+      <w:r>
+        <w:t>FASE 5</w:t>
+      </w:r>
+    </w:p>
+    <w:p>
+      <w:r>
+        <w:drawing>
+          <wp:inline distT="0" distB="0" distL="0" distR="0" wp14:anchorId="54B9063D" wp14:editId="2DCD22C4">
+            <wp:extent cx="5612130" cy="1380490"/>
+            <wp:effectExtent l="0" t="0" r="7620" b="0"/>
+            <wp:docPr id="644953230" name="Imagen 1"/>
+            <wp:cNvGraphicFramePr>
+              <a:graphicFrameLocks xmlns:a="http://schemas.openxmlformats.org/drawingml/2006/main" noChangeAspect="1"/>
+            </wp:cNvGraphicFramePr>
+            <a:graphic xmlns:a="http://schemas.openxmlformats.org/drawingml/2006/main">
+              <a:graphicData uri="http://schemas.openxmlformats.org/drawingml/2006/picture">
+                <pic:pic xmlns:pic="http://schemas.openxmlformats.org/drawingml/2006/picture">
+                  <pic:nvPicPr>
+                    <pic:cNvPr id="644953230" name=""/>
+                    <pic:cNvPicPr/>
+                  </pic:nvPicPr>
+                  <pic:blipFill>
+                    <a:blip r:embed="rId59"/>
+                    <a:stretch>
+                      <a:fillRect/>
+                    </a:stretch>
+                  </pic:blipFill>
+                  <pic:spPr>
+                    <a:xfrm>
+                      <a:off x="0" y="0"/>
+                      <a:ext cx="5612130" cy="1380490"/>
+                    </a:xfrm>
+                    <a:prstGeom prst="rect">
+                      <a:avLst/>
+                    </a:prstGeom>
+                  </pic:spPr>
+                </pic:pic>
+              </a:graphicData>
+            </a:graphic>
+          </wp:inline>
+        </w:drawing>
+      </w:r>
+    </w:p>
+    <w:p>
+      <w:pPr>
+        <w:rPr>
+          <w:lang w:val="en-US"/>
+        </w:rPr>
+      </w:pPr>
+    </w:p>
+    <w:p>
+      <w:pPr>
+        <w:rPr>
+          <w:lang w:val="en-US"/>
+        </w:rPr>
+      </w:pPr>
+    </w:p>
+    <w:p>
+      <w:pPr>
+        <w:rPr>
+          <w:lang w:val="en-US"/>
+        </w:rPr>
+      </w:pPr>
+    </w:p>
+    <w:p>
+      <w:pPr>
+        <w:rPr>
+          <w:lang w:val="en-US"/>
+        </w:rPr>
+      </w:pPr>
+    </w:p>
+    <w:p>
+      <w:pPr>
+        <w:rPr>
+          <w:lang w:val="en-US"/>
+        </w:rPr>
+      </w:pPr>
+    </w:p>
+    <w:p>
+      <w:pPr>
+        <w:rPr>
+          <w:lang w:val="en-US"/>
+        </w:rPr>
+      </w:pPr>
+    </w:p>
+    <w:p>
+      <w:pPr>
+        <w:rPr>
+          <w:lang w:val="en-US"/>
+        </w:rPr>
+      </w:pPr>
+    </w:p>
+    <w:p>
+      <w:pPr>
+        <w:rPr>
+          <w:lang w:val="en-US"/>
+        </w:rPr>
+      </w:pPr>
+    </w:p>
+    <w:p>
+      <w:pPr>
+        <w:rPr>
+          <w:lang w:val="en-US"/>
+        </w:rPr>
+      </w:pPr>
+    </w:p>
+    <w:p>
+      <w:pPr>
+        <w:rPr>
+          <w:lang w:val="en-US"/>
+        </w:rPr>
+      </w:pPr>
     </w:p>
     <w:sectPr>
       <w:pgSz w:w="12240" w:h="15840"/>

</xml_diff>